<commit_message>
Word a Excel: doplněno 1. trojročí, výstupy přegenerovány
Kontrola odhalila dvě věci:

1) Word vypisoval v Diferenciaci jen 2. a 3. trojročí — dif1 se do
   build_docx.js nikdy nedoplnil, přidalo se jen do webu. Opraveno;
   téma 40 správně vypíše 1. a 3. (dif2 má prázdné).

2) Soubory ve vystupy/ byly zastaralé — obsahovaly 48x '2 i 3' a 2x
   'jen 3.', tedy stav PŘED otevřením tématu 26 druhému trojročí i před
   změnou modelu urovne. Nebyly přegenerované od začátku srpna.

Po přegenerování: Excel 49x '1.–3.' + 1x 'jen 3.', Word 49x
'1.–3. trojročí' + 1x 'jen 3. trojročí', diferenciace 1./2./3. u 50/49/50
témat (2. chybí jen u tématu 40, kde je prázdná záměrně).

Excel diferenciace neobsahuje vůbec — je to přehledová tabulka pro výběr
témat (sloupec 'Kdo si téma bere'), ne metodika; doplňuje se jen sloupec
Trojročí.

Co-Authored-By: Claude Opus 4.8 <noreply@anthropic.com>
</commit_message>
<xml_diff>
--- a/vystupy/Katalog_projektovych_temat.docx
+++ b/vystupy/Katalog_projektovych_temat.docx
@@ -1266,7 +1266,7 @@
           <w:sz w:val="19"/>
           <w:szCs w:val="19"/>
         </w:rPr>
-        <w:t xml:space="preserve">  (jen 3. trojročí)</w:t>
+        <w:t xml:space="preserve"/>
       </w:r>
       <w:r>
         <w:rPr>
@@ -2051,7 +2051,7 @@
           <w:sz w:val="20"/>
           <w:szCs w:val="20"/>
         </w:rPr>
-        <w:t xml:space="preserve">2. i 3. trojročí</w:t>
+        <w:t xml:space="preserve">1.–3. trojročí</w:t>
       </w:r>
     </w:p>
     <w:p>
@@ -2405,6 +2405,23 @@
           <w:szCs w:val="20"/>
         </w:rPr>
         <w:t xml:space="preserve">Diferenciace</w:t>
+      </w:r>
+    </w:p>
+    <w:p>
+      <w:pPr>
+        <w:pStyle w:val="ListParagraph"/>
+        <w:numPr>
+          <w:ilvl w:val="0"/>
+          <w:numId w:val="2"/>
+        </w:numPr>
+        <w:spacing w:after="40"/>
+      </w:pPr>
+      <w:r>
+        <w:rPr>
+          <w:b w:val="false"/>
+          <w:bCs w:val="false"/>
+        </w:rPr>
+        <w:t xml:space="preserve">1. trojročí: Pravidelný večerní rituál, jednoduché obrázkové sledování, kdy chodím spát a vstávám, povídání o snech.</w:t>
       </w:r>
     </w:p>
     <w:p>
@@ -2470,7 +2487,7 @@
           <w:sz w:val="20"/>
           <w:szCs w:val="20"/>
         </w:rPr>
-        <w:t xml:space="preserve">2. i 3. trojročí</w:t>
+        <w:t xml:space="preserve">1.–3. trojročí</w:t>
       </w:r>
     </w:p>
     <w:p>
@@ -2824,6 +2841,23 @@
           <w:szCs w:val="20"/>
         </w:rPr>
         <w:t xml:space="preserve">Diferenciace</w:t>
+      </w:r>
+    </w:p>
+    <w:p>
+      <w:pPr>
+        <w:pStyle w:val="ListParagraph"/>
+        <w:numPr>
+          <w:ilvl w:val="0"/>
+          <w:numId w:val="2"/>
+        </w:numPr>
+        <w:spacing w:after="40"/>
+      </w:pPr>
+      <w:r>
+        <w:rPr>
+          <w:b w:val="false"/>
+          <w:bCs w:val="false"/>
+        </w:rPr>
+        <w:t xml:space="preserve">1. trojročí: Poznávání potravin všemi smysly, pomoc s přípravou jednoduchého jídla (namazat chleba, umýt zeleninu), povídání o tom, odkud jídlo pochází.</w:t>
       </w:r>
     </w:p>
     <w:p>
@@ -2917,7 +2951,7 @@
           <w:sz w:val="20"/>
           <w:szCs w:val="20"/>
         </w:rPr>
-        <w:t xml:space="preserve">2. i 3. trojročí</w:t>
+        <w:t xml:space="preserve">1.–3. trojročí</w:t>
       </w:r>
     </w:p>
     <w:p>
@@ -3288,6 +3322,23 @@
           <w:szCs w:val="20"/>
         </w:rPr>
         <w:t xml:space="preserve">Diferenciace</w:t>
+      </w:r>
+    </w:p>
+    <w:p>
+      <w:pPr>
+        <w:pStyle w:val="ListParagraph"/>
+        <w:numPr>
+          <w:ilvl w:val="0"/>
+          <w:numId w:val="2"/>
+        </w:numPr>
+        <w:spacing w:after="40"/>
+      </w:pPr>
+      <w:r>
+        <w:rPr>
+          <w:b w:val="false"/>
+          <w:bCs w:val="false"/>
+        </w:rPr>
+        <w:t xml:space="preserve">1. trojročí: Radost z pohybu formou her a překážkových drah, vyzkoušení různých pohybových aktivit bez tlaku na výkon, jednoduché všímání si, jak se po pohybu cítím.</w:t>
       </w:r>
     </w:p>
     <w:p>
@@ -3353,7 +3404,7 @@
           <w:sz w:val="20"/>
           <w:szCs w:val="20"/>
         </w:rPr>
-        <w:t xml:space="preserve">2. i 3. trojročí</w:t>
+        <w:t xml:space="preserve">1.–3. trojročí</w:t>
       </w:r>
     </w:p>
     <w:p>
@@ -3707,6 +3758,23 @@
           <w:szCs w:val="20"/>
         </w:rPr>
         <w:t xml:space="preserve">Diferenciace</w:t>
+      </w:r>
+    </w:p>
+    <w:p>
+      <w:pPr>
+        <w:pStyle w:val="ListParagraph"/>
+        <w:numPr>
+          <w:ilvl w:val="0"/>
+          <w:numId w:val="2"/>
+        </w:numPr>
+        <w:spacing w:after="40"/>
+      </w:pPr>
+      <w:r>
+        <w:rPr>
+          <w:b w:val="false"/>
+          <w:bCs w:val="false"/>
+        </w:rPr>
+        <w:t xml:space="preserve">1. trojročí: Jednoduchá pravidla pro obrazovky doma i ve škole, hry jako náhrada za telefon, povídání o tom, co mi obrazovka dává a co bere.</w:t>
       </w:r>
     </w:p>
     <w:p>
@@ -3772,7 +3840,7 @@
           <w:sz w:val="20"/>
           <w:szCs w:val="20"/>
         </w:rPr>
-        <w:t xml:space="preserve">2. i 3. trojročí</w:t>
+        <w:t xml:space="preserve">1.–3. trojročí</w:t>
       </w:r>
     </w:p>
     <w:p>
@@ -4143,6 +4211,23 @@
           <w:szCs w:val="20"/>
         </w:rPr>
         <w:t xml:space="preserve">Diferenciace</w:t>
+      </w:r>
+    </w:p>
+    <w:p>
+      <w:pPr>
+        <w:pStyle w:val="ListParagraph"/>
+        <w:numPr>
+          <w:ilvl w:val="0"/>
+          <w:numId w:val="2"/>
+        </w:numPr>
+        <w:spacing w:after="40"/>
+      </w:pPr>
+      <w:r>
+        <w:rPr>
+          <w:b w:val="false"/>
+          <w:bCs w:val="false"/>
+        </w:rPr>
+        <w:t xml:space="preserve">1. trojročí: Pojmenovávání pocitů a toho, co mi dělá radost, jednoduché uklidňovací rituály, vědomí, že je v pořádku svěřit se dospělému, kterému věřím.</w:t>
       </w:r>
     </w:p>
     <w:p>
@@ -4236,7 +4321,7 @@
           <w:sz w:val="20"/>
           <w:szCs w:val="20"/>
         </w:rPr>
-        <w:t xml:space="preserve">2. i 3. trojročí</w:t>
+        <w:t xml:space="preserve">1.–3. trojročí</w:t>
       </w:r>
     </w:p>
     <w:p>
@@ -4607,6 +4692,23 @@
           <w:szCs w:val="20"/>
         </w:rPr>
         <w:t xml:space="preserve">Diferenciace</w:t>
+      </w:r>
+    </w:p>
+    <w:p>
+      <w:pPr>
+        <w:pStyle w:val="ListParagraph"/>
+        <w:numPr>
+          <w:ilvl w:val="0"/>
+          <w:numId w:val="2"/>
+        </w:numPr>
+        <w:spacing w:after="40"/>
+      </w:pPr>
+      <w:r>
+        <w:rPr>
+          <w:b w:val="false"/>
+          <w:bCs w:val="false"/>
+        </w:rPr>
+        <w:t xml:space="preserve">1. trojročí: Rozpoznávání tělesných signálů stresu (rychlejší srdce, sevřené bříško) na vlastním těle, jednoduché dechové a uklidňovací hry, drobné bezpečné výzvy na zkoušku.</w:t>
       </w:r>
     </w:p>
     <w:p>
@@ -4672,7 +4774,7 @@
           <w:sz w:val="20"/>
           <w:szCs w:val="20"/>
         </w:rPr>
-        <w:t xml:space="preserve">2. i 3. trojročí</w:t>
+        <w:t xml:space="preserve">1.–3. trojročí</w:t>
       </w:r>
     </w:p>
     <w:p>
@@ -5060,6 +5162,23 @@
           <w:szCs w:val="20"/>
         </w:rPr>
         <w:t xml:space="preserve">Diferenciace</w:t>
+      </w:r>
+    </w:p>
+    <w:p>
+      <w:pPr>
+        <w:pStyle w:val="ListParagraph"/>
+        <w:numPr>
+          <w:ilvl w:val="0"/>
+          <w:numId w:val="2"/>
+        </w:numPr>
+        <w:spacing w:after="40"/>
+      </w:pPr>
+      <w:r>
+        <w:rPr>
+          <w:b w:val="false"/>
+          <w:bCs w:val="false"/>
+        </w:rPr>
+        <w:t xml:space="preserve">1. trojročí: Kratší jednodenní až jednonoční výprava blízko školy s velkou oporou průvodců, radost z drobného dobrodružství a společného zvládnutí nepohodlí (déšť, únava).</w:t>
       </w:r>
     </w:p>
     <w:p>
@@ -5153,7 +5272,7 @@
           <w:sz w:val="20"/>
           <w:szCs w:val="20"/>
         </w:rPr>
-        <w:t xml:space="preserve">2. i 3. trojročí</w:t>
+        <w:t xml:space="preserve">1.–3. trojročí</w:t>
       </w:r>
     </w:p>
     <w:p>
@@ -5507,6 +5626,23 @@
           <w:szCs w:val="20"/>
         </w:rPr>
         <w:t xml:space="preserve">Diferenciace</w:t>
+      </w:r>
+    </w:p>
+    <w:p>
+      <w:pPr>
+        <w:pStyle w:val="ListParagraph"/>
+        <w:numPr>
+          <w:ilvl w:val="0"/>
+          <w:numId w:val="2"/>
+        </w:numPr>
+        <w:spacing w:after="40"/>
+      </w:pPr>
+      <w:r>
+        <w:rPr>
+          <w:b w:val="false"/>
+          <w:bCs w:val="false"/>
+        </w:rPr>
+        <w:t xml:space="preserve">1. trojročí: Hry a činnosti, kde je chyba přirozená a bezpečná (stavění, žonglování), oceňování snahy víc než výsledku, jednoduché pojmenování „co se nepovedlo a co zkusím jinak“.</w:t>
       </w:r>
     </w:p>
     <w:p>
@@ -5572,7 +5708,7 @@
           <w:sz w:val="20"/>
           <w:szCs w:val="20"/>
         </w:rPr>
-        <w:t xml:space="preserve">2. i 3. trojročí</w:t>
+        <w:t xml:space="preserve">1.–3. trojročí</w:t>
       </w:r>
     </w:p>
     <w:p>
@@ -5894,6 +6030,23 @@
           <w:szCs w:val="20"/>
         </w:rPr>
         <w:t xml:space="preserve">Diferenciace</w:t>
+      </w:r>
+    </w:p>
+    <w:p>
+      <w:pPr>
+        <w:pStyle w:val="ListParagraph"/>
+        <w:numPr>
+          <w:ilvl w:val="0"/>
+          <w:numId w:val="2"/>
+        </w:numPr>
+        <w:spacing w:after="40"/>
+      </w:pPr>
+      <w:r>
+        <w:rPr>
+          <w:b w:val="false"/>
+          <w:bCs w:val="false"/>
+        </w:rPr>
+        <w:t xml:space="preserve">1. trojročí: Základní hygiena a péče o tělo formou her, rozpoznání „necítím se dobře“ a řeknu to dospělému, bezpečná návštěva lékaře nanečisto.</w:t>
       </w:r>
     </w:p>
     <w:p>
@@ -5987,7 +6140,7 @@
           <w:sz w:val="20"/>
           <w:szCs w:val="20"/>
         </w:rPr>
-        <w:t xml:space="preserve">2. i 3. trojročí</w:t>
+        <w:t xml:space="preserve">1.–3. trojročí</w:t>
       </w:r>
     </w:p>
     <w:p>
@@ -6460,6 +6613,23 @@
           <w:szCs w:val="20"/>
         </w:rPr>
         <w:t xml:space="preserve">Diferenciace</w:t>
+      </w:r>
+    </w:p>
+    <w:p>
+      <w:pPr>
+        <w:pStyle w:val="ListParagraph"/>
+        <w:numPr>
+          <w:ilvl w:val="0"/>
+          <w:numId w:val="2"/>
+        </w:numPr>
+        <w:spacing w:after="40"/>
+      </w:pPr>
+      <w:r>
+        <w:rPr>
+          <w:b w:val="false"/>
+          <w:bCs w:val="false"/>
+        </w:rPr>
+        <w:t xml:space="preserve">1. trojročí: Menší, hravější výzva zvolená s velkou oporou průvodce (naučit se stoj na hlavě, básničku), viditelné odškrtávání kroků, společná oslava malých pokroků.</w:t>
       </w:r>
     </w:p>
     <w:p>
@@ -6553,7 +6723,7 @@
           <w:sz w:val="20"/>
           <w:szCs w:val="20"/>
         </w:rPr>
-        <w:t xml:space="preserve">2. i 3. trojročí</w:t>
+        <w:t xml:space="preserve">1.–3. trojročí</w:t>
       </w:r>
     </w:p>
     <w:p>
@@ -6924,6 +7094,23 @@
           <w:szCs w:val="20"/>
         </w:rPr>
         <w:t xml:space="preserve">Diferenciace</w:t>
+      </w:r>
+    </w:p>
+    <w:p>
+      <w:pPr>
+        <w:pStyle w:val="ListParagraph"/>
+        <w:numPr>
+          <w:ilvl w:val="0"/>
+          <w:numId w:val="2"/>
+        </w:numPr>
+        <w:spacing w:after="40"/>
+      </w:pPr>
+      <w:r>
+        <w:rPr>
+          <w:b w:val="false"/>
+          <w:bCs w:val="false"/>
+        </w:rPr>
+        <w:t xml:space="preserve">1. trojročí: Hry a pozorování v přírodě všemi smysly, poznávání pár stromů a zvířat v okolí školy, pravidelné „tiché místo“ venku jako rituál klidu.</w:t>
       </w:r>
     </w:p>
     <w:p>
@@ -7017,7 +7204,7 @@
           <w:sz w:val="20"/>
           <w:szCs w:val="20"/>
         </w:rPr>
-        <w:t xml:space="preserve">2. i 3. trojročí</w:t>
+        <w:t xml:space="preserve">1.–3. trojročí</w:t>
       </w:r>
     </w:p>
     <w:p>
@@ -7422,6 +7609,23 @@
           <w:szCs w:val="20"/>
         </w:rPr>
         <w:t xml:space="preserve">Diferenciace</w:t>
+      </w:r>
+    </w:p>
+    <w:p>
+      <w:pPr>
+        <w:pStyle w:val="ListParagraph"/>
+        <w:numPr>
+          <w:ilvl w:val="0"/>
+          <w:numId w:val="2"/>
+        </w:numPr>
+        <w:spacing w:after="40"/>
+      </w:pPr>
+      <w:r>
+        <w:rPr>
+          <w:b w:val="false"/>
+          <w:bCs w:val="false"/>
+        </w:rPr>
+        <w:t xml:space="preserve">1. trojročí: Přes přírodu a příběhy (podzimní list, pohádka), drobné ztráty blízké dětskému světu (rozbitá hračka, stěhování kamaráda), žádný tlak na osobní sdílení.</w:t>
       </w:r>
     </w:p>
     <w:p>
@@ -7631,7 +7835,7 @@
           <w:sz w:val="20"/>
           <w:szCs w:val="20"/>
         </w:rPr>
-        <w:t xml:space="preserve">2. i 3. trojročí</w:t>
+        <w:t xml:space="preserve">1.–3. trojročí</w:t>
       </w:r>
     </w:p>
     <w:p>
@@ -8053,6 +8257,23 @@
           <w:szCs w:val="20"/>
         </w:rPr>
         <w:t xml:space="preserve">Diferenciace</w:t>
+      </w:r>
+    </w:p>
+    <w:p>
+      <w:pPr>
+        <w:pStyle w:val="ListParagraph"/>
+        <w:numPr>
+          <w:ilvl w:val="0"/>
+          <w:numId w:val="2"/>
+        </w:numPr>
+        <w:spacing w:after="40"/>
+      </w:pPr>
+      <w:r>
+        <w:rPr>
+          <w:b w:val="false"/>
+          <w:bCs w:val="false"/>
+        </w:rPr>
+        <w:t xml:space="preserve">1. trojročí: Hravé pokusy s pamětí a pozorností, objevování, že se různé věci učím různě (zpaměti, opakováním, hrou), jednoduché všímání si, kdy mi učení jde a kdy ne.</w:t>
       </w:r>
     </w:p>
     <w:p>
@@ -8118,7 +8339,7 @@
           <w:sz w:val="20"/>
           <w:szCs w:val="20"/>
         </w:rPr>
-        <w:t xml:space="preserve">2. i 3. trojročí</w:t>
+        <w:t xml:space="preserve">1.–3. trojročí</w:t>
       </w:r>
     </w:p>
     <w:p>
@@ -8472,6 +8693,23 @@
           <w:szCs w:val="20"/>
         </w:rPr>
         <w:t xml:space="preserve">Diferenciace</w:t>
+      </w:r>
+    </w:p>
+    <w:p>
+      <w:pPr>
+        <w:pStyle w:val="ListParagraph"/>
+        <w:numPr>
+          <w:ilvl w:val="0"/>
+          <w:numId w:val="2"/>
+        </w:numPr>
+        <w:spacing w:after="40"/>
+      </w:pPr>
+      <w:r>
+        <w:rPr>
+          <w:b w:val="false"/>
+          <w:bCs w:val="false"/>
+        </w:rPr>
+        <w:t xml:space="preserve">1. trojročí: S pomocí dospělého první opatrné vyzkoušení jednoduchého rozhovoru s AI, vědomí, že AI se může splést, pravidlo neposílat AI své osobní údaje.</w:t>
       </w:r>
     </w:p>
     <w:p>
@@ -8537,7 +8775,7 @@
           <w:sz w:val="20"/>
           <w:szCs w:val="20"/>
         </w:rPr>
-        <w:t xml:space="preserve">2. i 3. trojročí</w:t>
+        <w:t xml:space="preserve">1.–3. trojročí</w:t>
       </w:r>
     </w:p>
     <w:p>
@@ -8891,6 +9129,23 @@
           <w:szCs w:val="20"/>
         </w:rPr>
         <w:t xml:space="preserve">Diferenciace</w:t>
+      </w:r>
+    </w:p>
+    <w:p>
+      <w:pPr>
+        <w:pStyle w:val="ListParagraph"/>
+        <w:numPr>
+          <w:ilvl w:val="0"/>
+          <w:numId w:val="2"/>
+        </w:numPr>
+        <w:spacing w:after="40"/>
+      </w:pPr>
+      <w:r>
+        <w:rPr>
+          <w:b w:val="false"/>
+          <w:bCs w:val="false"/>
+        </w:rPr>
+        <w:t xml:space="preserve">1. trojročí: Rozlišování pohádky, reklamy a skutečné zprávy, jednoduché ověření „je to opravdu pravda?“ u dospělého, bezpečné chování při hledání na internetu.</w:t>
       </w:r>
     </w:p>
     <w:p>
@@ -8984,7 +9239,7 @@
           <w:sz w:val="20"/>
           <w:szCs w:val="20"/>
         </w:rPr>
-        <w:t xml:space="preserve">2. i 3. trojročí</w:t>
+        <w:t xml:space="preserve">1.–3. trojročí</w:t>
       </w:r>
     </w:p>
     <w:p>
@@ -9321,6 +9576,23 @@
           <w:szCs w:val="20"/>
         </w:rPr>
         <w:t xml:space="preserve">Diferenciace</w:t>
+      </w:r>
+    </w:p>
+    <w:p>
+      <w:pPr>
+        <w:pStyle w:val="ListParagraph"/>
+        <w:numPr>
+          <w:ilvl w:val="0"/>
+          <w:numId w:val="2"/>
+        </w:numPr>
+        <w:spacing w:after="40"/>
+      </w:pPr>
+      <w:r>
+        <w:rPr>
+          <w:b w:val="false"/>
+          <w:bCs w:val="false"/>
+        </w:rPr>
+        <w:t xml:space="preserve">1. trojročí: Jednoduché pokusy s jasně viditelným efektem (potápění, klíčení), radost z pozorování a kladení otázek „co se stane, když…“, společný zápis toho, co jsme zjistili.</w:t>
       </w:r>
     </w:p>
     <w:p>
@@ -9414,7 +9686,7 @@
           <w:sz w:val="20"/>
           <w:szCs w:val="20"/>
         </w:rPr>
-        <w:t xml:space="preserve">2. i 3. trojročí</w:t>
+        <w:t xml:space="preserve">1.–3. trojročí</w:t>
       </w:r>
     </w:p>
     <w:p>
@@ -9785,6 +10057,23 @@
           <w:szCs w:val="20"/>
         </w:rPr>
         <w:t xml:space="preserve">Diferenciace</w:t>
+      </w:r>
+    </w:p>
+    <w:p>
+      <w:pPr>
+        <w:pStyle w:val="ListParagraph"/>
+        <w:numPr>
+          <w:ilvl w:val="0"/>
+          <w:numId w:val="2"/>
+        </w:numPr>
+        <w:spacing w:after="40"/>
+      </w:pPr>
+      <w:r>
+        <w:rPr>
+          <w:b w:val="false"/>
+          <w:bCs w:val="false"/>
+        </w:rPr>
+        <w:t xml:space="preserve">1. trojročí: Hraní a objevování, že se při hře něco naučím, jednoduché úpravy pravidel oblíbené hry, výroba vlastní jednoduché hry pro kamarády.</w:t>
       </w:r>
     </w:p>
     <w:p>
@@ -9850,7 +10139,7 @@
           <w:sz w:val="20"/>
           <w:szCs w:val="20"/>
         </w:rPr>
-        <w:t xml:space="preserve">2. i 3. trojročí</w:t>
+        <w:t xml:space="preserve">1.–3. trojročí</w:t>
       </w:r>
     </w:p>
     <w:p>
@@ -10172,6 +10461,23 @@
           <w:szCs w:val="20"/>
         </w:rPr>
         <w:t xml:space="preserve">Diferenciace</w:t>
+      </w:r>
+    </w:p>
+    <w:p>
+      <w:pPr>
+        <w:pStyle w:val="ListParagraph"/>
+        <w:numPr>
+          <w:ilvl w:val="0"/>
+          <w:numId w:val="2"/>
+        </w:numPr>
+        <w:spacing w:after="40"/>
+      </w:pPr>
+      <w:r>
+        <w:rPr>
+          <w:b w:val="false"/>
+          <w:bCs w:val="false"/>
+        </w:rPr>
+        <w:t xml:space="preserve">1. trojročí: Volná tvorba bez strachu z výsledku, hravé seznámení s různými technikami (malba, hudba, pohyb), návštěva výstavy s jednoduchým povídáním o tom, co se mi líbilo.</w:t>
       </w:r>
     </w:p>
     <w:p>
@@ -10265,7 +10571,7 @@
           <w:sz w:val="20"/>
           <w:szCs w:val="20"/>
         </w:rPr>
-        <w:t xml:space="preserve">2. i 3. trojročí</w:t>
+        <w:t xml:space="preserve">1.–3. trojročí</w:t>
       </w:r>
     </w:p>
     <w:p>
@@ -10636,6 +10942,23 @@
           <w:szCs w:val="20"/>
         </w:rPr>
         <w:t xml:space="preserve">Diferenciace</w:t>
+      </w:r>
+    </w:p>
+    <w:p>
+      <w:pPr>
+        <w:pStyle w:val="ListParagraph"/>
+        <w:numPr>
+          <w:ilvl w:val="0"/>
+          <w:numId w:val="2"/>
+        </w:numPr>
+        <w:spacing w:after="40"/>
+      </w:pPr>
+      <w:r>
+        <w:rPr>
+          <w:b w:val="false"/>
+          <w:bCs w:val="false"/>
+        </w:rPr>
+        <w:t xml:space="preserve">1. trojročí: Hmatatelné prameny jako staré fotky nebo předměty z domova, povídání s prarodiči o tom, jak to bylo dřív, jednoduché porovnání „tenkrát a teď“.</w:t>
       </w:r>
     </w:p>
     <w:p>
@@ -10729,7 +11052,7 @@
           <w:sz w:val="20"/>
           <w:szCs w:val="20"/>
         </w:rPr>
-        <w:t xml:space="preserve">2. i 3. trojročí</w:t>
+        <w:t xml:space="preserve">1.–3. trojročí</w:t>
       </w:r>
     </w:p>
     <w:p>
@@ -11117,6 +11440,23 @@
           <w:szCs w:val="20"/>
         </w:rPr>
         <w:t xml:space="preserve">Diferenciace</w:t>
+      </w:r>
+    </w:p>
+    <w:p>
+      <w:pPr>
+        <w:pStyle w:val="ListParagraph"/>
+        <w:numPr>
+          <w:ilvl w:val="0"/>
+          <w:numId w:val="2"/>
+        </w:numPr>
+        <w:spacing w:after="40"/>
+      </w:pPr>
+      <w:r>
+        <w:rPr>
+          <w:b w:val="false"/>
+          <w:bCs w:val="false"/>
+        </w:rPr>
+        <w:t xml:space="preserve">1. trojročí: Kratší návštěvy blízkých řemeslníků a provozů s jednoduchým vyzkoušením, zvídavé otázky „jak to děláte“, radost ze setkání s dospělými, kteří něco umí.</w:t>
       </w:r>
     </w:p>
     <w:p>
@@ -11210,7 +11550,7 @@
           <w:sz w:val="20"/>
           <w:szCs w:val="20"/>
         </w:rPr>
-        <w:t xml:space="preserve">2. i 3. trojročí</w:t>
+        <w:t xml:space="preserve">1.–3. trojročí</w:t>
       </w:r>
     </w:p>
     <w:p>
@@ -11515,6 +11855,23 @@
           <w:szCs w:val="20"/>
         </w:rPr>
         <w:t xml:space="preserve">Diferenciace</w:t>
+      </w:r>
+    </w:p>
+    <w:p>
+      <w:pPr>
+        <w:pStyle w:val="ListParagraph"/>
+        <w:numPr>
+          <w:ilvl w:val="0"/>
+          <w:numId w:val="2"/>
+        </w:numPr>
+        <w:spacing w:after="40"/>
+      </w:pPr>
+      <w:r>
+        <w:rPr>
+          <w:b w:val="false"/>
+          <w:bCs w:val="false"/>
+        </w:rPr>
+        <w:t xml:space="preserve">1. trojročí: Hravé čtení jednoduchých značek a piktogramů, orientace podle obrázkového plánku školy nebo okolí, kreslení vlastní jednoduché mapy.</w:t>
       </w:r>
     </w:p>
     <w:p>
@@ -11608,7 +11965,7 @@
           <w:sz w:val="20"/>
           <w:szCs w:val="20"/>
         </w:rPr>
-        <w:t xml:space="preserve">2. i 3. trojročí</w:t>
+        <w:t xml:space="preserve">1.–3. trojročí</w:t>
       </w:r>
     </w:p>
     <w:p>
@@ -11979,6 +12336,23 @@
           <w:szCs w:val="20"/>
         </w:rPr>
         <w:t xml:space="preserve">Diferenciace</w:t>
+      </w:r>
+    </w:p>
+    <w:p>
+      <w:pPr>
+        <w:pStyle w:val="ListParagraph"/>
+        <w:numPr>
+          <w:ilvl w:val="0"/>
+          <w:numId w:val="2"/>
+        </w:numPr>
+        <w:spacing w:after="40"/>
+      </w:pPr>
+      <w:r>
+        <w:rPr>
+          <w:b w:val="false"/>
+          <w:bCs w:val="false"/>
+        </w:rPr>
+        <w:t xml:space="preserve">1. trojročí: Sbírání vlastních otázek o světě kolem, hledání odpovědí pozorováním venku (louka, potok) a v knihách, radost z objevu.</w:t>
       </w:r>
     </w:p>
     <w:p>
@@ -12072,7 +12446,7 @@
           <w:sz w:val="20"/>
           <w:szCs w:val="20"/>
         </w:rPr>
-        <w:t xml:space="preserve">2. i 3. trojročí</w:t>
+        <w:t xml:space="preserve">1.–3. trojročí</w:t>
       </w:r>
     </w:p>
     <w:p>
@@ -12443,6 +12817,23 @@
           <w:szCs w:val="20"/>
         </w:rPr>
         <w:t xml:space="preserve">Diferenciace</w:t>
+      </w:r>
+    </w:p>
+    <w:p>
+      <w:pPr>
+        <w:pStyle w:val="ListParagraph"/>
+        <w:numPr>
+          <w:ilvl w:val="0"/>
+          <w:numId w:val="2"/>
+        </w:numPr>
+        <w:spacing w:after="40"/>
+      </w:pPr>
+      <w:r>
+        <w:rPr>
+          <w:b w:val="false"/>
+          <w:bCs w:val="false"/>
+        </w:rPr>
+        <w:t xml:space="preserve">1. trojročí: Jednoduché otázky nad příběhem nebo obrázkem (Je fér, když…? Co dělá kamaráda kamarádem?), pravidla dobrého povídání v kruhu — nasloucháme, nepřerušujeme.</w:t>
       </w:r>
     </w:p>
     <w:p>
@@ -12508,7 +12899,7 @@
           <w:sz w:val="20"/>
           <w:szCs w:val="20"/>
         </w:rPr>
-        <w:t xml:space="preserve">2. i 3. trojročí</w:t>
+        <w:t xml:space="preserve">1.–3. trojročí</w:t>
       </w:r>
     </w:p>
     <w:p>
@@ -12879,6 +13270,23 @@
           <w:szCs w:val="20"/>
         </w:rPr>
         <w:t xml:space="preserve">Diferenciace</w:t>
+      </w:r>
+    </w:p>
+    <w:p>
+      <w:pPr>
+        <w:pStyle w:val="ListParagraph"/>
+        <w:numPr>
+          <w:ilvl w:val="0"/>
+          <w:numId w:val="2"/>
+        </w:numPr>
+        <w:spacing w:after="40"/>
+      </w:pPr>
+      <w:r>
+        <w:rPr>
+          <w:b w:val="false"/>
+          <w:bCs w:val="false"/>
+        </w:rPr>
+        <w:t xml:space="preserve">1. trojročí: Kouzelné pokusy se světlem a stínem (kaleidoskop, stínové divadlo), výroba jednoduchého hudebního nástroje, hry se zvukem a ozvěnou.</w:t>
       </w:r>
     </w:p>
     <w:p>
@@ -12944,7 +13352,7 @@
           <w:sz w:val="20"/>
           <w:szCs w:val="20"/>
         </w:rPr>
-        <w:t xml:space="preserve">2. i 3. trojročí</w:t>
+        <w:t xml:space="preserve">1.–3. trojročí</w:t>
       </w:r>
     </w:p>
     <w:p>
@@ -13332,6 +13740,23 @@
           <w:szCs w:val="20"/>
         </w:rPr>
         <w:t xml:space="preserve">Diferenciace</w:t>
+      </w:r>
+    </w:p>
+    <w:p>
+      <w:pPr>
+        <w:pStyle w:val="ListParagraph"/>
+        <w:numPr>
+          <w:ilvl w:val="0"/>
+          <w:numId w:val="2"/>
+        </w:numPr>
+        <w:spacing w:after="40"/>
+      </w:pPr>
+      <w:r>
+        <w:rPr>
+          <w:b w:val="false"/>
+          <w:bCs w:val="false"/>
+        </w:rPr>
+        <w:t xml:space="preserve">1. trojročí: Pozorování noční oblohy a Měsíce, pohádky a příběhy o vesmíru, jednoduchý model sluneční soustavy, radost z velkých otázek (Je tam někdo?).</w:t>
       </w:r>
     </w:p>
     <w:p>
@@ -13447,7 +13872,7 @@
           <w:sz w:val="20"/>
           <w:szCs w:val="20"/>
         </w:rPr>
-        <w:t xml:space="preserve">2. i 3. trojročí</w:t>
+        <w:t xml:space="preserve">1.–3. trojročí</w:t>
       </w:r>
     </w:p>
     <w:p>
@@ -13786,6 +14211,23 @@
           <w:szCs w:val="20"/>
         </w:rPr>
         <w:t xml:space="preserve">Diferenciace</w:t>
+      </w:r>
+    </w:p>
+    <w:p>
+      <w:pPr>
+        <w:pStyle w:val="ListParagraph"/>
+        <w:numPr>
+          <w:ilvl w:val="0"/>
+          <w:numId w:val="2"/>
+        </w:numPr>
+        <w:spacing w:after="40"/>
+      </w:pPr>
+      <w:r>
+        <w:rPr>
+          <w:b w:val="false"/>
+          <w:bCs w:val="false"/>
+        </w:rPr>
+        <w:t xml:space="preserve">1. trojročí: Dramatické hry a vyprávění příběhů, mluvení před malou skupinou kamarádů, jednoduchá cvičení na naslouchání (co jsi právě řekl, zopakuj).</w:t>
       </w:r>
     </w:p>
     <w:p>
@@ -13851,7 +14293,7 @@
           <w:sz w:val="20"/>
           <w:szCs w:val="20"/>
         </w:rPr>
-        <w:t xml:space="preserve">2. i 3. trojročí</w:t>
+        <w:t xml:space="preserve">1.–3. trojročí</w:t>
       </w:r>
     </w:p>
     <w:p>
@@ -14173,6 +14615,23 @@
           <w:szCs w:val="20"/>
         </w:rPr>
         <w:t xml:space="preserve">Diferenciace</w:t>
+      </w:r>
+    </w:p>
+    <w:p>
+      <w:pPr>
+        <w:pStyle w:val="ListParagraph"/>
+        <w:numPr>
+          <w:ilvl w:val="0"/>
+          <w:numId w:val="2"/>
+        </w:numPr>
+        <w:spacing w:after="40"/>
+      </w:pPr>
+      <w:r>
+        <w:rPr>
+          <w:b w:val="false"/>
+          <w:bCs w:val="false"/>
+        </w:rPr>
+        <w:t xml:space="preserve">1. trojročí: Pojmenování toho, co cítím, když se pohádám, jednoduché kroky ke smíru (omluva, podání ruky), společně vytvořená pravidla soužití ve třídě.</w:t>
       </w:r>
     </w:p>
     <w:p>
@@ -14238,7 +14697,7 @@
           <w:sz w:val="20"/>
           <w:szCs w:val="20"/>
         </w:rPr>
-        <w:t xml:space="preserve">2. i 3. trojročí</w:t>
+        <w:t xml:space="preserve">1.–3. trojročí</w:t>
       </w:r>
     </w:p>
     <w:p>
@@ -14577,6 +15036,23 @@
           <w:szCs w:val="20"/>
         </w:rPr>
         <w:t xml:space="preserve">Diferenciace</w:t>
+      </w:r>
+    </w:p>
+    <w:p>
+      <w:pPr>
+        <w:pStyle w:val="ListParagraph"/>
+        <w:numPr>
+          <w:ilvl w:val="0"/>
+          <w:numId w:val="2"/>
+        </w:numPr>
+        <w:spacing w:after="40"/>
+      </w:pPr>
+      <w:r>
+        <w:rPr>
+          <w:b w:val="false"/>
+          <w:bCs w:val="false"/>
+        </w:rPr>
+        <w:t xml:space="preserve">1. trojročí: Co znamená být dobrý kamarád, rozpoznání, když někdo stojí stranou, a jednoduchý krok, jak ho přizvat do hry.</w:t>
       </w:r>
     </w:p>
     <w:p>
@@ -14642,7 +15118,7 @@
           <w:sz w:val="20"/>
           <w:szCs w:val="20"/>
         </w:rPr>
-        <w:t xml:space="preserve">2. i 3. trojročí</w:t>
+        <w:t xml:space="preserve">1.–3. trojročí</w:t>
       </w:r>
     </w:p>
     <w:p>
@@ -14981,6 +15457,23 @@
           <w:szCs w:val="20"/>
         </w:rPr>
         <w:t xml:space="preserve">Diferenciace</w:t>
+      </w:r>
+    </w:p>
+    <w:p>
+      <w:pPr>
+        <w:pStyle w:val="ListParagraph"/>
+        <w:numPr>
+          <w:ilvl w:val="0"/>
+          <w:numId w:val="2"/>
+        </w:numPr>
+        <w:spacing w:after="40"/>
+      </w:pPr>
+      <w:r>
+        <w:rPr>
+          <w:b w:val="false"/>
+          <w:bCs w:val="false"/>
+        </w:rPr>
+        <w:t xml:space="preserve">1. trojročí: Co je kamarádství, sdílení hraček a půjčování, jednoduché řešení drobných sporů (kdo je na řadě), přijímání toho, že každý je jiný.</w:t>
       </w:r>
     </w:p>
     <w:p>
@@ -15046,7 +15539,7 @@
           <w:sz w:val="20"/>
           <w:szCs w:val="20"/>
         </w:rPr>
-        <w:t xml:space="preserve">2. i 3. trojročí</w:t>
+        <w:t xml:space="preserve">1.–3. trojročí</w:t>
       </w:r>
     </w:p>
     <w:p>
@@ -15385,6 +15878,23 @@
           <w:szCs w:val="20"/>
         </w:rPr>
         <w:t xml:space="preserve">Diferenciace</w:t>
+      </w:r>
+    </w:p>
+    <w:p>
+      <w:pPr>
+        <w:pStyle w:val="ListParagraph"/>
+        <w:numPr>
+          <w:ilvl w:val="0"/>
+          <w:numId w:val="2"/>
+        </w:numPr>
+        <w:spacing w:after="40"/>
+      </w:pPr>
+      <w:r>
+        <w:rPr>
+          <w:b w:val="false"/>
+          <w:bCs w:val="false"/>
+        </w:rPr>
+        <w:t xml:space="preserve">1. trojročí: Vyprávění a kreslení blízké rodiny (kdo je teta, dědeček), jednoduchý rodokmen na jeden list, drobná pravidelná pomoc doma, které si všímám.</w:t>
       </w:r>
     </w:p>
     <w:p>
@@ -15478,7 +15988,7 @@
           <w:sz w:val="20"/>
           <w:szCs w:val="20"/>
         </w:rPr>
-        <w:t xml:space="preserve">primárně 3. trojročí</w:t>
+        <w:t xml:space="preserve">1.–3. trojročí</w:t>
       </w:r>
     </w:p>
     <w:p>
@@ -15850,7 +16360,41 @@
           <w:b w:val="false"/>
           <w:bCs w:val="false"/>
         </w:rPr>
-        <w:t xml:space="preserve">3. trojročí: Určeno primárně 3. trojročí; citlivě moderovaná diskuse, spolupráce s odborníky, respekt k různému tempu dospívání.</w:t>
+        <w:t xml:space="preserve">1. trojročí: Ne partnerské vztahy, ale jejich základ: kamarádství a hranice. Každý má kolem sebe „neviditelnou bublinu“ — moje tělo je moje, umím říct „ne“ a respektuji, když ho řekne druhý. Kamarádství nestojí na příkazech ani vydírání („když mi to nedáš, nebudeš můj kamarád“). Rozlišení hezkého a tíživého tajemství a jistota, komu se svěřit.</w:t>
+      </w:r>
+    </w:p>
+    <w:p>
+      <w:pPr>
+        <w:pStyle w:val="ListParagraph"/>
+        <w:numPr>
+          <w:ilvl w:val="0"/>
+          <w:numId w:val="2"/>
+        </w:numPr>
+        <w:spacing w:after="40"/>
+      </w:pPr>
+      <w:r>
+        <w:rPr>
+          <w:b w:val="false"/>
+          <w:bCs w:val="false"/>
+        </w:rPr>
+        <w:t xml:space="preserve">2. trojročí: Těžiště v prvních zamilovanostech a hranicích: co je přitažlivost a že odmítnutí patří k seznamování, souhlas nacvičený na běžných situacích (dotek, sdílení fotky, soukromí), rozdíl mezi „má mě rád“ a „chce mě ovládat“. Romantické vzory z filmů a sítí vs. realita. Práce s příběhy a modelovými situacemi místo osobních zpovědí; respekt k tomu, že někoho téma už zajímá a jiného ještě vůbec ne.</w:t>
+      </w:r>
+    </w:p>
+    <w:p>
+      <w:pPr>
+        <w:pStyle w:val="ListParagraph"/>
+        <w:numPr>
+          <w:ilvl w:val="0"/>
+          <w:numId w:val="2"/>
+        </w:numPr>
+        <w:spacing w:after="40"/>
+      </w:pPr>
+      <w:r>
+        <w:rPr>
+          <w:b w:val="false"/>
+          <w:bCs w:val="false"/>
+        </w:rPr>
+        <w:t xml:space="preserve">3. trojročí: Otevřeněji o partnerských vztazích a sexualitě: souhlas v intimních situacích, sexting a kybergrooming, manipulace a násilí ve vztahu, kde hledat pomoc. Citlivě moderovaná diskuse ve spolupráci s odborníky, respekt k různému tempu dospívání.</w:t>
       </w:r>
     </w:p>
     <w:p>
@@ -15882,7 +16426,7 @@
           <w:sz w:val="20"/>
           <w:szCs w:val="20"/>
         </w:rPr>
-        <w:t xml:space="preserve">2. i 3. trojročí</w:t>
+        <w:t xml:space="preserve">1.–3. trojročí</w:t>
       </w:r>
     </w:p>
     <w:p>
@@ -16204,6 +16748,23 @@
           <w:szCs w:val="20"/>
         </w:rPr>
         <w:t xml:space="preserve">Diferenciace</w:t>
+      </w:r>
+    </w:p>
+    <w:p>
+      <w:pPr>
+        <w:pStyle w:val="ListParagraph"/>
+        <w:numPr>
+          <w:ilvl w:val="0"/>
+          <w:numId w:val="2"/>
+        </w:numPr>
+        <w:spacing w:after="40"/>
+      </w:pPr>
+      <w:r>
+        <w:rPr>
+          <w:b w:val="false"/>
+          <w:bCs w:val="false"/>
+        </w:rPr>
+        <w:t xml:space="preserve">1. trojročí: Poznávání jiných kultur skrze jídlo, pohádky a svátky, hry ze světa, setkání s někým, kdo mluví jinou řečí nebo má jiné zvyky.</w:t>
       </w:r>
     </w:p>
     <w:p>
@@ -16297,7 +16858,7 @@
           <w:sz w:val="20"/>
           <w:szCs w:val="20"/>
         </w:rPr>
-        <w:t xml:space="preserve">2. i 3. trojročí</w:t>
+        <w:t xml:space="preserve">1.–3. trojročí</w:t>
       </w:r>
     </w:p>
     <w:p>
@@ -16653,6 +17214,23 @@
           <w:szCs w:val="20"/>
         </w:rPr>
         <w:t xml:space="preserve">Diferenciace</w:t>
+      </w:r>
+    </w:p>
+    <w:p>
+      <w:pPr>
+        <w:pStyle w:val="ListParagraph"/>
+        <w:numPr>
+          <w:ilvl w:val="0"/>
+          <w:numId w:val="2"/>
+        </w:numPr>
+        <w:spacing w:after="40"/>
+      </w:pPr>
+      <w:r>
+        <w:rPr>
+          <w:b w:val="false"/>
+          <w:bCs w:val="false"/>
+        </w:rPr>
+        <w:t xml:space="preserve">1. trojročí: Základy slušnosti hravou formou — pozdrav, prosba, poděkování, počkání, až přijde řada — nacvičené na scénkách a v běžných školních situacích.</w:t>
       </w:r>
     </w:p>
     <w:p>
@@ -16718,7 +17296,7 @@
           <w:sz w:val="20"/>
           <w:szCs w:val="20"/>
         </w:rPr>
-        <w:t xml:space="preserve">2. i 3. trojročí</w:t>
+        <w:t xml:space="preserve">1.–3. trojročí</w:t>
       </w:r>
     </w:p>
     <w:p>
@@ -17040,6 +17618,23 @@
           <w:szCs w:val="20"/>
         </w:rPr>
         <w:t xml:space="preserve">Diferenciace</w:t>
+      </w:r>
+    </w:p>
+    <w:p>
+      <w:pPr>
+        <w:pStyle w:val="ListParagraph"/>
+        <w:numPr>
+          <w:ilvl w:val="0"/>
+          <w:numId w:val="2"/>
+        </w:numPr>
+        <w:spacing w:after="40"/>
+      </w:pPr>
+      <w:r>
+        <w:rPr>
+          <w:b w:val="false"/>
+          <w:bCs w:val="false"/>
+        </w:rPr>
+        <w:t xml:space="preserve">1. trojročí: Jednoduché anglické fráze a slovíčka v písničkách a hrách, odvaha promluvit i s chybou, pomoc gesty a obrázky, když slova nestačí.</w:t>
       </w:r>
     </w:p>
     <w:p>
@@ -17105,7 +17700,7 @@
           <w:sz w:val="20"/>
           <w:szCs w:val="20"/>
         </w:rPr>
-        <w:t xml:space="preserve">2. i 3. trojročí</w:t>
+        <w:t xml:space="preserve">1.–3. trojročí</w:t>
       </w:r>
     </w:p>
     <w:p>
@@ -17427,6 +18022,23 @@
           <w:szCs w:val="20"/>
         </w:rPr>
         <w:t xml:space="preserve">Diferenciace</w:t>
+      </w:r>
+    </w:p>
+    <w:p>
+      <w:pPr>
+        <w:pStyle w:val="ListParagraph"/>
+        <w:numPr>
+          <w:ilvl w:val="0"/>
+          <w:numId w:val="2"/>
+        </w:numPr>
+        <w:spacing w:after="40"/>
+      </w:pPr>
+      <w:r>
+        <w:rPr>
+          <w:b w:val="false"/>
+          <w:bCs w:val="false"/>
+        </w:rPr>
+        <w:t xml:space="preserve">1. trojročí: Bezpečné základy: s kým se smím bavit online, že heslo je tajné, komu se svěřit, když se mi něco na internetu nelíbí nebo mě to vyleká.</w:t>
       </w:r>
     </w:p>
     <w:p>
@@ -17492,7 +18104,7 @@
           <w:sz w:val="20"/>
           <w:szCs w:val="20"/>
         </w:rPr>
-        <w:t xml:space="preserve">2. i 3. trojročí</w:t>
+        <w:t xml:space="preserve">1.–3. trojročí</w:t>
       </w:r>
     </w:p>
     <w:p>
@@ -17863,6 +18475,23 @@
           <w:szCs w:val="20"/>
         </w:rPr>
         <w:t xml:space="preserve">Diferenciace</w:t>
+      </w:r>
+    </w:p>
+    <w:p>
+      <w:pPr>
+        <w:pStyle w:val="ListParagraph"/>
+        <w:numPr>
+          <w:ilvl w:val="0"/>
+          <w:numId w:val="2"/>
+        </w:numPr>
+        <w:spacing w:after="40"/>
+      </w:pPr>
+      <w:r>
+        <w:rPr>
+          <w:b w:val="false"/>
+          <w:bCs w:val="false"/>
+        </w:rPr>
+        <w:t xml:space="preserve">1. trojročí: Citlivé seznámení přes rodinné příběhy a obrázky (jak žili prarodiče jako děti), bez traumatizujících detailů, důraz na to, že i tehdy lidé měli rodiny a přátele.</w:t>
       </w:r>
     </w:p>
     <w:p>
@@ -17956,7 +18585,7 @@
           <w:sz w:val="20"/>
           <w:szCs w:val="20"/>
         </w:rPr>
-        <w:t xml:space="preserve">2. i 3. trojročí</w:t>
+        <w:t xml:space="preserve">1.–3. trojročí</w:t>
       </w:r>
     </w:p>
     <w:p>
@@ -18344,6 +18973,23 @@
           <w:szCs w:val="20"/>
         </w:rPr>
         <w:t xml:space="preserve">Diferenciace</w:t>
+      </w:r>
+    </w:p>
+    <w:p>
+      <w:pPr>
+        <w:pStyle w:val="ListParagraph"/>
+        <w:numPr>
+          <w:ilvl w:val="0"/>
+          <w:numId w:val="2"/>
+        </w:numPr>
+        <w:spacing w:after="40"/>
+      </w:pPr>
+      <w:r>
+        <w:rPr>
+          <w:b w:val="false"/>
+          <w:bCs w:val="false"/>
+        </w:rPr>
+        <w:t xml:space="preserve">1. trojročí: Setkávání se seniory formou hry a společného tvoření, zvídavé otázky „jak to bylo, když jste byli malí“, drobná pravidelná pozornost (obrázek, návštěva).</w:t>
       </w:r>
     </w:p>
     <w:p>
@@ -18431,7 +19077,7 @@
           <w:sz w:val="20"/>
           <w:szCs w:val="20"/>
         </w:rPr>
-        <w:t xml:space="preserve">2. i 3. trojročí</w:t>
+        <w:t xml:space="preserve">1.–3. trojročí</w:t>
       </w:r>
     </w:p>
     <w:p>
@@ -18770,6 +19416,23 @@
           <w:szCs w:val="20"/>
         </w:rPr>
         <w:t xml:space="preserve">Diferenciace</w:t>
+      </w:r>
+    </w:p>
+    <w:p>
+      <w:pPr>
+        <w:pStyle w:val="ListParagraph"/>
+        <w:numPr>
+          <w:ilvl w:val="0"/>
+          <w:numId w:val="2"/>
+        </w:numPr>
+        <w:spacing w:after="40"/>
+      </w:pPr>
+      <w:r>
+        <w:rPr>
+          <w:b w:val="false"/>
+          <w:bCs w:val="false"/>
+        </w:rPr>
+        <w:t xml:space="preserve">1. trojročí: Poznávání mincí a bankovek, kolik co stojí (zmrzlina, časopis), první zkušenost s vlastním kapesným a jednoduchým rozhodováním, co za něj koupím.</w:t>
       </w:r>
     </w:p>
     <w:p>
@@ -18863,7 +19526,7 @@
           <w:sz w:val="20"/>
           <w:szCs w:val="20"/>
         </w:rPr>
-        <w:t xml:space="preserve">2. i 3. trojročí</w:t>
+        <w:t xml:space="preserve">1.–3. trojročí</w:t>
       </w:r>
     </w:p>
     <w:p>
@@ -19202,6 +19865,23 @@
           <w:szCs w:val="20"/>
         </w:rPr>
         <w:t xml:space="preserve">Diferenciace</w:t>
+      </w:r>
+    </w:p>
+    <w:p>
+      <w:pPr>
+        <w:pStyle w:val="ListParagraph"/>
+        <w:numPr>
+          <w:ilvl w:val="0"/>
+          <w:numId w:val="2"/>
+        </w:numPr>
+        <w:spacing w:after="40"/>
+      </w:pPr>
+      <w:r>
+        <w:rPr>
+          <w:b w:val="false"/>
+          <w:bCs w:val="false"/>
+        </w:rPr>
+        <w:t xml:space="preserve">1. trojročí: Jednoduchý společný „obchod“ pro rodiče či spolužáky (limonáda, výrobky), základní počítání s penězi, radost z prodeje vlastní práce.</w:t>
       </w:r>
     </w:p>
     <w:p>
@@ -19295,7 +19975,7 @@
           <w:sz w:val="20"/>
           <w:szCs w:val="20"/>
         </w:rPr>
-        <w:t xml:space="preserve">2. i 3. trojročí</w:t>
+        <w:t xml:space="preserve">1.–3. trojročí</w:t>
       </w:r>
     </w:p>
     <w:p>
@@ -19634,6 +20314,23 @@
           <w:szCs w:val="20"/>
         </w:rPr>
         <w:t xml:space="preserve">Diferenciace</w:t>
+      </w:r>
+    </w:p>
+    <w:p>
+      <w:pPr>
+        <w:pStyle w:val="ListParagraph"/>
+        <w:numPr>
+          <w:ilvl w:val="0"/>
+          <w:numId w:val="2"/>
+        </w:numPr>
+        <w:spacing w:after="40"/>
+      </w:pPr>
+      <w:r>
+        <w:rPr>
+          <w:b w:val="false"/>
+          <w:bCs w:val="false"/>
+        </w:rPr>
+        <w:t xml:space="preserve">1. trojročí: Poznávání profesí kolem sebe (co dělá maminka, řidič autobusu, paní v obchodě), hraní na povolání, návštěvy pracovišť rodičů.</w:t>
       </w:r>
     </w:p>
     <w:p>
@@ -19727,7 +20424,7 @@
           <w:sz w:val="20"/>
           <w:szCs w:val="20"/>
         </w:rPr>
-        <w:t xml:space="preserve">2. i 3. trojročí</w:t>
+        <w:t xml:space="preserve">1.–3. trojročí</w:t>
       </w:r>
     </w:p>
     <w:p>
@@ -20066,6 +20763,23 @@
           <w:szCs w:val="20"/>
         </w:rPr>
         <w:t xml:space="preserve">Diferenciace</w:t>
+      </w:r>
+    </w:p>
+    <w:p>
+      <w:pPr>
+        <w:pStyle w:val="ListParagraph"/>
+        <w:numPr>
+          <w:ilvl w:val="0"/>
+          <w:numId w:val="2"/>
+        </w:numPr>
+        <w:spacing w:after="40"/>
+      </w:pPr>
+      <w:r>
+        <w:rPr>
+          <w:b w:val="false"/>
+          <w:bCs w:val="false"/>
+        </w:rPr>
+        <w:t xml:space="preserve">1. trojročí: Orientace v denním rytmu a jednoduchém obrázkovém plánu dne, vědomí, co mě čeká zítra, hledání rovnováhy mezi školou, kroužky a hraním.</w:t>
       </w:r>
     </w:p>
     <w:p>
@@ -20131,7 +20845,7 @@
           <w:sz w:val="20"/>
           <w:szCs w:val="20"/>
         </w:rPr>
-        <w:t xml:space="preserve">2. i 3. trojročí</w:t>
+        <w:t xml:space="preserve">1.–3. trojročí</w:t>
       </w:r>
     </w:p>
     <w:p>
@@ -20487,6 +21201,23 @@
           <w:szCs w:val="20"/>
         </w:rPr>
         <w:t xml:space="preserve">Diferenciace</w:t>
+      </w:r>
+    </w:p>
+    <w:p>
+      <w:pPr>
+        <w:pStyle w:val="ListParagraph"/>
+        <w:numPr>
+          <w:ilvl w:val="0"/>
+          <w:numId w:val="2"/>
+        </w:numPr>
+        <w:spacing w:after="40"/>
+      </w:pPr>
+      <w:r>
+        <w:rPr>
+          <w:b w:val="false"/>
+          <w:bCs w:val="false"/>
+        </w:rPr>
+        <w:t xml:space="preserve">1. trojročí: Základní sebeobsluha: namazat si chleba, ustlat postel, uklidit své věci, nakoupit podle jednoduchého obrázkového seznamu s doprovodem.</w:t>
       </w:r>
     </w:p>
     <w:p>
@@ -20552,7 +21283,7 @@
           <w:sz w:val="20"/>
           <w:szCs w:val="20"/>
         </w:rPr>
-        <w:t xml:space="preserve">2. i 3. trojročí</w:t>
+        <w:t xml:space="preserve">1.–3. trojročí</w:t>
       </w:r>
     </w:p>
     <w:p>
@@ -20925,6 +21656,23 @@
           <w:szCs w:val="20"/>
         </w:rPr>
         <w:t xml:space="preserve">Diferenciace</w:t>
+      </w:r>
+    </w:p>
+    <w:p>
+      <w:pPr>
+        <w:pStyle w:val="ListParagraph"/>
+        <w:numPr>
+          <w:ilvl w:val="0"/>
+          <w:numId w:val="2"/>
+        </w:numPr>
+        <w:spacing w:after="40"/>
+      </w:pPr>
+      <w:r>
+        <w:rPr>
+          <w:b w:val="false"/>
+          <w:bCs w:val="false"/>
+        </w:rPr>
+        <w:t xml:space="preserve">1. trojročí: Důležitá telefonní čísla a přivolání dospělého, chování při požárním poplachu, bezpečný pohyb venku, jednoduché tábornické dovednosti s dospělým.</w:t>
       </w:r>
     </w:p>
     <w:p>
@@ -21018,7 +21766,7 @@
           <w:sz w:val="20"/>
           <w:szCs w:val="20"/>
         </w:rPr>
-        <w:t xml:space="preserve">2. i 3. trojročí</w:t>
+        <w:t xml:space="preserve">1.–3. trojročí</w:t>
       </w:r>
     </w:p>
     <w:p>
@@ -21340,6 +22088,23 @@
           <w:szCs w:val="20"/>
         </w:rPr>
         <w:t xml:space="preserve">Diferenciace</w:t>
+      </w:r>
+    </w:p>
+    <w:p>
+      <w:pPr>
+        <w:pStyle w:val="ListParagraph"/>
+        <w:numPr>
+          <w:ilvl w:val="0"/>
+          <w:numId w:val="2"/>
+        </w:numPr>
+        <w:spacing w:after="40"/>
+      </w:pPr>
+      <w:r>
+        <w:rPr>
+          <w:b w:val="false"/>
+          <w:bCs w:val="false"/>
+        </w:rPr>
+        <w:t xml:space="preserve">1. trojročí: Přivolání pomoci (dospělý, tísňová linka), ošetření drobného škrábance náplastí, zotavovací poloha vyzkoušená na plyšákovi, beze strachu z krve.</w:t>
       </w:r>
     </w:p>
     <w:p>
@@ -21433,7 +22198,7 @@
           <w:sz w:val="20"/>
           <w:szCs w:val="20"/>
         </w:rPr>
-        <w:t xml:space="preserve">2. i 3. trojročí</w:t>
+        <w:t xml:space="preserve">1.–3. trojročí</w:t>
       </w:r>
     </w:p>
     <w:p>
@@ -21772,6 +22537,23 @@
           <w:szCs w:val="20"/>
         </w:rPr>
         <w:t xml:space="preserve">Diferenciace</w:t>
+      </w:r>
+    </w:p>
+    <w:p>
+      <w:pPr>
+        <w:pStyle w:val="ListParagraph"/>
+        <w:numPr>
+          <w:ilvl w:val="0"/>
+          <w:numId w:val="2"/>
+        </w:numPr>
+        <w:spacing w:after="40"/>
+      </w:pPr>
+      <w:r>
+        <w:rPr>
+          <w:b w:val="false"/>
+          <w:bCs w:val="false"/>
+        </w:rPr>
+        <w:t xml:space="preserve">1. trojročí: Práce s jednoduchými materiály (papír, karton, hlína) a bezpečnými nástroji pod dohledem, výroba podle jednoduchého návodu, hrdost na hotový výrobek.</w:t>
       </w:r>
     </w:p>
     <w:p>
@@ -21865,7 +22647,7 @@
           <w:sz w:val="20"/>
           <w:szCs w:val="20"/>
         </w:rPr>
-        <w:t xml:space="preserve">2. i 3. trojročí</w:t>
+        <w:t xml:space="preserve">1.–3. trojročí</w:t>
       </w:r>
     </w:p>
     <w:p>
@@ -22187,6 +22969,23 @@
           <w:szCs w:val="20"/>
         </w:rPr>
         <w:t xml:space="preserve">Diferenciace</w:t>
+      </w:r>
+    </w:p>
+    <w:p>
+      <w:pPr>
+        <w:pStyle w:val="ListParagraph"/>
+        <w:numPr>
+          <w:ilvl w:val="0"/>
+          <w:numId w:val="2"/>
+        </w:numPr>
+        <w:spacing w:after="40"/>
+      </w:pPr>
+      <w:r>
+        <w:rPr>
+          <w:b w:val="false"/>
+          <w:bCs w:val="false"/>
+        </w:rPr>
+        <w:t xml:space="preserve">1. trojročí: Každodenní péče o záhon nebo zvíře (zalévání, krmení), pozorování růstu a proměn, radost z vlastní sklizně a ochutnávky.</w:t>
       </w:r>
     </w:p>
     <w:p>
@@ -22652,6 +23451,23 @@
           <w:b w:val="false"/>
           <w:bCs w:val="false"/>
         </w:rPr>
+        <w:t xml:space="preserve">1. trojročí: Téma zůstává určeno primárně 3. trojročí; pro 1. trojročí nahrazeno základem, na kterém právo stojí — co je slib a proč ho dodržet, co je moje a co půjčené, proč existují pravidla.</w:t>
+      </w:r>
+    </w:p>
+    <w:p>
+      <w:pPr>
+        <w:pStyle w:val="ListParagraph"/>
+        <w:numPr>
+          <w:ilvl w:val="0"/>
+          <w:numId w:val="2"/>
+        </w:numPr>
+        <w:spacing w:after="40"/>
+      </w:pPr>
+      <w:r>
+        <w:rPr>
+          <w:b w:val="false"/>
+          <w:bCs w:val="false"/>
+        </w:rPr>
         <w:t xml:space="preserve">3. trojročí: Určeno primárně 3. trojročí; práce s reálnými dokumenty, důraz na situace blízké věku (brigády, nákupy online, odpovědnost za škodu, digitální podpisy).</w:t>
       </w:r>
     </w:p>
@@ -22684,7 +23500,7 @@
           <w:sz w:val="20"/>
           <w:szCs w:val="20"/>
         </w:rPr>
-        <w:t xml:space="preserve">2. i 3. trojročí</w:t>
+        <w:t xml:space="preserve">1.–3. trojročí</w:t>
       </w:r>
     </w:p>
     <w:p>
@@ -23055,6 +23871,23 @@
           <w:szCs w:val="20"/>
         </w:rPr>
         <w:t xml:space="preserve">Diferenciace</w:t>
+      </w:r>
+    </w:p>
+    <w:p>
+      <w:pPr>
+        <w:pStyle w:val="ListParagraph"/>
+        <w:numPr>
+          <w:ilvl w:val="0"/>
+          <w:numId w:val="2"/>
+        </w:numPr>
+        <w:spacing w:after="40"/>
+      </w:pPr>
+      <w:r>
+        <w:rPr>
+          <w:b w:val="false"/>
+          <w:bCs w:val="false"/>
+        </w:rPr>
+        <w:t xml:space="preserve">1. trojročí: Pravidla naší třídy jako malý stát — kdo je rozhoduje a jak, hravé hlasování o společné věci, poznávání, kdo se stará o školu a ulici.</w:t>
       </w:r>
     </w:p>
     <w:p>
@@ -23120,7 +23953,7 @@
           <w:sz w:val="20"/>
           <w:szCs w:val="20"/>
         </w:rPr>
-        <w:t xml:space="preserve">2. i 3. trojročí</w:t>
+        <w:t xml:space="preserve">1.–3. trojročí</w:t>
       </w:r>
     </w:p>
     <w:p>
@@ -23491,6 +24324,23 @@
           <w:szCs w:val="20"/>
         </w:rPr>
         <w:t xml:space="preserve">Diferenciace</w:t>
+      </w:r>
+    </w:p>
+    <w:p>
+      <w:pPr>
+        <w:pStyle w:val="ListParagraph"/>
+        <w:numPr>
+          <w:ilvl w:val="0"/>
+          <w:numId w:val="2"/>
+        </w:numPr>
+        <w:spacing w:after="40"/>
+      </w:pPr>
+      <w:r>
+        <w:rPr>
+          <w:b w:val="false"/>
+          <w:bCs w:val="false"/>
+        </w:rPr>
+        <w:t xml:space="preserve">1. trojročí: Rozebírání a poznávání součástek starého zařízení, jednoduché blokové programování nebo ovládání robota, hra na to, jak putuje zpráva od jednoho k druhému.</w:t>
       </w:r>
     </w:p>
     <w:p>
@@ -23584,7 +24434,7 @@
           <w:sz w:val="20"/>
           <w:szCs w:val="20"/>
         </w:rPr>
-        <w:t xml:space="preserve">2. i 3. trojročí</w:t>
+        <w:t xml:space="preserve">1.–3. trojročí</w:t>
       </w:r>
     </w:p>
     <w:p>
@@ -23955,6 +24805,23 @@
           <w:szCs w:val="20"/>
         </w:rPr>
         <w:t xml:space="preserve">Diferenciace</w:t>
+      </w:r>
+    </w:p>
+    <w:p>
+      <w:pPr>
+        <w:pStyle w:val="ListParagraph"/>
+        <w:numPr>
+          <w:ilvl w:val="0"/>
+          <w:numId w:val="2"/>
+        </w:numPr>
+        <w:spacing w:after="40"/>
+      </w:pPr>
+      <w:r>
+        <w:rPr>
+          <w:b w:val="false"/>
+          <w:bCs w:val="false"/>
+        </w:rPr>
+        <w:t xml:space="preserve">1. trojročí: Bezpečné pokusy se stavebnicí obvodů (baterka, žárovka, spínač), pravidlo nestrkat nic do zásuvky, jednoduchý pokus s citronovou baterkou.</w:t>
       </w:r>
     </w:p>
     <w:p>

</xml_diff>

<commit_message>
Doplnit dif1/aktivity/znalosti u témat 17, 19, 41, 43 podle návrhu kolegyně
Reakce na návrhy témat pro 1. trojročí (Místo, kde žijeme; Lidé a čas I;
Rozmanitost přírody I): státní symboly a vlast u tématu 43, orientace na
mapě ČR u tématu 19, regionální pověsti u tématu 17, půda a koloběh vody
u tématu 41. Přegenerováno index.html, Word i Excel.
</commit_message>
<xml_diff>
--- a/vystupy/Katalog_projektovych_temat.docx
+++ b/vystupy/Katalog_projektovych_temat.docx
@@ -6951,6 +6951,23 @@
     </w:p>
     <w:p>
       <w:pPr>
+        <w:pStyle w:val="ListParagraph"/>
+        <w:numPr>
+          <w:ilvl w:val="0"/>
+          <w:numId w:val="2"/>
+        </w:numPr>
+        <w:spacing w:after="40"/>
+      </w:pPr>
+      <w:r>
+        <w:rPr>
+          <w:b w:val="false"/>
+          <w:bCs w:val="false"/>
+        </w:rPr>
+        <w:t xml:space="preserve">Cesta kapky vody: pozorování a pokusy s koloběhem vody a půdou v okolí školy (louže, pára, sníh, propustnost půdy)</w:t>
+      </w:r>
+    </w:p>
+    <w:p>
+      <w:pPr>
         <w:spacing w:after="40" w:before="120"/>
       </w:pPr>
       <w:r>
@@ -7051,6 +7068,23 @@
     </w:p>
     <w:p>
       <w:pPr>
+        <w:pStyle w:val="ListParagraph"/>
+        <w:numPr>
+          <w:ilvl w:val="0"/>
+          <w:numId w:val="2"/>
+        </w:numPr>
+        <w:spacing w:after="40"/>
+      </w:pPr>
+      <w:r>
+        <w:rPr>
+          <w:b w:val="false"/>
+          <w:bCs w:val="false"/>
+        </w:rPr>
+        <w:t xml:space="preserve">Přírodopis: půda a její vlastnosti, koloběh vody v přírodě</w:t>
+      </w:r>
+    </w:p>
+    <w:p>
+      <w:pPr>
         <w:spacing w:after="40" w:before="120"/>
       </w:pPr>
       <w:r>
@@ -7110,7 +7144,7 @@
           <w:b w:val="false"/>
           <w:bCs w:val="false"/>
         </w:rPr>
-        <w:t xml:space="preserve">1. trojročí: Hry a pozorování v přírodě všemi smysly, poznávání pár stromů a zvířat v okolí školy, pravidelné „tiché místo“ venku jako rituál klidu.</w:t>
+        <w:t xml:space="preserve">1. trojročí: Hry a pozorování v přírodě všemi smysly, poznávání pár stromů a zvířat v okolí školy, pravidelné „tiché místo“ venku jako rituál klidu. Jednoduché pozorování počasí a proměn krajiny (bláto, louže, sníh) jako první krok k pochopení koloběhu vody.</w:t>
       </w:r>
     </w:p>
     <w:p>
@@ -10760,7 +10794,7 @@
           <w:b w:val="false"/>
           <w:bCs w:val="false"/>
         </w:rPr>
-        <w:t xml:space="preserve">Historie místa: pátrání po minulosti školy, ulice či obce (staré mapy, pamětní desky, katastr, kroniky)</w:t>
+        <w:t xml:space="preserve">Historie místa: pátrání po minulosti školy, ulice či obce (staré mapy, pamětní desky, katastr, kroniky, místní pověsti a legendy)</w:t>
       </w:r>
     </w:p>
     <w:p>
@@ -10899,6 +10933,23 @@
     </w:p>
     <w:p>
       <w:pPr>
+        <w:pStyle w:val="ListParagraph"/>
+        <w:numPr>
+          <w:ilvl w:val="0"/>
+          <w:numId w:val="2"/>
+        </w:numPr>
+        <w:spacing w:after="40"/>
+      </w:pPr>
+      <w:r>
+        <w:rPr>
+          <w:b w:val="false"/>
+          <w:bCs w:val="false"/>
+        </w:rPr>
+        <w:t xml:space="preserve">Český jazyk a literatura: pověsti a legendy jako lidový pramen paměti místa</w:t>
+      </w:r>
+    </w:p>
+    <w:p>
+      <w:pPr>
         <w:spacing w:after="40" w:before="120"/>
       </w:pPr>
       <w:r>
@@ -10958,7 +11009,7 @@
           <w:b w:val="false"/>
           <w:bCs w:val="false"/>
         </w:rPr>
-        <w:t xml:space="preserve">1. trojročí: Hmatatelné prameny jako staré fotky nebo předměty z domova, povídání s prarodiči o tom, jak to bylo dřív, jednoduché porovnání „tenkrát a teď“.</w:t>
+        <w:t xml:space="preserve">1. trojročí: Hmatatelné prameny jako staré fotky nebo předměty z domova, povídání s prarodiči o tom, jak to bylo dřív, jednoduché porovnání „tenkrát a teď“. Staré pověsti a příběhy o vzniku místa, kde žijeme.</w:t>
       </w:r>
     </w:p>
     <w:p>
@@ -11761,6 +11812,23 @@
     </w:p>
     <w:p>
       <w:pPr>
+        <w:pStyle w:val="ListParagraph"/>
+        <w:numPr>
+          <w:ilvl w:val="0"/>
+          <w:numId w:val="2"/>
+        </w:numPr>
+        <w:spacing w:after="40"/>
+      </w:pPr>
+      <w:r>
+        <w:rPr>
+          <w:b w:val="false"/>
+          <w:bCs w:val="false"/>
+        </w:rPr>
+        <w:t xml:space="preserve">Mapa ČR poprvé: kde jsme, jaké kraje má naše země a kdo jsou naši sousedé</w:t>
+      </w:r>
+    </w:p>
+    <w:p>
+      <w:pPr>
         <w:spacing w:after="40" w:before="120"/>
       </w:pPr>
       <w:r>
@@ -11844,6 +11912,23 @@
     </w:p>
     <w:p>
       <w:pPr>
+        <w:pStyle w:val="ListParagraph"/>
+        <w:numPr>
+          <w:ilvl w:val="0"/>
+          <w:numId w:val="2"/>
+        </w:numPr>
+        <w:spacing w:after="40"/>
+      </w:pPr>
+      <w:r>
+        <w:rPr>
+          <w:b w:val="false"/>
+          <w:bCs w:val="false"/>
+        </w:rPr>
+        <w:t xml:space="preserve">Člověk a jeho svět: orientace na mapě ČR a Evropy, sousední státy</w:t>
+      </w:r>
+    </w:p>
+    <w:p>
+      <w:pPr>
         <w:spacing w:after="40" w:before="120"/>
       </w:pPr>
       <w:r>
@@ -11871,7 +11956,7 @@
           <w:b w:val="false"/>
           <w:bCs w:val="false"/>
         </w:rPr>
-        <w:t xml:space="preserve">1. trojročí: Hravé čtení jednoduchých značek a piktogramů, orientace podle obrázkového plánku školy nebo okolí, kreslení vlastní jednoduché mapy.</w:t>
+        <w:t xml:space="preserve">1. trojročí: Hravé čtení jednoduchých značek a piktogramů, orientace podle obrázkového plánku školy nebo okolí, kreslení vlastní jednoduché mapy. První pohled na mapu ČR — kde jsme a kdo jsou naši sousedé.</w:t>
       </w:r>
     </w:p>
     <w:p>
@@ -23728,6 +23813,23 @@
     </w:p>
     <w:p>
       <w:pPr>
+        <w:pStyle w:val="ListParagraph"/>
+        <w:numPr>
+          <w:ilvl w:val="0"/>
+          <w:numId w:val="2"/>
+        </w:numPr>
+        <w:spacing w:after="40"/>
+      </w:pPr>
+      <w:r>
+        <w:rPr>
+          <w:b w:val="false"/>
+          <w:bCs w:val="false"/>
+        </w:rPr>
+        <w:t xml:space="preserve">Vlajka, znak a hymna: co znamenají státní symboly a proč je máme; procházka obcí za pamětihodnostmi jako symboly domova</w:t>
+      </w:r>
+    </w:p>
+    <w:p>
+      <w:pPr>
         <w:spacing w:after="40" w:before="120"/>
       </w:pPr>
       <w:r>
@@ -23828,6 +23930,23 @@
     </w:p>
     <w:p>
       <w:pPr>
+        <w:pStyle w:val="ListParagraph"/>
+        <w:numPr>
+          <w:ilvl w:val="0"/>
+          <w:numId w:val="2"/>
+        </w:numPr>
+        <w:spacing w:after="40"/>
+      </w:pPr>
+      <w:r>
+        <w:rPr>
+          <w:b w:val="false"/>
+          <w:bCs w:val="false"/>
+        </w:rPr>
+        <w:t xml:space="preserve">Člověk a jeho svět: domov, škola a okolí, obec a vlast, základní státní symboly (vlajka, znak, hymna)</w:t>
+      </w:r>
+    </w:p>
+    <w:p>
+      <w:pPr>
         <w:spacing w:after="40" w:before="120"/>
       </w:pPr>
       <w:r>
@@ -23887,7 +24006,7 @@
           <w:b w:val="false"/>
           <w:bCs w:val="false"/>
         </w:rPr>
-        <w:t xml:space="preserve">1. trojročí: Pravidla naší třídy jako malý stát — kdo je rozhoduje a jak, hravé hlasování o společné věci, poznávání, kdo se stará o školu a ulici.</w:t>
+        <w:t xml:space="preserve">1. trojročí: Pravidla naší třídy jako malý stát — kdo je rozhoduje a jak, hravé hlasování o společné věci, poznávání, kdo se stará o školu a ulici. Seznámení se státními symboly (vlajka, znak, hymna) a s pojmem vlast — čím je naše obec a naše země výjimečná.</w:t>
       </w:r>
     </w:p>
     <w:p>

</xml_diff>

<commit_message>
Rozšířit témata 42 a 43 podle druhé dávky nápadů kolegů
Téma 42 (Století extrémů) doplněno o prožitkovou aktivitu s dobovými
praktickými dovednostmi (praní, zašívání, ladění rádia) podle návrhu
„Krvavé století: jak žily naše prababičky". Téma 43 (Stát a my) doplněno
o aktivitu umožňující mimořádné zařazení projektu v čase skutečných voleb.
Přegenerováno index.html, Word i Excel.
</commit_message>
<xml_diff>
--- a/vystupy/Katalog_projektovych_temat.docx
+++ b/vystupy/Katalog_projektovych_temat.docx
@@ -18417,6 +18417,23 @@
     </w:p>
     <w:p>
       <w:pPr>
+        <w:pStyle w:val="ListParagraph"/>
+        <w:numPr>
+          <w:ilvl w:val="0"/>
+          <w:numId w:val="2"/>
+        </w:numPr>
+        <w:spacing w:after="40"/>
+      </w:pPr>
+      <w:r>
+        <w:rPr>
+          <w:b w:val="false"/>
+          <w:bCs w:val="false"/>
+        </w:rPr>
+        <w:t xml:space="preserve">Den jako prababička: praktické dovednosti všedního dne (praní v kolíbce, zašívání, ladění rádia, vaření z tehdejších surovin) jako zážitková sonda do doby</w:t>
+      </w:r>
+    </w:p>
+    <w:p>
+      <w:pPr>
         <w:spacing w:after="40" w:before="120"/>
       </w:pPr>
       <w:r>
@@ -18517,6 +18534,23 @@
     </w:p>
     <w:p>
       <w:pPr>
+        <w:pStyle w:val="ListParagraph"/>
+        <w:numPr>
+          <w:ilvl w:val="0"/>
+          <w:numId w:val="2"/>
+        </w:numPr>
+        <w:spacing w:after="40"/>
+      </w:pPr>
+      <w:r>
+        <w:rPr>
+          <w:b w:val="false"/>
+          <w:bCs w:val="false"/>
+        </w:rPr>
+        <w:t xml:space="preserve">Polytechnická výchova a praktické činnosti: běžné domácí práce dřívějška (praní, šití, drobné opravy) jako zážitková sonda do každodennosti minulosti</w:t>
+      </w:r>
+    </w:p>
+    <w:p>
+      <w:pPr>
         <w:spacing w:after="40" w:before="120"/>
       </w:pPr>
       <w:r>
@@ -18576,24 +18610,24 @@
           <w:b w:val="false"/>
           <w:bCs w:val="false"/>
         </w:rPr>
-        <w:t xml:space="preserve">1. trojročí: Citlivé seznámení přes rodinné příběhy a obrázky (jak žili prarodiče jako děti), bez traumatizujících detailů, důraz na to, že i tehdy lidé měli rodiny a přátele.</w:t>
-      </w:r>
-    </w:p>
-    <w:p>
-      <w:pPr>
-        <w:pStyle w:val="ListParagraph"/>
-        <w:numPr>
-          <w:ilvl w:val="0"/>
-          <w:numId w:val="2"/>
-        </w:numPr>
-        <w:spacing w:after="40"/>
-      </w:pPr>
-      <w:r>
-        <w:rPr>
-          <w:b w:val="false"/>
-          <w:bCs w:val="false"/>
-        </w:rPr>
-        <w:t xml:space="preserve">2. trojročí: Každodennost dětí ve 20. století (škola, hry, nedostatek), rodinné příběhy, citlivé dávkování těžkých témat.</w:t>
+        <w:t xml:space="preserve">1. trojročí: Citlivé seznámení přes rodinné příběhy a obrázky (jak žili prarodiče jako děti), bez traumatizujících detailů, důraz na to, že i tehdy lidé měli rodiny a přátele. Vyzkoušení jednoduché dobové všední činnosti (např. praní v kolíbce) jako hravý vhled do každodennosti.</w:t>
+      </w:r>
+    </w:p>
+    <w:p>
+      <w:pPr>
+        <w:pStyle w:val="ListParagraph"/>
+        <w:numPr>
+          <w:ilvl w:val="0"/>
+          <w:numId w:val="2"/>
+        </w:numPr>
+        <w:spacing w:after="40"/>
+      </w:pPr>
+      <w:r>
+        <w:rPr>
+          <w:b w:val="false"/>
+          <w:bCs w:val="false"/>
+        </w:rPr>
+        <w:t xml:space="preserve">2. trojročí: Každodennost dětí ve 20. století (škola, hry, nedostatek), rodinné příběhy, citlivé dávkování těžkých témat. Vyzkoušení dobových praktických dovedností (zašívání, ruční praní, ladění rádia).</w:t>
       </w:r>
     </w:p>
     <w:p>
@@ -23826,6 +23860,23 @@
           <w:bCs w:val="false"/>
         </w:rPr>
         <w:t xml:space="preserve">Vlajka, znak a hymna: co znamenají státní symboly a proč je máme; procházka obcí za pamětihodnostmi jako symboly domova</w:t>
+      </w:r>
+    </w:p>
+    <w:p>
+      <w:pPr>
+        <w:pStyle w:val="ListParagraph"/>
+        <w:numPr>
+          <w:ilvl w:val="0"/>
+          <w:numId w:val="2"/>
+        </w:numPr>
+        <w:spacing w:after="40"/>
+      </w:pPr>
+      <w:r>
+        <w:rPr>
+          <w:b w:val="false"/>
+          <w:bCs w:val="false"/>
+        </w:rPr>
+        <w:t xml:space="preserve">Mimořádné zařazení podle kalendáře: konají-li se skutečné volby (prezidentské, parlamentní, komunální), lze projekt zařadit i mimo plánovaný blok, aby ho děti zažily v reálném čase</w:t>
       </w:r>
     </w:p>
     <w:p>

</xml_diff>

<commit_message>
Nové téma 51 Čtení tě mění (SC1, jen 3. trojročí)
Podle návrhu kolegyně na čtenářské strategie a výběr knih. Omezeno na
3. trojročí — 1. a 2. trojročí už čtenářské strategie řeší v pravidelné
čtenářské dílně, takže samostatný projekt nepotřebují (stejný vzorec jako
u tématu 40 Právo pro život). Katalog má nyní 51 témat, README aktualizováno,
přegenerováno index.html, Word i Excel.
</commit_message>
<xml_diff>
--- a/vystupy/Katalog_projektovych_temat.docx
+++ b/vystupy/Katalog_projektovych_temat.docx
@@ -1078,21 +1078,6 @@
     </w:p>
     <w:p>
       <w:pPr>
-        <w:spacing w:after="60" w:before="160"/>
-      </w:pPr>
-      <w:r>
-        <w:rPr>
-          <w:b/>
-          <w:bCs/>
-          <w:color w:val="922B21"/>
-          <w:sz w:val="24"/>
-          <w:szCs w:val="24"/>
-        </w:rPr>
-        <w:t xml:space="preserve">ScioCíl 5: Buduji dobré vztahy</w:t>
-      </w:r>
-    </w:p>
-    <w:p>
-      <w:pPr>
         <w:spacing w:after="30"/>
         <w:ind w:left="300"/>
       </w:pPr>
@@ -1101,7 +1086,7 @@
           <w:sz w:val="21"/>
           <w:szCs w:val="21"/>
         </w:rPr>
-        <w:t xml:space="preserve">21. Komunikační laboratoř</w:t>
+        <w:t xml:space="preserve">51. Čtení tě mění</w:t>
       </w:r>
       <w:r>
         <w:rPr>
@@ -1111,7 +1096,7 @@
           <w:sz w:val="19"/>
           <w:szCs w:val="19"/>
         </w:rPr>
-        <w:t xml:space="preserve"/>
+        <w:t xml:space="preserve">  (jen 3. trojročí)</w:t>
       </w:r>
       <w:r>
         <w:rPr>
@@ -1119,7 +1104,22 @@
           <w:sz w:val="19"/>
           <w:szCs w:val="19"/>
         </w:rPr>
-        <w:t xml:space="preserve">  —  5.3.1.1, 5.3.1.2</w:t>
+        <w:t xml:space="preserve">  —  1.1.2.1</w:t>
+      </w:r>
+    </w:p>
+    <w:p>
+      <w:pPr>
+        <w:spacing w:after="60" w:before="160"/>
+      </w:pPr>
+      <w:r>
+        <w:rPr>
+          <w:b/>
+          <w:bCs/>
+          <w:color w:val="922B21"/>
+          <w:sz w:val="24"/>
+          <w:szCs w:val="24"/>
+        </w:rPr>
+        <w:t xml:space="preserve">ScioCíl 5: Buduji dobré vztahy</w:t>
       </w:r>
     </w:p>
     <w:p>
@@ -1132,7 +1132,7 @@
           <w:sz w:val="21"/>
           <w:szCs w:val="21"/>
         </w:rPr>
-        <w:t xml:space="preserve">22. Konflikt jako příležitost</w:t>
+        <w:t xml:space="preserve">21. Komunikační laboratoř</w:t>
       </w:r>
       <w:r>
         <w:rPr>
@@ -1150,7 +1150,7 @@
           <w:sz w:val="19"/>
           <w:szCs w:val="19"/>
         </w:rPr>
-        <w:t xml:space="preserve">  —  5.1.1.9</w:t>
+        <w:t xml:space="preserve">  —  5.3.1.1, 5.3.1.2</w:t>
       </w:r>
     </w:p>
     <w:p>
@@ -1163,7 +1163,7 @@
           <w:sz w:val="21"/>
           <w:szCs w:val="21"/>
         </w:rPr>
-        <w:t xml:space="preserve">23. Parta, tlak a odvaha vybočit</w:t>
+        <w:t xml:space="preserve">22. Konflikt jako příležitost</w:t>
       </w:r>
       <w:r>
         <w:rPr>
@@ -1181,7 +1181,7 @@
           <w:sz w:val="19"/>
           <w:szCs w:val="19"/>
         </w:rPr>
-        <w:t xml:space="preserve">  —  5.1.1.3, 5.1.1.4</w:t>
+        <w:t xml:space="preserve">  —  5.1.1.9</w:t>
       </w:r>
     </w:p>
     <w:p>
@@ -1194,7 +1194,7 @@
           <w:sz w:val="21"/>
           <w:szCs w:val="21"/>
         </w:rPr>
-        <w:t xml:space="preserve">24. Přátelství pod mikroskopem</w:t>
+        <w:t xml:space="preserve">23. Parta, tlak a odvaha vybočit</w:t>
       </w:r>
       <w:r>
         <w:rPr>
@@ -1212,7 +1212,7 @@
           <w:sz w:val="19"/>
           <w:szCs w:val="19"/>
         </w:rPr>
-        <w:t xml:space="preserve">  —  5.2.2.1, 5.2.2.2</w:t>
+        <w:t xml:space="preserve">  —  5.1.1.3, 5.1.1.4</w:t>
       </w:r>
     </w:p>
     <w:p>
@@ -1225,7 +1225,7 @@
           <w:sz w:val="21"/>
           <w:szCs w:val="21"/>
         </w:rPr>
-        <w:t xml:space="preserve">25. Moje kořeny</w:t>
+        <w:t xml:space="preserve">24. Přátelství pod mikroskopem</w:t>
       </w:r>
       <w:r>
         <w:rPr>
@@ -1243,7 +1243,7 @@
           <w:sz w:val="19"/>
           <w:szCs w:val="19"/>
         </w:rPr>
-        <w:t xml:space="preserve">  —  5.2.3.1</w:t>
+        <w:t xml:space="preserve">  —  5.2.2.1, 5.2.2.2</w:t>
       </w:r>
     </w:p>
     <w:p>
@@ -1256,7 +1256,7 @@
           <w:sz w:val="21"/>
           <w:szCs w:val="21"/>
         </w:rPr>
-        <w:t xml:space="preserve">26. Láska, vztahy a hranice</w:t>
+        <w:t xml:space="preserve">25. Moje kořeny</w:t>
       </w:r>
       <w:r>
         <w:rPr>
@@ -1274,7 +1274,7 @@
           <w:sz w:val="19"/>
           <w:szCs w:val="19"/>
         </w:rPr>
-        <w:t xml:space="preserve">  —  5.2.4.1, 5.2.4.2</w:t>
+        <w:t xml:space="preserve">  —  5.2.3.1</w:t>
       </w:r>
     </w:p>
     <w:p>
@@ -1287,7 +1287,7 @@
           <w:sz w:val="21"/>
           <w:szCs w:val="21"/>
         </w:rPr>
-        <w:t xml:space="preserve">27. Svět v nás: kulturní mozaika</w:t>
+        <w:t xml:space="preserve">26. Láska, vztahy a hranice</w:t>
       </w:r>
       <w:r>
         <w:rPr>
@@ -1305,7 +1305,7 @@
           <w:sz w:val="19"/>
           <w:szCs w:val="19"/>
         </w:rPr>
-        <w:t xml:space="preserve">  —  5.1.2.3</w:t>
+        <w:t xml:space="preserve">  —  5.2.4.1, 5.2.4.2</w:t>
       </w:r>
     </w:p>
     <w:p>
@@ -1318,7 +1318,7 @@
           <w:sz w:val="21"/>
           <w:szCs w:val="21"/>
         </w:rPr>
-        <w:t xml:space="preserve">28. Společenská akademie</w:t>
+        <w:t xml:space="preserve">27. Svět v nás: kulturní mozaika</w:t>
       </w:r>
       <w:r>
         <w:rPr>
@@ -1336,7 +1336,7 @@
           <w:sz w:val="19"/>
           <w:szCs w:val="19"/>
         </w:rPr>
-        <w:t xml:space="preserve">  —  5.1.2.1, 5.1.2.2</w:t>
+        <w:t xml:space="preserve">  —  5.1.2.3</w:t>
       </w:r>
     </w:p>
     <w:p>
@@ -1349,7 +1349,7 @@
           <w:sz w:val="21"/>
           <w:szCs w:val="21"/>
         </w:rPr>
-        <w:t xml:space="preserve">29. Domluvím se ve světě</w:t>
+        <w:t xml:space="preserve">28. Společenská akademie</w:t>
       </w:r>
       <w:r>
         <w:rPr>
@@ -1367,7 +1367,7 @@
           <w:sz w:val="19"/>
           <w:szCs w:val="19"/>
         </w:rPr>
-        <w:t xml:space="preserve">  —  5.3.3.1, 5.3.3.2</w:t>
+        <w:t xml:space="preserve">  —  5.1.2.1, 5.1.2.2</w:t>
       </w:r>
     </w:p>
     <w:p>
@@ -1380,7 +1380,7 @@
           <w:sz w:val="21"/>
           <w:szCs w:val="21"/>
         </w:rPr>
-        <w:t xml:space="preserve">30. Online já: vztahy za obrazovkou</w:t>
+        <w:t xml:space="preserve">29. Domluvím se ve světě</w:t>
       </w:r>
       <w:r>
         <w:rPr>
@@ -1398,7 +1398,7 @@
           <w:sz w:val="19"/>
           <w:szCs w:val="19"/>
         </w:rPr>
-        <w:t xml:space="preserve">  —  5.2.1.5</w:t>
+        <w:t xml:space="preserve">  —  5.3.3.1, 5.3.3.2</w:t>
       </w:r>
     </w:p>
     <w:p>
@@ -1411,7 +1411,7 @@
           <w:sz w:val="21"/>
           <w:szCs w:val="21"/>
         </w:rPr>
-        <w:t xml:space="preserve">42. Století extrémů: lidé ve 20. století</w:t>
+        <w:t xml:space="preserve">30. Online já: vztahy za obrazovkou</w:t>
       </w:r>
       <w:r>
         <w:rPr>
@@ -1429,7 +1429,7 @@
           <w:sz w:val="19"/>
           <w:szCs w:val="19"/>
         </w:rPr>
-        <w:t xml:space="preserve">  —  5.1.1.3</w:t>
+        <w:t xml:space="preserve">  —  5.2.1.5</w:t>
       </w:r>
     </w:p>
     <w:p>
@@ -1442,7 +1442,7 @@
           <w:sz w:val="21"/>
           <w:szCs w:val="21"/>
         </w:rPr>
-        <w:t xml:space="preserve">50. Mladí a staří: most mezi generacemi</w:t>
+        <w:t xml:space="preserve">42. Století extrémů: lidé ve 20. století</w:t>
       </w:r>
       <w:r>
         <w:rPr>
@@ -1460,22 +1460,7 @@
           <w:sz w:val="19"/>
           <w:szCs w:val="19"/>
         </w:rPr>
-        <w:t xml:space="preserve">  —  5.1.1.1</w:t>
-      </w:r>
-    </w:p>
-    <w:p>
-      <w:pPr>
-        <w:spacing w:after="60" w:before="160"/>
-      </w:pPr>
-      <w:r>
-        <w:rPr>
-          <w:b/>
-          <w:bCs/>
-          <w:color w:val="1E8449"/>
-          <w:sz w:val="24"/>
-          <w:szCs w:val="24"/>
-        </w:rPr>
-        <w:t xml:space="preserve">ScioCíl 8: Mám život ve svých rukou</w:t>
+        <w:t xml:space="preserve">  —  5.1.1.3</w:t>
       </w:r>
     </w:p>
     <w:p>
@@ -1488,7 +1473,7 @@
           <w:sz w:val="21"/>
           <w:szCs w:val="21"/>
         </w:rPr>
-        <w:t xml:space="preserve">31. Peníze v mých rukou</w:t>
+        <w:t xml:space="preserve">50. Mladí a staří: most mezi generacemi</w:t>
       </w:r>
       <w:r>
         <w:rPr>
@@ -1506,7 +1491,22 @@
           <w:sz w:val="19"/>
           <w:szCs w:val="19"/>
         </w:rPr>
-        <w:t xml:space="preserve">  —  8.2.2.1</w:t>
+        <w:t xml:space="preserve">  —  5.1.1.1</w:t>
+      </w:r>
+    </w:p>
+    <w:p>
+      <w:pPr>
+        <w:spacing w:after="60" w:before="160"/>
+      </w:pPr>
+      <w:r>
+        <w:rPr>
+          <w:b/>
+          <w:bCs/>
+          <w:color w:val="1E8449"/>
+          <w:sz w:val="24"/>
+          <w:szCs w:val="24"/>
+        </w:rPr>
+        <w:t xml:space="preserve">ScioCíl 8: Mám život ve svých rukou</w:t>
       </w:r>
     </w:p>
     <w:p>
@@ -1519,7 +1519,7 @@
           <w:sz w:val="21"/>
           <w:szCs w:val="21"/>
         </w:rPr>
-        <w:t xml:space="preserve">32. Startup: od nápadu k prodeji</w:t>
+        <w:t xml:space="preserve">31. Peníze v mých rukou</w:t>
       </w:r>
       <w:r>
         <w:rPr>
@@ -1537,7 +1537,7 @@
           <w:sz w:val="19"/>
           <w:szCs w:val="19"/>
         </w:rPr>
-        <w:t xml:space="preserve">  —  8.3.3.3</w:t>
+        <w:t xml:space="preserve">  —  8.2.2.1</w:t>
       </w:r>
     </w:p>
     <w:p>
@@ -1550,7 +1550,7 @@
           <w:sz w:val="21"/>
           <w:szCs w:val="21"/>
         </w:rPr>
-        <w:t xml:space="preserve">33. Kdo chci být? Svět povolání</w:t>
+        <w:t xml:space="preserve">32. Startup: od nápadu k prodeji</w:t>
       </w:r>
       <w:r>
         <w:rPr>
@@ -1568,7 +1568,7 @@
           <w:sz w:val="19"/>
           <w:szCs w:val="19"/>
         </w:rPr>
-        <w:t xml:space="preserve">  —  8.3.3.1, 8.3.2.1</w:t>
+        <w:t xml:space="preserve">  —  8.3.3.3</w:t>
       </w:r>
     </w:p>
     <w:p>
@@ -1581,7 +1581,7 @@
           <w:sz w:val="21"/>
           <w:szCs w:val="21"/>
         </w:rPr>
-        <w:t xml:space="preserve">34. Pán svého času</w:t>
+        <w:t xml:space="preserve">33. Kdo chci být? Svět povolání</w:t>
       </w:r>
       <w:r>
         <w:rPr>
@@ -1599,7 +1599,7 @@
           <w:sz w:val="19"/>
           <w:szCs w:val="19"/>
         </w:rPr>
-        <w:t xml:space="preserve">  —  8.3.1.1, 8.3.1.2</w:t>
+        <w:t xml:space="preserve">  —  8.3.3.1, 8.3.2.1</w:t>
       </w:r>
     </w:p>
     <w:p>
@@ -1612,7 +1612,7 @@
           <w:sz w:val="21"/>
           <w:szCs w:val="21"/>
         </w:rPr>
-        <w:t xml:space="preserve">35. Život na vlastní noze</w:t>
+        <w:t xml:space="preserve">34. Pán svého času</w:t>
       </w:r>
       <w:r>
         <w:rPr>
@@ -1630,7 +1630,7 @@
           <w:sz w:val="19"/>
           <w:szCs w:val="19"/>
         </w:rPr>
-        <w:t xml:space="preserve">  —  8.2.3.1, 8.2.3.2, 8.2.3.3</w:t>
+        <w:t xml:space="preserve">  —  8.3.1.1, 8.3.1.2</w:t>
       </w:r>
     </w:p>
     <w:p>
@@ -1643,7 +1643,7 @@
           <w:sz w:val="21"/>
           <w:szCs w:val="21"/>
         </w:rPr>
-        <w:t xml:space="preserve">36. Nouzový režim: když jde do tuhého</w:t>
+        <w:t xml:space="preserve">35. Život na vlastní noze</w:t>
       </w:r>
       <w:r>
         <w:rPr>
@@ -1661,7 +1661,7 @@
           <w:sz w:val="19"/>
           <w:szCs w:val="19"/>
         </w:rPr>
-        <w:t xml:space="preserve">  —  8.2.6.1, 8.2.6.3</w:t>
+        <w:t xml:space="preserve">  —  8.2.3.1, 8.2.3.2, 8.2.3.3</w:t>
       </w:r>
     </w:p>
     <w:p>
@@ -1674,7 +1674,7 @@
           <w:sz w:val="21"/>
           <w:szCs w:val="21"/>
         </w:rPr>
-        <w:t xml:space="preserve">37. Zachraň život</w:t>
+        <w:t xml:space="preserve">36. Nouzový režim: když jde do tuhého</w:t>
       </w:r>
       <w:r>
         <w:rPr>
@@ -1692,7 +1692,7 @@
           <w:sz w:val="19"/>
           <w:szCs w:val="19"/>
         </w:rPr>
-        <w:t xml:space="preserve">  —  8.2.6.4</w:t>
+        <w:t xml:space="preserve">  —  8.2.6.1, 8.2.6.3</w:t>
       </w:r>
     </w:p>
     <w:p>
@@ -1705,7 +1705,7 @@
           <w:sz w:val="21"/>
           <w:szCs w:val="21"/>
         </w:rPr>
-        <w:t xml:space="preserve">38. Vyrobeno vlastníma rukama</w:t>
+        <w:t xml:space="preserve">37. Zachraň život</w:t>
       </w:r>
       <w:r>
         <w:rPr>
@@ -1723,7 +1723,7 @@
           <w:sz w:val="19"/>
           <w:szCs w:val="19"/>
         </w:rPr>
-        <w:t xml:space="preserve">  —  8.2.5.1, 8.2.5.2</w:t>
+        <w:t xml:space="preserve">  —  8.2.6.4</w:t>
       </w:r>
     </w:p>
     <w:p>
@@ -1736,7 +1736,7 @@
           <w:sz w:val="21"/>
           <w:szCs w:val="21"/>
         </w:rPr>
-        <w:t xml:space="preserve">39. Zelená farma</w:t>
+        <w:t xml:space="preserve">38. Vyrobeno vlastníma rukama</w:t>
       </w:r>
       <w:r>
         <w:rPr>
@@ -1754,7 +1754,7 @@
           <w:sz w:val="19"/>
           <w:szCs w:val="19"/>
         </w:rPr>
-        <w:t xml:space="preserve">  —  8.2.5.3</w:t>
+        <w:t xml:space="preserve">  —  8.2.5.1, 8.2.5.2</w:t>
       </w:r>
     </w:p>
     <w:p>
@@ -1767,7 +1767,7 @@
           <w:sz w:val="21"/>
           <w:szCs w:val="21"/>
         </w:rPr>
-        <w:t xml:space="preserve">40. Právo pro život</w:t>
+        <w:t xml:space="preserve">39. Zelená farma</w:t>
       </w:r>
       <w:r>
         <w:rPr>
@@ -1777,7 +1777,7 @@
           <w:sz w:val="19"/>
           <w:szCs w:val="19"/>
         </w:rPr>
-        <w:t xml:space="preserve">  (jen 3. trojročí)</w:t>
+        <w:t xml:space="preserve"/>
       </w:r>
       <w:r>
         <w:rPr>
@@ -1785,7 +1785,7 @@
           <w:sz w:val="19"/>
           <w:szCs w:val="19"/>
         </w:rPr>
-        <w:t xml:space="preserve">  —  8.2.7.1</w:t>
+        <w:t xml:space="preserve">  —  8.2.5.3</w:t>
       </w:r>
     </w:p>
     <w:p>
@@ -1798,7 +1798,7 @@
           <w:sz w:val="21"/>
           <w:szCs w:val="21"/>
         </w:rPr>
-        <w:t xml:space="preserve">43. Stát a my: kdo tu vlastně vládne</w:t>
+        <w:t xml:space="preserve">40. Právo pro život</w:t>
       </w:r>
       <w:r>
         <w:rPr>
@@ -1808,7 +1808,7 @@
           <w:sz w:val="19"/>
           <w:szCs w:val="19"/>
         </w:rPr>
-        <w:t xml:space="preserve"/>
+        <w:t xml:space="preserve">  (jen 3. trojročí)</w:t>
       </w:r>
       <w:r>
         <w:rPr>
@@ -1829,7 +1829,7 @@
           <w:sz w:val="21"/>
           <w:szCs w:val="21"/>
         </w:rPr>
-        <w:t xml:space="preserve">46. Technologie pod pokličkou</w:t>
+        <w:t xml:space="preserve">43. Stát a my: kdo tu vlastně vládne</w:t>
       </w:r>
       <w:r>
         <w:rPr>
@@ -1847,7 +1847,7 @@
           <w:sz w:val="19"/>
           <w:szCs w:val="19"/>
         </w:rPr>
-        <w:t xml:space="preserve">  —  8.2.4.1</w:t>
+        <w:t xml:space="preserve">  —  8.2.7.1</w:t>
       </w:r>
     </w:p>
     <w:p>
@@ -1860,7 +1860,7 @@
           <w:sz w:val="21"/>
           <w:szCs w:val="21"/>
         </w:rPr>
-        <w:t xml:space="preserve">47. Elektřina: od blesku k zásuvce</w:t>
+        <w:t xml:space="preserve">46. Technologie pod pokličkou</w:t>
       </w:r>
       <w:r>
         <w:rPr>
@@ -1878,6 +1878,37 @@
           <w:sz w:val="19"/>
           <w:szCs w:val="19"/>
         </w:rPr>
+        <w:t xml:space="preserve">  —  8.2.4.1</w:t>
+      </w:r>
+    </w:p>
+    <w:p>
+      <w:pPr>
+        <w:spacing w:after="30"/>
+        <w:ind w:left="300"/>
+      </w:pPr>
+      <w:r>
+        <w:rPr>
+          <w:sz w:val="21"/>
+          <w:szCs w:val="21"/>
+        </w:rPr>
+        <w:t xml:space="preserve">47. Elektřina: od blesku k zásuvce</w:t>
+      </w:r>
+      <w:r>
+        <w:rPr>
+          <w:i/>
+          <w:iCs/>
+          <w:color w:val="888888"/>
+          <w:sz w:val="19"/>
+          <w:szCs w:val="19"/>
+        </w:rPr>
+        <w:t xml:space="preserve"/>
+      </w:r>
+      <w:r>
+        <w:rPr>
+          <w:color w:val="666666"/>
+          <w:sz w:val="19"/>
+          <w:szCs w:val="19"/>
+        </w:rPr>
         <w:t xml:space="preserve">  —  8.2.5.1</w:t>
       </w:r>
     </w:p>
@@ -13904,6 +13935,408 @@
           <w:color w:val="555555"/>
         </w:rPr>
         <w:t xml:space="preserve">Dobývání vesmíru</w:t>
+      </w:r>
+    </w:p>
+    <w:p>
+      <w:pPr>
+        <w:pBdr>
+          <w:bottom w:val="single" w:color="CCCCCC" w:sz="4"/>
+        </w:pBdr>
+        <w:spacing w:after="240"/>
+      </w:pPr>
+    </w:p>
+    <w:p>
+      <w:pPr>
+        <w:pStyle w:val="Heading2"/>
+      </w:pPr>
+      <w:r>
+        <w:t xml:space="preserve">51. Čtení tě mění</w:t>
+      </w:r>
+    </w:p>
+    <w:p>
+      <w:pPr>
+        <w:shd w:fill="F4F4F4" w:val="clear"/>
+        <w:spacing w:after="120"/>
+      </w:pPr>
+      <w:r>
+        <w:rPr>
+          <w:b/>
+          <w:bCs/>
+          <w:color w:val="1F618D"/>
+          <w:sz w:val="20"/>
+          <w:szCs w:val="20"/>
+        </w:rPr>
+        <w:t xml:space="preserve">primárně 3. trojročí</w:t>
+      </w:r>
+    </w:p>
+    <w:p>
+      <w:pPr>
+        <w:spacing w:after="120"/>
+      </w:pPr>
+      <w:r>
+        <w:t xml:space="preserve">Kniha, která k tobě promluví, dokáže změnit, jak myslíš a jak žiješ. Projekt je čtenářskou dílnou: děti se učí vybírat si knihy podle sebe, zkoušejí různé čtenářské strategie (předvídání, vizualizace, spojování s vlastním životem) a hledají v příbězích postavy a situace, které jim pomáhají porozumět vlastnímu životu. Čtení tu není povinnost, ale nástroj poznání sebe i světa.</w:t>
+      </w:r>
+    </w:p>
+    <w:p>
+      <w:pPr>
+        <w:spacing w:after="40" w:before="120"/>
+      </w:pPr>
+      <w:r>
+        <w:rPr>
+          <w:b/>
+          <w:bCs/>
+          <w:color w:val="444444"/>
+          <w:sz w:val="20"/>
+          <w:szCs w:val="20"/>
+        </w:rPr>
+        <w:t xml:space="preserve">Stěžejní kameny</w:t>
+      </w:r>
+    </w:p>
+    <w:p>
+      <w:pPr>
+        <w:pStyle w:val="ListParagraph"/>
+        <w:numPr>
+          <w:ilvl w:val="0"/>
+          <w:numId w:val="2"/>
+        </w:numPr>
+        <w:spacing w:after="40"/>
+      </w:pPr>
+      <w:r>
+        <w:rPr>
+          <w:b/>
+          <w:bCs/>
+        </w:rPr>
+        <w:t xml:space="preserve">1.1.2.1 Čtu a naslouchám</w:t>
+      </w:r>
+    </w:p>
+    <w:p>
+      <w:pPr>
+        <w:spacing w:after="40" w:before="120"/>
+      </w:pPr>
+      <w:r>
+        <w:rPr>
+          <w:b/>
+          <w:bCs/>
+          <w:color w:val="444444"/>
+          <w:sz w:val="20"/>
+          <w:szCs w:val="20"/>
+        </w:rPr>
+        <w:t xml:space="preserve">Vedlejší kameny</w:t>
+      </w:r>
+    </w:p>
+    <w:p>
+      <w:pPr>
+        <w:pStyle w:val="ListParagraph"/>
+        <w:numPr>
+          <w:ilvl w:val="0"/>
+          <w:numId w:val="2"/>
+        </w:numPr>
+        <w:spacing w:after="40"/>
+      </w:pPr>
+      <w:r>
+        <w:rPr>
+          <w:b w:val="false"/>
+          <w:bCs w:val="false"/>
+        </w:rPr>
+        <w:t xml:space="preserve">1.1.1.2 Vyhledám relevantní zdroj učení</w:t>
+      </w:r>
+    </w:p>
+    <w:p>
+      <w:pPr>
+        <w:pStyle w:val="ListParagraph"/>
+        <w:numPr>
+          <w:ilvl w:val="0"/>
+          <w:numId w:val="2"/>
+        </w:numPr>
+        <w:spacing w:after="40"/>
+      </w:pPr>
+      <w:r>
+        <w:rPr>
+          <w:b w:val="false"/>
+          <w:bCs w:val="false"/>
+        </w:rPr>
+        <w:t xml:space="preserve">1.2.4.4 Přetavuji prožitky ve zkušenosti</w:t>
+      </w:r>
+    </w:p>
+    <w:p>
+      <w:pPr>
+        <w:pStyle w:val="ListParagraph"/>
+        <w:numPr>
+          <w:ilvl w:val="0"/>
+          <w:numId w:val="2"/>
+        </w:numPr>
+        <w:spacing w:after="40"/>
+      </w:pPr>
+      <w:r>
+        <w:rPr>
+          <w:b w:val="false"/>
+          <w:bCs w:val="false"/>
+        </w:rPr>
+        <w:t xml:space="preserve">1.1.2.9 Učím se skrze umění</w:t>
+      </w:r>
+    </w:p>
+    <w:p>
+      <w:pPr>
+        <w:pStyle w:val="ListParagraph"/>
+        <w:numPr>
+          <w:ilvl w:val="0"/>
+          <w:numId w:val="2"/>
+        </w:numPr>
+        <w:spacing w:after="40"/>
+      </w:pPr>
+      <w:r>
+        <w:rPr>
+          <w:b w:val="false"/>
+          <w:bCs w:val="false"/>
+        </w:rPr>
+        <w:t xml:space="preserve">5.3.1.3 Vyjadřuji se písemně</w:t>
+      </w:r>
+    </w:p>
+    <w:p>
+      <w:pPr>
+        <w:spacing w:after="40" w:before="120"/>
+      </w:pPr>
+      <w:r>
+        <w:rPr>
+          <w:b/>
+          <w:bCs/>
+          <w:color w:val="444444"/>
+          <w:sz w:val="20"/>
+          <w:szCs w:val="20"/>
+        </w:rPr>
+        <w:t xml:space="preserve">Náměty aktivit</w:t>
+      </w:r>
+    </w:p>
+    <w:p>
+      <w:pPr>
+        <w:pStyle w:val="ListParagraph"/>
+        <w:numPr>
+          <w:ilvl w:val="0"/>
+          <w:numId w:val="2"/>
+        </w:numPr>
+        <w:spacing w:after="40"/>
+      </w:pPr>
+      <w:r>
+        <w:rPr>
+          <w:b w:val="false"/>
+          <w:bCs w:val="false"/>
+        </w:rPr>
+        <w:t xml:space="preserve">Čtenářský profil: jaký jsem typ čtenáře — žánry, tempo, kde a kdy se mi čte nejlépe; sestavení osobního čtenářského plánu</w:t>
+      </w:r>
+    </w:p>
+    <w:p>
+      <w:pPr>
+        <w:pStyle w:val="ListParagraph"/>
+        <w:numPr>
+          <w:ilvl w:val="0"/>
+          <w:numId w:val="2"/>
+        </w:numPr>
+        <w:spacing w:after="40"/>
+      </w:pPr>
+      <w:r>
+        <w:rPr>
+          <w:b w:val="false"/>
+          <w:bCs w:val="false"/>
+        </w:rPr>
+        <w:t xml:space="preserve">Jak si vybrat knihu: práce s anotací, obálkou, prvními stránkami; pravidlo „5 stran“ a odvaha knihu odložit</w:t>
+      </w:r>
+    </w:p>
+    <w:p>
+      <w:pPr>
+        <w:pStyle w:val="ListParagraph"/>
+        <w:numPr>
+          <w:ilvl w:val="0"/>
+          <w:numId w:val="2"/>
+        </w:numPr>
+        <w:spacing w:after="40"/>
+      </w:pPr>
+      <w:r>
+        <w:rPr>
+          <w:b w:val="false"/>
+          <w:bCs w:val="false"/>
+        </w:rPr>
+        <w:t xml:space="preserve">Čtenářské strategie v praxi: předvídání, vizualizace, propojování s vlastním životem, hlasité přemýšlení nad textem</w:t>
+      </w:r>
+    </w:p>
+    <w:p>
+      <w:pPr>
+        <w:pStyle w:val="ListParagraph"/>
+        <w:numPr>
+          <w:ilvl w:val="0"/>
+          <w:numId w:val="2"/>
+        </w:numPr>
+        <w:spacing w:after="40"/>
+      </w:pPr>
+      <w:r>
+        <w:rPr>
+          <w:b w:val="false"/>
+          <w:bCs w:val="false"/>
+        </w:rPr>
+        <w:t xml:space="preserve">Kniha, která mě něco naučila: hledání postav a situací podobných vlastnímu životu a co si z nich vzít</w:t>
+      </w:r>
+    </w:p>
+    <w:p>
+      <w:pPr>
+        <w:pStyle w:val="ListParagraph"/>
+        <w:numPr>
+          <w:ilvl w:val="0"/>
+          <w:numId w:val="2"/>
+        </w:numPr>
+        <w:spacing w:after="40"/>
+      </w:pPr>
+      <w:r>
+        <w:rPr>
+          <w:b w:val="false"/>
+          <w:bCs w:val="false"/>
+        </w:rPr>
+        <w:t xml:space="preserve">Čtenářský klub: doporučování knih spolužákům, diskuse nad přečteným, návštěva knihovny nebo autorské čtení</w:t>
+      </w:r>
+    </w:p>
+    <w:p>
+      <w:pPr>
+        <w:spacing w:after="40" w:before="120"/>
+      </w:pPr>
+      <w:r>
+        <w:rPr>
+          <w:b/>
+          <w:bCs/>
+          <w:color w:val="444444"/>
+          <w:sz w:val="20"/>
+          <w:szCs w:val="20"/>
+        </w:rPr>
+        <w:t xml:space="preserve">Tvrdé znalosti — příklady učiva</w:t>
+      </w:r>
+    </w:p>
+    <w:p>
+      <w:pPr>
+        <w:pStyle w:val="ListParagraph"/>
+        <w:numPr>
+          <w:ilvl w:val="0"/>
+          <w:numId w:val="2"/>
+        </w:numPr>
+        <w:spacing w:after="40"/>
+      </w:pPr>
+      <w:r>
+        <w:rPr>
+          <w:b w:val="false"/>
+          <w:bCs w:val="false"/>
+        </w:rPr>
+        <w:t xml:space="preserve">metakognice čtení, kritické čtenářství</w:t>
+      </w:r>
+    </w:p>
+    <w:p>
+      <w:pPr>
+        <w:pStyle w:val="ListParagraph"/>
+        <w:numPr>
+          <w:ilvl w:val="0"/>
+          <w:numId w:val="2"/>
+        </w:numPr>
+        <w:spacing w:after="40"/>
+      </w:pPr>
+      <w:r>
+        <w:rPr>
+          <w:b w:val="false"/>
+          <w:bCs w:val="false"/>
+        </w:rPr>
+        <w:t xml:space="preserve">Český jazyk a literatura: čtenářské strategie, tvořivá práce s literárním textem, reflexe zážitku z četby</w:t>
+      </w:r>
+    </w:p>
+    <w:p>
+      <w:pPr>
+        <w:pStyle w:val="ListParagraph"/>
+        <w:numPr>
+          <w:ilvl w:val="0"/>
+          <w:numId w:val="2"/>
+        </w:numPr>
+        <w:spacing w:after="40"/>
+      </w:pPr>
+      <w:r>
+        <w:rPr>
+          <w:b w:val="false"/>
+          <w:bCs w:val="false"/>
+        </w:rPr>
+        <w:t xml:space="preserve">Osobnostní a sociální výchova: hledání vzorů a etických otázek v literatuře</w:t>
+      </w:r>
+    </w:p>
+    <w:p>
+      <w:pPr>
+        <w:spacing w:after="40" w:before="120"/>
+      </w:pPr>
+      <w:r>
+        <w:rPr>
+          <w:b/>
+          <w:bCs/>
+          <w:color w:val="444444"/>
+          <w:sz w:val="20"/>
+          <w:szCs w:val="20"/>
+        </w:rPr>
+        <w:t xml:space="preserve">Z didaktiky ScioCíle</w:t>
+      </w:r>
+    </w:p>
+    <w:p>
+      <w:pPr>
+        <w:pStyle w:val="ListParagraph"/>
+        <w:numPr>
+          <w:ilvl w:val="0"/>
+          <w:numId w:val="2"/>
+        </w:numPr>
+        <w:spacing w:after="40"/>
+      </w:pPr>
+      <w:r>
+        <w:rPr>
+          <w:b w:val="false"/>
+          <w:bCs w:val="false"/>
+        </w:rPr>
+        <w:t xml:space="preserve">čtenářský deník a hlasité přemýšlení nad textem jsou účinnější než test na porozumění; volba knihy musí zůstat na dítěti, jinak čtenářství nevznikne.</w:t>
+      </w:r>
+    </w:p>
+    <w:p>
+      <w:pPr>
+        <w:spacing w:after="40" w:before="120"/>
+      </w:pPr>
+      <w:r>
+        <w:rPr>
+          <w:b/>
+          <w:bCs/>
+          <w:color w:val="444444"/>
+          <w:sz w:val="20"/>
+          <w:szCs w:val="20"/>
+        </w:rPr>
+        <w:t xml:space="preserve">Diferenciace</w:t>
+      </w:r>
+    </w:p>
+    <w:p>
+      <w:pPr>
+        <w:pStyle w:val="ListParagraph"/>
+        <w:numPr>
+          <w:ilvl w:val="0"/>
+          <w:numId w:val="2"/>
+        </w:numPr>
+        <w:spacing w:after="40"/>
+      </w:pPr>
+      <w:r>
+        <w:rPr>
+          <w:b w:val="false"/>
+          <w:bCs w:val="false"/>
+        </w:rPr>
+        <w:t xml:space="preserve">1. trojročí: Téma je určeno pouze pro 3. trojročí — mladší děti rozvíjejí čtenářské strategie v pravidelné čtenářské dílně, samostatný projekt proto nemají.</w:t>
+      </w:r>
+    </w:p>
+    <w:p>
+      <w:pPr>
+        <w:pStyle w:val="ListParagraph"/>
+        <w:numPr>
+          <w:ilvl w:val="0"/>
+          <w:numId w:val="2"/>
+        </w:numPr>
+        <w:spacing w:after="40"/>
+      </w:pPr>
+      <w:r>
+        <w:rPr>
+          <w:b w:val="false"/>
+          <w:bCs w:val="false"/>
+        </w:rPr>
+        <w:t xml:space="preserve">3. trojročí: Vědomé čtenářské strategie a metakognice čtení, kritický výběr a odkládání knih, reflexe vlastního života přes literární postavy a situace.</w:t>
       </w:r>
     </w:p>
     <w:p>

</xml_diff>

<commit_message>
Krev do tématu 9, IZS do tématu 36, nové téma 52 Bushcraft
Třetí dávka nápadů od kolegů:
- téma 9 Doktor v nás: nová aktivita „Krev pod lupou" (oběh, krevní skupiny,
  dárcovství krve a plazmy), transfuzní stanice doplněna do exkurzí,
  doplněny všechny tři diferenciace
- téma 36 Nouzový režim: nová aktivita o složkách IZS, návštěvě policejní
  stanice a aplikaci Záchranka; doplněny diferenciace
- nové téma 52 Bushcraft: doma v přírodě (SC8, vedoucí kameny 8.2.6.2
  a 4.2.1.4, dosud nevyužité) — dovednosti pobytu venku odděleně od tématu 7
  Expedice, které je o výpravě, ne o dovednostech
- podklady/odlozene_napady.md: zdůvodnění odložení tématu o letectví
  (kámen o principiálních poznatcích je v návrhu SC2 zatím bez umístění)

Katalog má nyní 52 témat, README aktualizováno, přegenerován web, Word i Excel.
</commit_message>
<xml_diff>
--- a/vystupy/Katalog_projektovych_temat.docx
+++ b/vystupy/Katalog_projektovych_temat.docx
@@ -1913,6 +1913,37 @@
       </w:r>
     </w:p>
     <w:p>
+      <w:pPr>
+        <w:spacing w:after="30"/>
+        <w:ind w:left="300"/>
+      </w:pPr>
+      <w:r>
+        <w:rPr>
+          <w:sz w:val="21"/>
+          <w:szCs w:val="21"/>
+        </w:rPr>
+        <w:t xml:space="preserve">52. Bushcraft: doma v přírodě</w:t>
+      </w:r>
+      <w:r>
+        <w:rPr>
+          <w:i/>
+          <w:iCs/>
+          <w:color w:val="888888"/>
+          <w:sz w:val="19"/>
+          <w:szCs w:val="19"/>
+        </w:rPr>
+        <w:t xml:space="preserve"/>
+      </w:r>
+      <w:r>
+        <w:rPr>
+          <w:color w:val="666666"/>
+          <w:sz w:val="19"/>
+          <w:szCs w:val="19"/>
+        </w:rPr>
+        <w:t xml:space="preserve">  —  8.2.6.2, 4.2.1.4</w:t>
+      </w:r>
+    </w:p>
+    <w:p>
       <w:r>
         <w:br w:type="page"/>
       </w:r>
@@ -5928,7 +5959,7 @@
           <w:b w:val="false"/>
           <w:bCs w:val="false"/>
         </w:rPr>
-        <w:t xml:space="preserve">Exkurze do nemocnice, lékárny či záchranné stanice, beseda se zdravotníkem</w:t>
+        <w:t xml:space="preserve">Exkurze do nemocnice, lékárny, transfuzní stanice či záchranné stanice, beseda se zdravotníkem</w:t>
       </w:r>
     </w:p>
     <w:p>
@@ -5950,6 +5981,23 @@
     </w:p>
     <w:p>
       <w:pPr>
+        <w:pStyle w:val="ListParagraph"/>
+        <w:numPr>
+          <w:ilvl w:val="0"/>
+          <w:numId w:val="2"/>
+        </w:numPr>
+        <w:spacing w:after="40"/>
+      </w:pPr>
+      <w:r>
+        <w:rPr>
+          <w:b w:val="false"/>
+          <w:bCs w:val="false"/>
+        </w:rPr>
+        <w:t xml:space="preserve">Krev pod lupou: krevní oběh a srdce, složení krve, krevní skupiny a příběh jejich objevu; dárcovství krve a plazmy — proč lidé darují a komu to pomůže</w:t>
+      </w:r>
+    </w:p>
+    <w:p>
+      <w:pPr>
         <w:spacing w:after="40" w:before="120"/>
       </w:pPr>
       <w:r>
@@ -6050,6 +6098,23 @@
     </w:p>
     <w:p>
       <w:pPr>
+        <w:pStyle w:val="ListParagraph"/>
+        <w:numPr>
+          <w:ilvl w:val="0"/>
+          <w:numId w:val="2"/>
+        </w:numPr>
+        <w:spacing w:after="40"/>
+      </w:pPr>
+      <w:r>
+        <w:rPr>
+          <w:b w:val="false"/>
+          <w:bCs w:val="false"/>
+        </w:rPr>
+        <w:t xml:space="preserve">Přírodopis: oběhová soustava — srdce, cévy, složení krve; krevní skupiny a transfuze</w:t>
+      </w:r>
+    </w:p>
+    <w:p>
+      <w:pPr>
         <w:spacing w:after="40" w:before="120"/>
       </w:pPr>
       <w:r>
@@ -6077,41 +6142,41 @@
           <w:b w:val="false"/>
           <w:bCs w:val="false"/>
         </w:rPr>
-        <w:t xml:space="preserve">1. trojročí: Základní hygiena a péče o tělo formou her, rozpoznání „necítím se dobře“ a řeknu to dospělému, bezpečná návštěva lékaře nanečisto.</w:t>
-      </w:r>
-    </w:p>
-    <w:p>
-      <w:pPr>
-        <w:pStyle w:val="ListParagraph"/>
-        <w:numPr>
-          <w:ilvl w:val="0"/>
-          <w:numId w:val="2"/>
-        </w:numPr>
-        <w:spacing w:after="40"/>
-      </w:pPr>
-      <w:r>
-        <w:rPr>
-          <w:b w:val="false"/>
-          <w:bCs w:val="false"/>
-        </w:rPr>
-        <w:t xml:space="preserve">2. trojročí: Základy: hygiena, prevence, běžné dětské nemoci, beze strachu k lékaři.</w:t>
-      </w:r>
-    </w:p>
-    <w:p>
-      <w:pPr>
-        <w:pStyle w:val="ListParagraph"/>
-        <w:numPr>
-          <w:ilvl w:val="0"/>
-          <w:numId w:val="2"/>
-        </w:numPr>
-        <w:spacing w:after="40"/>
-      </w:pPr>
-      <w:r>
-        <w:rPr>
-          <w:b w:val="false"/>
-          <w:bCs w:val="false"/>
-        </w:rPr>
-        <w:t xml:space="preserve">3. trojročí: Imunitní systém do hloubky, antibiotická rezistence, duševní vs. tělesné nemoci, samostatná navigace zdravotnictvím (registrace, e-recept).</w:t>
+        <w:t xml:space="preserve">1. trojročí: Základní hygiena a péče o tělo formou her, rozpoznání „necítím se dobře“ a řeknu to dospělému, bezpečná návštěva lékaře nanečisto. Povídání o tom, co je krev a proč teče z odřeniny — beze strachu.</w:t>
+      </w:r>
+    </w:p>
+    <w:p>
+      <w:pPr>
+        <w:pStyle w:val="ListParagraph"/>
+        <w:numPr>
+          <w:ilvl w:val="0"/>
+          <w:numId w:val="2"/>
+        </w:numPr>
+        <w:spacing w:after="40"/>
+      </w:pPr>
+      <w:r>
+        <w:rPr>
+          <w:b w:val="false"/>
+          <w:bCs w:val="false"/>
+        </w:rPr>
+        <w:t xml:space="preserve">2. trojročí: Základy: hygiena, prevence, běžné dětské nemoci, beze strachu k lékaři. Krevní oběh a srdce: co krev v těle dělá a kudy putuje.</w:t>
+      </w:r>
+    </w:p>
+    <w:p>
+      <w:pPr>
+        <w:pStyle w:val="ListParagraph"/>
+        <w:numPr>
+          <w:ilvl w:val="0"/>
+          <w:numId w:val="2"/>
+        </w:numPr>
+        <w:spacing w:after="40"/>
+      </w:pPr>
+      <w:r>
+        <w:rPr>
+          <w:b w:val="false"/>
+          <w:bCs w:val="false"/>
+        </w:rPr>
+        <w:t xml:space="preserve">3. trojročí: Imunitní systém do hloubky, antibiotická rezistence, duševní vs. tělesné nemoci, samostatná navigace zdravotnictvím (registrace, e-recept). Krevní skupiny a transfuze, dárcovství krve a plazmy jako podoba občanské solidarity.</w:t>
       </w:r>
     </w:p>
     <w:p>
@@ -22097,6 +22162,23 @@
     </w:p>
     <w:p>
       <w:pPr>
+        <w:pStyle w:val="ListParagraph"/>
+        <w:numPr>
+          <w:ilvl w:val="0"/>
+          <w:numId w:val="2"/>
+        </w:numPr>
+        <w:spacing w:after="40"/>
+      </w:pPr>
+      <w:r>
+        <w:rPr>
+          <w:b w:val="false"/>
+          <w:bCs w:val="false"/>
+        </w:rPr>
+        <w:t xml:space="preserve">Kdo mi přijede na pomoc: složky integrovaného záchranného systému (hasiči, policie, zdravotnická záchranná služba) a kdo řeší co; návštěva policejní stanice, aplikace Záchranka v mobilu</w:t>
+      </w:r>
+    </w:p>
+    <w:p>
+      <w:pPr>
         <w:spacing w:after="40" w:before="120"/>
       </w:pPr>
       <w:r>
@@ -22197,6 +22279,23 @@
     </w:p>
     <w:p>
       <w:pPr>
+        <w:pStyle w:val="ListParagraph"/>
+        <w:numPr>
+          <w:ilvl w:val="0"/>
+          <w:numId w:val="2"/>
+        </w:numPr>
+        <w:spacing w:after="40"/>
+      </w:pPr>
+      <w:r>
+        <w:rPr>
+          <w:b w:val="false"/>
+          <w:bCs w:val="false"/>
+        </w:rPr>
+        <w:t xml:space="preserve">Výchova k občanství: integrovaný záchranný systém — složky, jejich úkoly a spolupráce</w:t>
+      </w:r>
+    </w:p>
+    <w:p>
+      <w:pPr>
         <w:spacing w:after="40" w:before="120"/>
       </w:pPr>
       <w:r>
@@ -22224,41 +22323,41 @@
           <w:b w:val="false"/>
           <w:bCs w:val="false"/>
         </w:rPr>
-        <w:t xml:space="preserve">1. trojročí: Důležitá telefonní čísla a přivolání dospělého, chování při požárním poplachu, bezpečný pohyb venku, jednoduché tábornické dovednosti s dospělým.</w:t>
-      </w:r>
-    </w:p>
-    <w:p>
-      <w:pPr>
-        <w:pStyle w:val="ListParagraph"/>
-        <w:numPr>
-          <w:ilvl w:val="0"/>
-          <w:numId w:val="2"/>
-        </w:numPr>
-        <w:spacing w:after="40"/>
-      </w:pPr>
-      <w:r>
-        <w:rPr>
-          <w:b w:val="false"/>
-          <w:bCs w:val="false"/>
-        </w:rPr>
-        <w:t xml:space="preserve">2. trojročí: Základy: důležitá čísla, přivolání pomoci, chování při požáru, bezpečný pohyb venku, jednoduché tábornické dovednosti.</w:t>
-      </w:r>
-    </w:p>
-    <w:p>
-      <w:pPr>
-        <w:pStyle w:val="ListParagraph"/>
-        <w:numPr>
-          <w:ilvl w:val="0"/>
-          <w:numId w:val="2"/>
-        </w:numPr>
-        <w:spacing w:after="40"/>
-      </w:pPr>
-      <w:r>
-        <w:rPr>
-          <w:b w:val="false"/>
-          <w:bCs w:val="false"/>
-        </w:rPr>
-        <w:t xml:space="preserve">3. trojročí: Analýza rizik, krizové scénáře a jejich vedení, příprava rodiny na výpadky, dezinformace v krizích.</w:t>
+        <w:t xml:space="preserve">1. trojročí: Důležitá telefonní čísla a přivolání dospělého, chování při požárním poplachu, bezpečný pohyb venku, jednoduché tábornické dovednosti s dospělým. Poznávání záchranářů a jejich práce (hasič, policista, sanitka) — kdo mi pomůže a jak ho poznám.</w:t>
+      </w:r>
+    </w:p>
+    <w:p>
+      <w:pPr>
+        <w:pStyle w:val="ListParagraph"/>
+        <w:numPr>
+          <w:ilvl w:val="0"/>
+          <w:numId w:val="2"/>
+        </w:numPr>
+        <w:spacing w:after="40"/>
+      </w:pPr>
+      <w:r>
+        <w:rPr>
+          <w:b w:val="false"/>
+          <w:bCs w:val="false"/>
+        </w:rPr>
+        <w:t xml:space="preserve">2. trojročí: Základy: důležitá čísla, přivolání pomoci, chování při požáru, bezpečný pohyb venku, jednoduché tábornické dovednosti. Složky IZS a kdo řeší jakou situaci, aplikace Záchranka v mobilu.</w:t>
+      </w:r>
+    </w:p>
+    <w:p>
+      <w:pPr>
+        <w:pStyle w:val="ListParagraph"/>
+        <w:numPr>
+          <w:ilvl w:val="0"/>
+          <w:numId w:val="2"/>
+        </w:numPr>
+        <w:spacing w:after="40"/>
+      </w:pPr>
+      <w:r>
+        <w:rPr>
+          <w:b w:val="false"/>
+          <w:bCs w:val="false"/>
+        </w:rPr>
+        <w:t xml:space="preserve">3. trojročí: Analýza rizik, krizové scénáře a jejich vedení, příprava rodiny na výpadky, dezinformace v krizích. Fungování IZS a spolupráce složek u velkých událostí.</w:t>
       </w:r>
     </w:p>
     <w:p>
@@ -25459,6 +25558,493 @@
           <w:bCs w:val="false"/>
         </w:rPr>
         <w:t xml:space="preserve">3. trojročí: Proud, napětí, odpor a výkon v praxi; výroba a přenos elektřiny, obnovitelné vs. jaderné zdroje, výpočty spotřeby a ceny (kWh).</w:t>
+      </w:r>
+    </w:p>
+    <w:p>
+      <w:pPr>
+        <w:pBdr>
+          <w:bottom w:val="single" w:color="CCCCCC" w:sz="4"/>
+        </w:pBdr>
+        <w:spacing w:after="240"/>
+      </w:pPr>
+    </w:p>
+    <w:p>
+      <w:pPr>
+        <w:pStyle w:val="Heading2"/>
+      </w:pPr>
+      <w:r>
+        <w:t xml:space="preserve">52. Bushcraft: doma v přírodě</w:t>
+      </w:r>
+    </w:p>
+    <w:p>
+      <w:pPr>
+        <w:shd w:fill="F4F4F4" w:val="clear"/>
+        <w:spacing w:after="120"/>
+      </w:pPr>
+      <w:r>
+        <w:rPr>
+          <w:b/>
+          <w:bCs/>
+          <w:color w:val="1E8449"/>
+          <w:sz w:val="20"/>
+          <w:szCs w:val="20"/>
+        </w:rPr>
+        <w:t xml:space="preserve">1.–3. trojročí</w:t>
+      </w:r>
+    </w:p>
+    <w:p>
+      <w:pPr>
+        <w:spacing w:after="120"/>
+      </w:pPr>
+      <w:r>
+        <w:t xml:space="preserve">Umět si venku poradit není jedna výprava, ale sada dovedností, které se dají trénovat celý rok za školou. Projekt učí být v přírodě soběstačný: rozdělat oheň i za mokra, uvázat správný uzel, postavit přístřešek, sbalit batoh, uvařit na ohni a obléknout se tak, aby zima ani déšť nebyly problém. Na rozdíl od Expedice tu nejde o cestu, ale o dovednosti samotné — a o vědomé zmírňování rizik, která s pobytem venku přicházejí.</w:t>
+      </w:r>
+    </w:p>
+    <w:p>
+      <w:pPr>
+        <w:spacing w:after="40" w:before="120"/>
+      </w:pPr>
+      <w:r>
+        <w:rPr>
+          <w:b/>
+          <w:bCs/>
+          <w:color w:val="444444"/>
+          <w:sz w:val="20"/>
+          <w:szCs w:val="20"/>
+        </w:rPr>
+        <w:t xml:space="preserve">Stěžejní kameny</w:t>
+      </w:r>
+    </w:p>
+    <w:p>
+      <w:pPr>
+        <w:pStyle w:val="ListParagraph"/>
+        <w:numPr>
+          <w:ilvl w:val="0"/>
+          <w:numId w:val="2"/>
+        </w:numPr>
+        <w:spacing w:after="40"/>
+      </w:pPr>
+      <w:r>
+        <w:rPr>
+          <w:b/>
+          <w:bCs/>
+        </w:rPr>
+        <w:t xml:space="preserve">8.2.6.2 Zmírňuji či akceptuji rizika</w:t>
+      </w:r>
+    </w:p>
+    <w:p>
+      <w:pPr>
+        <w:pStyle w:val="ListParagraph"/>
+        <w:numPr>
+          <w:ilvl w:val="0"/>
+          <w:numId w:val="2"/>
+        </w:numPr>
+        <w:spacing w:after="40"/>
+      </w:pPr>
+      <w:r>
+        <w:rPr>
+          <w:b/>
+          <w:bCs/>
+        </w:rPr>
+        <w:t xml:space="preserve">4.2.1.4 Chystám se na budoucí zátěžové situace</w:t>
+      </w:r>
+    </w:p>
+    <w:p>
+      <w:pPr>
+        <w:spacing w:after="40" w:before="120"/>
+      </w:pPr>
+      <w:r>
+        <w:rPr>
+          <w:b/>
+          <w:bCs/>
+          <w:color w:val="444444"/>
+          <w:sz w:val="20"/>
+          <w:szCs w:val="20"/>
+        </w:rPr>
+        <w:t xml:space="preserve">Vedlejší kameny</w:t>
+      </w:r>
+    </w:p>
+    <w:p>
+      <w:pPr>
+        <w:pStyle w:val="ListParagraph"/>
+        <w:numPr>
+          <w:ilvl w:val="0"/>
+          <w:numId w:val="2"/>
+        </w:numPr>
+        <w:spacing w:after="40"/>
+      </w:pPr>
+      <w:r>
+        <w:rPr>
+          <w:b w:val="false"/>
+          <w:bCs w:val="false"/>
+        </w:rPr>
+        <w:t xml:space="preserve">8.2.5.1 Zacházím se stroji a nástroji</w:t>
+      </w:r>
+    </w:p>
+    <w:p>
+      <w:pPr>
+        <w:pStyle w:val="ListParagraph"/>
+        <w:numPr>
+          <w:ilvl w:val="0"/>
+          <w:numId w:val="2"/>
+        </w:numPr>
+        <w:spacing w:after="40"/>
+      </w:pPr>
+      <w:r>
+        <w:rPr>
+          <w:b w:val="false"/>
+          <w:bCs w:val="false"/>
+        </w:rPr>
+        <w:t xml:space="preserve">8.2.3.1 Postarám se o stravování</w:t>
+      </w:r>
+    </w:p>
+    <w:p>
+      <w:pPr>
+        <w:pStyle w:val="ListParagraph"/>
+        <w:numPr>
+          <w:ilvl w:val="0"/>
+          <w:numId w:val="2"/>
+        </w:numPr>
+        <w:spacing w:after="40"/>
+      </w:pPr>
+      <w:r>
+        <w:rPr>
+          <w:b w:val="false"/>
+          <w:bCs w:val="false"/>
+        </w:rPr>
+        <w:t xml:space="preserve">4.1.1.6 Odpočívám</w:t>
+      </w:r>
+    </w:p>
+    <w:p>
+      <w:pPr>
+        <w:pStyle w:val="ListParagraph"/>
+        <w:numPr>
+          <w:ilvl w:val="0"/>
+          <w:numId w:val="2"/>
+        </w:numPr>
+        <w:spacing w:after="40"/>
+      </w:pPr>
+      <w:r>
+        <w:rPr>
+          <w:b w:val="false"/>
+          <w:bCs w:val="false"/>
+        </w:rPr>
+        <w:t xml:space="preserve">8.2.3.4 Dopravuji se</w:t>
+      </w:r>
+    </w:p>
+    <w:p>
+      <w:pPr>
+        <w:pStyle w:val="ListParagraph"/>
+        <w:numPr>
+          <w:ilvl w:val="0"/>
+          <w:numId w:val="2"/>
+        </w:numPr>
+        <w:spacing w:after="40"/>
+      </w:pPr>
+      <w:r>
+        <w:rPr>
+          <w:b w:val="false"/>
+          <w:bCs w:val="false"/>
+        </w:rPr>
+        <w:t xml:space="preserve">1.1.2.6 Učím se činností</w:t>
+      </w:r>
+    </w:p>
+    <w:p>
+      <w:pPr>
+        <w:spacing w:after="40" w:before="120"/>
+      </w:pPr>
+      <w:r>
+        <w:rPr>
+          <w:b/>
+          <w:bCs/>
+          <w:color w:val="444444"/>
+          <w:sz w:val="20"/>
+          <w:szCs w:val="20"/>
+        </w:rPr>
+        <w:t xml:space="preserve">Náměty aktivit</w:t>
+      </w:r>
+    </w:p>
+    <w:p>
+      <w:pPr>
+        <w:pStyle w:val="ListParagraph"/>
+        <w:numPr>
+          <w:ilvl w:val="0"/>
+          <w:numId w:val="2"/>
+        </w:numPr>
+        <w:spacing w:after="40"/>
+      </w:pPr>
+      <w:r>
+        <w:rPr>
+          <w:b w:val="false"/>
+          <w:bCs w:val="false"/>
+        </w:rPr>
+        <w:t xml:space="preserve">Oheň a vaření venku: rozdělání ohně různými způsoby a v různém počasí, bezpečnost ohniště, vaření v kotlíku a specifika venkovní kuchyně</w:t>
+      </w:r>
+    </w:p>
+    <w:p>
+      <w:pPr>
+        <w:pStyle w:val="ListParagraph"/>
+        <w:numPr>
+          <w:ilvl w:val="0"/>
+          <w:numId w:val="2"/>
+        </w:numPr>
+        <w:spacing w:after="40"/>
+      </w:pPr>
+      <w:r>
+        <w:rPr>
+          <w:b w:val="false"/>
+          <w:bCs w:val="false"/>
+        </w:rPr>
+        <w:t xml:space="preserve">Uzly a přístřešek: základní uzly a jejich použití, stavba přístřešku z plachty i přírodního materiálu, spaní venku nanečisto</w:t>
+      </w:r>
+    </w:p>
+    <w:p>
+      <w:pPr>
+        <w:pStyle w:val="ListParagraph"/>
+        <w:numPr>
+          <w:ilvl w:val="0"/>
+          <w:numId w:val="2"/>
+        </w:numPr>
+        <w:spacing w:after="40"/>
+      </w:pPr>
+      <w:r>
+        <w:rPr>
+          <w:b w:val="false"/>
+          <w:bCs w:val="false"/>
+        </w:rPr>
+        <w:t xml:space="preserve">Batoh a výstroj: co si vzít a co nechat doma, vrstvení oblečení pro zimu i léto, péče o nůž a nástroje</w:t>
+      </w:r>
+    </w:p>
+    <w:p>
+      <w:pPr>
+        <w:pStyle w:val="ListParagraph"/>
+        <w:numPr>
+          <w:ilvl w:val="0"/>
+          <w:numId w:val="2"/>
+        </w:numPr>
+        <w:spacing w:after="40"/>
+      </w:pPr>
+      <w:r>
+        <w:rPr>
+          <w:b w:val="false"/>
+          <w:bCs w:val="false"/>
+        </w:rPr>
+        <w:t xml:space="preserve">Terén a počasí: pohyb po sněhu a ledu, čtení počasí, orientace bez mobilu, co dělat, když se ochladí nebo začne pršet</w:t>
+      </w:r>
+    </w:p>
+    <w:p>
+      <w:pPr>
+        <w:pStyle w:val="ListParagraph"/>
+        <w:numPr>
+          <w:ilvl w:val="0"/>
+          <w:numId w:val="2"/>
+        </w:numPr>
+        <w:spacing w:after="40"/>
+      </w:pPr>
+      <w:r>
+        <w:rPr>
+          <w:b w:val="false"/>
+          <w:bCs w:val="false"/>
+        </w:rPr>
+        <w:t xml:space="preserve">Zkouška dovednosti: tábornický okruh stanovišť v různých ročních obdobích — každý ukáže, co už zvládne sám</w:t>
+      </w:r>
+    </w:p>
+    <w:p>
+      <w:pPr>
+        <w:spacing w:after="40" w:before="120"/>
+      </w:pPr>
+      <w:r>
+        <w:rPr>
+          <w:b/>
+          <w:bCs/>
+          <w:color w:val="444444"/>
+          <w:sz w:val="20"/>
+          <w:szCs w:val="20"/>
+        </w:rPr>
+        <w:t xml:space="preserve">Tvrdé znalosti — příklady učiva</w:t>
+      </w:r>
+    </w:p>
+    <w:p>
+      <w:pPr>
+        <w:pStyle w:val="ListParagraph"/>
+        <w:numPr>
+          <w:ilvl w:val="0"/>
+          <w:numId w:val="2"/>
+        </w:numPr>
+        <w:spacing w:after="40"/>
+      </w:pPr>
+      <w:r>
+        <w:rPr>
+          <w:b w:val="false"/>
+          <w:bCs w:val="false"/>
+        </w:rPr>
+        <w:t xml:space="preserve">principy přežití v přírodě, plán B</w:t>
+      </w:r>
+    </w:p>
+    <w:p>
+      <w:pPr>
+        <w:pStyle w:val="ListParagraph"/>
+        <w:numPr>
+          <w:ilvl w:val="0"/>
+          <w:numId w:val="2"/>
+        </w:numPr>
+        <w:spacing w:after="40"/>
+      </w:pPr>
+      <w:r>
+        <w:rPr>
+          <w:b w:val="false"/>
+          <w:bCs w:val="false"/>
+        </w:rPr>
+        <w:t xml:space="preserve">Tělesná výchova: turistika a pobyt v přírodě, bezpečnost při pohybových aktivitách</w:t>
+      </w:r>
+    </w:p>
+    <w:p>
+      <w:pPr>
+        <w:pStyle w:val="ListParagraph"/>
+        <w:numPr>
+          <w:ilvl w:val="0"/>
+          <w:numId w:val="2"/>
+        </w:numPr>
+        <w:spacing w:after="40"/>
+      </w:pPr>
+      <w:r>
+        <w:rPr>
+          <w:b w:val="false"/>
+          <w:bCs w:val="false"/>
+        </w:rPr>
+        <w:t xml:space="preserve">Polytechnická výchova a praktické činnosti: bezpečná práce s nářadím (nůž, pila), příprava pokrmů v improvizovaných podmínkách</w:t>
+      </w:r>
+    </w:p>
+    <w:p>
+      <w:pPr>
+        <w:pStyle w:val="ListParagraph"/>
+        <w:numPr>
+          <w:ilvl w:val="0"/>
+          <w:numId w:val="2"/>
+        </w:numPr>
+        <w:spacing w:after="40"/>
+      </w:pPr>
+      <w:r>
+        <w:rPr>
+          <w:b w:val="false"/>
+          <w:bCs w:val="false"/>
+        </w:rPr>
+        <w:t xml:space="preserve">Fyzika: teplo a hoření, vedení tepla (vrstvení oblečení)</w:t>
+      </w:r>
+    </w:p>
+    <w:p>
+      <w:pPr>
+        <w:pStyle w:val="ListParagraph"/>
+        <w:numPr>
+          <w:ilvl w:val="0"/>
+          <w:numId w:val="2"/>
+        </w:numPr>
+        <w:spacing w:after="40"/>
+      </w:pPr>
+      <w:r>
+        <w:rPr>
+          <w:b w:val="false"/>
+          <w:bCs w:val="false"/>
+        </w:rPr>
+        <w:t xml:space="preserve">Výchova ke zdraví a bezpečí: prevence úrazů, podchlazení a přehřátí, chování při ohrožení</w:t>
+      </w:r>
+    </w:p>
+    <w:p>
+      <w:pPr>
+        <w:spacing w:after="40" w:before="120"/>
+      </w:pPr>
+      <w:r>
+        <w:rPr>
+          <w:b/>
+          <w:bCs/>
+          <w:color w:val="444444"/>
+          <w:sz w:val="20"/>
+          <w:szCs w:val="20"/>
+        </w:rPr>
+        <w:t xml:space="preserve">Z didaktiky ScioCíle</w:t>
+      </w:r>
+    </w:p>
+    <w:p>
+      <w:pPr>
+        <w:pStyle w:val="ListParagraph"/>
+        <w:numPr>
+          <w:ilvl w:val="0"/>
+          <w:numId w:val="2"/>
+        </w:numPr>
+        <w:spacing w:after="40"/>
+      </w:pPr>
+      <w:r>
+        <w:rPr>
+          <w:b w:val="false"/>
+          <w:bCs w:val="false"/>
+        </w:rPr>
+        <w:t xml:space="preserve">bushcraft se učí opakováním v různém počasí a ročním období, ne jednorázovým výletem — dovednost se pozná až tehdy, když ji dítě zvládne v nepohodě a samo.</w:t>
+      </w:r>
+    </w:p>
+    <w:p>
+      <w:pPr>
+        <w:spacing w:after="40" w:before="120"/>
+      </w:pPr>
+      <w:r>
+        <w:rPr>
+          <w:b/>
+          <w:bCs/>
+          <w:color w:val="444444"/>
+          <w:sz w:val="20"/>
+          <w:szCs w:val="20"/>
+        </w:rPr>
+        <w:t xml:space="preserve">Diferenciace</w:t>
+      </w:r>
+    </w:p>
+    <w:p>
+      <w:pPr>
+        <w:pStyle w:val="ListParagraph"/>
+        <w:numPr>
+          <w:ilvl w:val="0"/>
+          <w:numId w:val="2"/>
+        </w:numPr>
+        <w:spacing w:after="40"/>
+      </w:pPr>
+      <w:r>
+        <w:rPr>
+          <w:b w:val="false"/>
+          <w:bCs w:val="false"/>
+        </w:rPr>
+        <w:t xml:space="preserve">1. trojročí: Základní tábornické dovednosti s velkou oporou průvodce — oheň pod dohledem, jednoduchý uzel, domeček z klacků, oblékání podle počasí.</w:t>
+      </w:r>
+    </w:p>
+    <w:p>
+      <w:pPr>
+        <w:pStyle w:val="ListParagraph"/>
+        <w:numPr>
+          <w:ilvl w:val="0"/>
+          <w:numId w:val="2"/>
+        </w:numPr>
+        <w:spacing w:after="40"/>
+      </w:pPr>
+      <w:r>
+        <w:rPr>
+          <w:b w:val="false"/>
+          <w:bCs w:val="false"/>
+        </w:rPr>
+        <w:t xml:space="preserve">2. trojročí: Samostatnější zvládnutí základů — oheň, dva tři uzly, přístřešek ve skupině, sbalení vlastního batohu podle seznamu, jednoduché jídlo uvařené venku.</w:t>
+      </w:r>
+    </w:p>
+    <w:p>
+      <w:pPr>
+        <w:pStyle w:val="ListParagraph"/>
+        <w:numPr>
+          <w:ilvl w:val="0"/>
+          <w:numId w:val="2"/>
+        </w:numPr>
+        <w:spacing w:after="40"/>
+      </w:pPr>
+      <w:r>
+        <w:rPr>
+          <w:b w:val="false"/>
+          <w:bCs w:val="false"/>
+        </w:rPr>
+        <w:t xml:space="preserve">3. trojročí: Soběstačnost ve složitějších podmínkách — oheň za mokra, výstroj podle sezóny, přenocování venku, pohyb na sněhu a ledu, vědomé zmírňování rizik a rozhodování, kdy je riziko už příliš velké.</w:t>
       </w:r>
     </w:p>
     <w:p>

</xml_diff>

<commit_message>
Nové téma 53 Když slova nestačí (SC5, alternativní komunikace)
Podle návrhu kolegy na projekt o alternativní komunikaci. Vedoucí kámen
5.3.1.2 Domlouvám se s jinými — piktogramové tabulky a systémy AAC, znak
do řeči a znakový jazyk, Braillovo písmo, komunikační aplikace, setkání
s člověkem, který alternativní komunikaci používá.

Fyzikální část návrhu nová témata nevyžaduje — pokrývají ji už témata 47
(Elektřina), 48 (Světlo a zvuk) a 49 (Vesmír).

Katalog má nyní 53 témat, README aktualizováno, přegenerován web, Word i Excel.
</commit_message>
<xml_diff>
--- a/vystupy/Katalog_projektovych_temat.docx
+++ b/vystupy/Katalog_projektovych_temat.docx
@@ -1496,21 +1496,6 @@
     </w:p>
     <w:p>
       <w:pPr>
-        <w:spacing w:after="60" w:before="160"/>
-      </w:pPr>
-      <w:r>
-        <w:rPr>
-          <w:b/>
-          <w:bCs/>
-          <w:color w:val="1E8449"/>
-          <w:sz w:val="24"/>
-          <w:szCs w:val="24"/>
-        </w:rPr>
-        <w:t xml:space="preserve">ScioCíl 8: Mám život ve svých rukou</w:t>
-      </w:r>
-    </w:p>
-    <w:p>
-      <w:pPr>
         <w:spacing w:after="30"/>
         <w:ind w:left="300"/>
       </w:pPr>
@@ -1519,7 +1504,7 @@
           <w:sz w:val="21"/>
           <w:szCs w:val="21"/>
         </w:rPr>
-        <w:t xml:space="preserve">31. Peníze v mých rukou</w:t>
+        <w:t xml:space="preserve">53. Když slova nestačí</w:t>
       </w:r>
       <w:r>
         <w:rPr>
@@ -1537,7 +1522,22 @@
           <w:sz w:val="19"/>
           <w:szCs w:val="19"/>
         </w:rPr>
-        <w:t xml:space="preserve">  —  8.2.2.1</w:t>
+        <w:t xml:space="preserve">  —  5.3.1.2</w:t>
+      </w:r>
+    </w:p>
+    <w:p>
+      <w:pPr>
+        <w:spacing w:after="60" w:before="160"/>
+      </w:pPr>
+      <w:r>
+        <w:rPr>
+          <w:b/>
+          <w:bCs/>
+          <w:color w:val="1E8449"/>
+          <w:sz w:val="24"/>
+          <w:szCs w:val="24"/>
+        </w:rPr>
+        <w:t xml:space="preserve">ScioCíl 8: Mám život ve svých rukou</w:t>
       </w:r>
     </w:p>
     <w:p>
@@ -1550,7 +1550,7 @@
           <w:sz w:val="21"/>
           <w:szCs w:val="21"/>
         </w:rPr>
-        <w:t xml:space="preserve">32. Startup: od nápadu k prodeji</w:t>
+        <w:t xml:space="preserve">31. Peníze v mých rukou</w:t>
       </w:r>
       <w:r>
         <w:rPr>
@@ -1568,7 +1568,7 @@
           <w:sz w:val="19"/>
           <w:szCs w:val="19"/>
         </w:rPr>
-        <w:t xml:space="preserve">  —  8.3.3.3</w:t>
+        <w:t xml:space="preserve">  —  8.2.2.1</w:t>
       </w:r>
     </w:p>
     <w:p>
@@ -1581,7 +1581,7 @@
           <w:sz w:val="21"/>
           <w:szCs w:val="21"/>
         </w:rPr>
-        <w:t xml:space="preserve">33. Kdo chci být? Svět povolání</w:t>
+        <w:t xml:space="preserve">32. Startup: od nápadu k prodeji</w:t>
       </w:r>
       <w:r>
         <w:rPr>
@@ -1599,7 +1599,7 @@
           <w:sz w:val="19"/>
           <w:szCs w:val="19"/>
         </w:rPr>
-        <w:t xml:space="preserve">  —  8.3.3.1, 8.3.2.1</w:t>
+        <w:t xml:space="preserve">  —  8.3.3.3</w:t>
       </w:r>
     </w:p>
     <w:p>
@@ -1612,7 +1612,7 @@
           <w:sz w:val="21"/>
           <w:szCs w:val="21"/>
         </w:rPr>
-        <w:t xml:space="preserve">34. Pán svého času</w:t>
+        <w:t xml:space="preserve">33. Kdo chci být? Svět povolání</w:t>
       </w:r>
       <w:r>
         <w:rPr>
@@ -1630,7 +1630,7 @@
           <w:sz w:val="19"/>
           <w:szCs w:val="19"/>
         </w:rPr>
-        <w:t xml:space="preserve">  —  8.3.1.1, 8.3.1.2</w:t>
+        <w:t xml:space="preserve">  —  8.3.3.1, 8.3.2.1</w:t>
       </w:r>
     </w:p>
     <w:p>
@@ -1643,7 +1643,7 @@
           <w:sz w:val="21"/>
           <w:szCs w:val="21"/>
         </w:rPr>
-        <w:t xml:space="preserve">35. Život na vlastní noze</w:t>
+        <w:t xml:space="preserve">34. Pán svého času</w:t>
       </w:r>
       <w:r>
         <w:rPr>
@@ -1661,7 +1661,7 @@
           <w:sz w:val="19"/>
           <w:szCs w:val="19"/>
         </w:rPr>
-        <w:t xml:space="preserve">  —  8.2.3.1, 8.2.3.2, 8.2.3.3</w:t>
+        <w:t xml:space="preserve">  —  8.3.1.1, 8.3.1.2</w:t>
       </w:r>
     </w:p>
     <w:p>
@@ -1674,7 +1674,7 @@
           <w:sz w:val="21"/>
           <w:szCs w:val="21"/>
         </w:rPr>
-        <w:t xml:space="preserve">36. Nouzový režim: když jde do tuhého</w:t>
+        <w:t xml:space="preserve">35. Život na vlastní noze</w:t>
       </w:r>
       <w:r>
         <w:rPr>
@@ -1692,7 +1692,7 @@
           <w:sz w:val="19"/>
           <w:szCs w:val="19"/>
         </w:rPr>
-        <w:t xml:space="preserve">  —  8.2.6.1, 8.2.6.3</w:t>
+        <w:t xml:space="preserve">  —  8.2.3.1, 8.2.3.2, 8.2.3.3</w:t>
       </w:r>
     </w:p>
     <w:p>
@@ -1705,7 +1705,7 @@
           <w:sz w:val="21"/>
           <w:szCs w:val="21"/>
         </w:rPr>
-        <w:t xml:space="preserve">37. Zachraň život</w:t>
+        <w:t xml:space="preserve">36. Nouzový režim: když jde do tuhého</w:t>
       </w:r>
       <w:r>
         <w:rPr>
@@ -1723,7 +1723,7 @@
           <w:sz w:val="19"/>
           <w:szCs w:val="19"/>
         </w:rPr>
-        <w:t xml:space="preserve">  —  8.2.6.4</w:t>
+        <w:t xml:space="preserve">  —  8.2.6.1, 8.2.6.3</w:t>
       </w:r>
     </w:p>
     <w:p>
@@ -1736,7 +1736,7 @@
           <w:sz w:val="21"/>
           <w:szCs w:val="21"/>
         </w:rPr>
-        <w:t xml:space="preserve">38. Vyrobeno vlastníma rukama</w:t>
+        <w:t xml:space="preserve">37. Zachraň život</w:t>
       </w:r>
       <w:r>
         <w:rPr>
@@ -1754,7 +1754,7 @@
           <w:sz w:val="19"/>
           <w:szCs w:val="19"/>
         </w:rPr>
-        <w:t xml:space="preserve">  —  8.2.5.1, 8.2.5.2</w:t>
+        <w:t xml:space="preserve">  —  8.2.6.4</w:t>
       </w:r>
     </w:p>
     <w:p>
@@ -1767,7 +1767,7 @@
           <w:sz w:val="21"/>
           <w:szCs w:val="21"/>
         </w:rPr>
-        <w:t xml:space="preserve">39. Zelená farma</w:t>
+        <w:t xml:space="preserve">38. Vyrobeno vlastníma rukama</w:t>
       </w:r>
       <w:r>
         <w:rPr>
@@ -1785,7 +1785,7 @@
           <w:sz w:val="19"/>
           <w:szCs w:val="19"/>
         </w:rPr>
-        <w:t xml:space="preserve">  —  8.2.5.3</w:t>
+        <w:t xml:space="preserve">  —  8.2.5.1, 8.2.5.2</w:t>
       </w:r>
     </w:p>
     <w:p>
@@ -1798,7 +1798,7 @@
           <w:sz w:val="21"/>
           <w:szCs w:val="21"/>
         </w:rPr>
-        <w:t xml:space="preserve">40. Právo pro život</w:t>
+        <w:t xml:space="preserve">39. Zelená farma</w:t>
       </w:r>
       <w:r>
         <w:rPr>
@@ -1808,7 +1808,7 @@
           <w:sz w:val="19"/>
           <w:szCs w:val="19"/>
         </w:rPr>
-        <w:t xml:space="preserve">  (jen 3. trojročí)</w:t>
+        <w:t xml:space="preserve"/>
       </w:r>
       <w:r>
         <w:rPr>
@@ -1816,7 +1816,7 @@
           <w:sz w:val="19"/>
           <w:szCs w:val="19"/>
         </w:rPr>
-        <w:t xml:space="preserve">  —  8.2.7.1</w:t>
+        <w:t xml:space="preserve">  —  8.2.5.3</w:t>
       </w:r>
     </w:p>
     <w:p>
@@ -1829,7 +1829,7 @@
           <w:sz w:val="21"/>
           <w:szCs w:val="21"/>
         </w:rPr>
-        <w:t xml:space="preserve">43. Stát a my: kdo tu vlastně vládne</w:t>
+        <w:t xml:space="preserve">40. Právo pro život</w:t>
       </w:r>
       <w:r>
         <w:rPr>
@@ -1839,7 +1839,7 @@
           <w:sz w:val="19"/>
           <w:szCs w:val="19"/>
         </w:rPr>
-        <w:t xml:space="preserve"/>
+        <w:t xml:space="preserve">  (jen 3. trojročí)</w:t>
       </w:r>
       <w:r>
         <w:rPr>
@@ -1860,7 +1860,7 @@
           <w:sz w:val="21"/>
           <w:szCs w:val="21"/>
         </w:rPr>
-        <w:t xml:space="preserve">46. Technologie pod pokličkou</w:t>
+        <w:t xml:space="preserve">43. Stát a my: kdo tu vlastně vládne</w:t>
       </w:r>
       <w:r>
         <w:rPr>
@@ -1878,7 +1878,7 @@
           <w:sz w:val="19"/>
           <w:szCs w:val="19"/>
         </w:rPr>
-        <w:t xml:space="preserve">  —  8.2.4.1</w:t>
+        <w:t xml:space="preserve">  —  8.2.7.1</w:t>
       </w:r>
     </w:p>
     <w:p>
@@ -1891,7 +1891,7 @@
           <w:sz w:val="21"/>
           <w:szCs w:val="21"/>
         </w:rPr>
-        <w:t xml:space="preserve">47. Elektřina: od blesku k zásuvce</w:t>
+        <w:t xml:space="preserve">46. Technologie pod pokličkou</w:t>
       </w:r>
       <w:r>
         <w:rPr>
@@ -1909,7 +1909,7 @@
           <w:sz w:val="19"/>
           <w:szCs w:val="19"/>
         </w:rPr>
-        <w:t xml:space="preserve">  —  8.2.5.1</w:t>
+        <w:t xml:space="preserve">  —  8.2.4.1</w:t>
       </w:r>
     </w:p>
     <w:p>
@@ -1922,7 +1922,7 @@
           <w:sz w:val="21"/>
           <w:szCs w:val="21"/>
         </w:rPr>
-        <w:t xml:space="preserve">52. Bushcraft: doma v přírodě</w:t>
+        <w:t xml:space="preserve">47. Elektřina: od blesku k zásuvce</w:t>
       </w:r>
       <w:r>
         <w:rPr>
@@ -1940,6 +1940,37 @@
           <w:sz w:val="19"/>
           <w:szCs w:val="19"/>
         </w:rPr>
+        <w:t xml:space="preserve">  —  8.2.5.1</w:t>
+      </w:r>
+    </w:p>
+    <w:p>
+      <w:pPr>
+        <w:spacing w:after="30"/>
+        <w:ind w:left="300"/>
+      </w:pPr>
+      <w:r>
+        <w:rPr>
+          <w:sz w:val="21"/>
+          <w:szCs w:val="21"/>
+        </w:rPr>
+        <w:t xml:space="preserve">52. Bushcraft: doma v přírodě</w:t>
+      </w:r>
+      <w:r>
+        <w:rPr>
+          <w:i/>
+          <w:iCs/>
+          <w:color w:val="888888"/>
+          <w:sz w:val="19"/>
+          <w:szCs w:val="19"/>
+        </w:rPr>
+        <w:t xml:space="preserve"/>
+      </w:r>
+      <w:r>
+        <w:rPr>
+          <w:color w:val="666666"/>
+          <w:sz w:val="19"/>
+          <w:szCs w:val="19"/>
+        </w:rPr>
         <w:t xml:space="preserve">  —  8.2.6.2, 4.2.1.4</w:t>
       </w:r>
     </w:p>
@@ -19641,6 +19672,476 @@
           <w:bCs w:val="false"/>
         </w:rPr>
         <w:t xml:space="preserve">3. trojročí: Biologie a psychologie stárnutí, demografické stárnutí ČR (data, grafy), ageismus, systém péče o seniory, dlouhodobý dobrovolnický vztah.</w:t>
+      </w:r>
+    </w:p>
+    <w:p>
+      <w:pPr>
+        <w:pBdr>
+          <w:bottom w:val="single" w:color="CCCCCC" w:sz="4"/>
+        </w:pBdr>
+        <w:spacing w:after="240"/>
+      </w:pPr>
+    </w:p>
+    <w:p>
+      <w:pPr>
+        <w:pStyle w:val="Heading2"/>
+      </w:pPr>
+      <w:r>
+        <w:t xml:space="preserve">53. Když slova nestačí</w:t>
+      </w:r>
+    </w:p>
+    <w:p>
+      <w:pPr>
+        <w:shd w:fill="F4F4F4" w:val="clear"/>
+        <w:spacing w:after="120"/>
+      </w:pPr>
+      <w:r>
+        <w:rPr>
+          <w:b/>
+          <w:bCs/>
+          <w:color w:val="922B21"/>
+          <w:sz w:val="20"/>
+          <w:szCs w:val="20"/>
+        </w:rPr>
+        <w:t xml:space="preserve">1.–3. trojročí</w:t>
+      </w:r>
+    </w:p>
+    <w:p>
+      <w:pPr>
+        <w:spacing w:after="120"/>
+      </w:pPr>
+      <w:r>
+        <w:t xml:space="preserve">Co když člověk nemůže mluvit — nebo mluví jiným jazykem než ty? Projekt o komunikaci, která si musí poradit bez běžné řeči: piktogramové tabulky a komunikační knihy, znak do řeči a znakový jazyk, Braillovo písmo, gesta a mimika i komunikační aplikace na tabletu. Děti si na vlastní kůži zkusí, jaké to je nemoci říct, co potřebuji — a naučí se, jak se dá dorozumět, když slova nestačí.</w:t>
+      </w:r>
+    </w:p>
+    <w:p>
+      <w:pPr>
+        <w:spacing w:after="40" w:before="120"/>
+      </w:pPr>
+      <w:r>
+        <w:rPr>
+          <w:b/>
+          <w:bCs/>
+          <w:color w:val="444444"/>
+          <w:sz w:val="20"/>
+          <w:szCs w:val="20"/>
+        </w:rPr>
+        <w:t xml:space="preserve">Stěžejní kameny</w:t>
+      </w:r>
+    </w:p>
+    <w:p>
+      <w:pPr>
+        <w:pStyle w:val="ListParagraph"/>
+        <w:numPr>
+          <w:ilvl w:val="0"/>
+          <w:numId w:val="2"/>
+        </w:numPr>
+        <w:spacing w:after="40"/>
+      </w:pPr>
+      <w:r>
+        <w:rPr>
+          <w:b/>
+          <w:bCs/>
+        </w:rPr>
+        <w:t xml:space="preserve">5.3.1.2 Domlouvám se s jinými</w:t>
+      </w:r>
+    </w:p>
+    <w:p>
+      <w:pPr>
+        <w:spacing w:after="40" w:before="120"/>
+      </w:pPr>
+      <w:r>
+        <w:rPr>
+          <w:b/>
+          <w:bCs/>
+          <w:color w:val="444444"/>
+          <w:sz w:val="20"/>
+          <w:szCs w:val="20"/>
+        </w:rPr>
+        <w:t xml:space="preserve">Vedlejší kameny</w:t>
+      </w:r>
+    </w:p>
+    <w:p>
+      <w:pPr>
+        <w:pStyle w:val="ListParagraph"/>
+        <w:numPr>
+          <w:ilvl w:val="0"/>
+          <w:numId w:val="2"/>
+        </w:numPr>
+        <w:spacing w:after="40"/>
+      </w:pPr>
+      <w:r>
+        <w:rPr>
+          <w:b w:val="false"/>
+          <w:bCs w:val="false"/>
+        </w:rPr>
+        <w:t xml:space="preserve">5.1.1.1 Vnímám a přijímám druhé</w:t>
+      </w:r>
+    </w:p>
+    <w:p>
+      <w:pPr>
+        <w:pStyle w:val="ListParagraph"/>
+        <w:numPr>
+          <w:ilvl w:val="0"/>
+          <w:numId w:val="2"/>
+        </w:numPr>
+        <w:spacing w:after="40"/>
+      </w:pPr>
+      <w:r>
+        <w:rPr>
+          <w:b w:val="false"/>
+          <w:bCs w:val="false"/>
+        </w:rPr>
+        <w:t xml:space="preserve">5.3.2.1 Komunikuji s respektem</w:t>
+      </w:r>
+    </w:p>
+    <w:p>
+      <w:pPr>
+        <w:pStyle w:val="ListParagraph"/>
+        <w:numPr>
+          <w:ilvl w:val="0"/>
+          <w:numId w:val="2"/>
+        </w:numPr>
+        <w:spacing w:after="40"/>
+      </w:pPr>
+      <w:r>
+        <w:rPr>
+          <w:b w:val="false"/>
+          <w:bCs w:val="false"/>
+        </w:rPr>
+        <w:t xml:space="preserve">1.1.2.4 Získávám poznatky z nejazykových druhů vyjádření</w:t>
+      </w:r>
+    </w:p>
+    <w:p>
+      <w:pPr>
+        <w:pStyle w:val="ListParagraph"/>
+        <w:numPr>
+          <w:ilvl w:val="0"/>
+          <w:numId w:val="2"/>
+        </w:numPr>
+        <w:spacing w:after="40"/>
+      </w:pPr>
+      <w:r>
+        <w:rPr>
+          <w:b w:val="false"/>
+          <w:bCs w:val="false"/>
+        </w:rPr>
+        <w:t xml:space="preserve">5.3.1.4 Ovládám komunikační kanály</w:t>
+      </w:r>
+    </w:p>
+    <w:p>
+      <w:pPr>
+        <w:pStyle w:val="ListParagraph"/>
+        <w:numPr>
+          <w:ilvl w:val="0"/>
+          <w:numId w:val="2"/>
+        </w:numPr>
+        <w:spacing w:after="40"/>
+      </w:pPr>
+      <w:r>
+        <w:rPr>
+          <w:b w:val="false"/>
+          <w:bCs w:val="false"/>
+        </w:rPr>
+        <w:t xml:space="preserve">8.2.4.1 Využívám digitální technologie</w:t>
+      </w:r>
+    </w:p>
+    <w:p>
+      <w:pPr>
+        <w:spacing w:after="40" w:before="120"/>
+      </w:pPr>
+      <w:r>
+        <w:rPr>
+          <w:b/>
+          <w:bCs/>
+          <w:color w:val="444444"/>
+          <w:sz w:val="20"/>
+          <w:szCs w:val="20"/>
+        </w:rPr>
+        <w:t xml:space="preserve">Náměty aktivit</w:t>
+      </w:r>
+    </w:p>
+    <w:p>
+      <w:pPr>
+        <w:pStyle w:val="ListParagraph"/>
+        <w:numPr>
+          <w:ilvl w:val="0"/>
+          <w:numId w:val="2"/>
+        </w:numPr>
+        <w:spacing w:after="40"/>
+      </w:pPr>
+      <w:r>
+        <w:rPr>
+          <w:b w:val="false"/>
+          <w:bCs w:val="false"/>
+        </w:rPr>
+        <w:t xml:space="preserve">Hodina beze slov: domluvit se na společném úkolu bez mluvené řeči (gesta, kresba, piktogramy) a pojmenovat, co bylo nejtěžší</w:t>
+      </w:r>
+    </w:p>
+    <w:p>
+      <w:pPr>
+        <w:pStyle w:val="ListParagraph"/>
+        <w:numPr>
+          <w:ilvl w:val="0"/>
+          <w:numId w:val="2"/>
+        </w:numPr>
+        <w:spacing w:after="40"/>
+      </w:pPr>
+      <w:r>
+        <w:rPr>
+          <w:b w:val="false"/>
+          <w:bCs w:val="false"/>
+        </w:rPr>
+        <w:t xml:space="preserve">Piktogramy a komunikační tabulky: jak fungují systémy alternativní komunikace, výroba vlastní tabulky či knihy pro konkrétní situaci (jídelna, výlet)</w:t>
+      </w:r>
+    </w:p>
+    <w:p>
+      <w:pPr>
+        <w:pStyle w:val="ListParagraph"/>
+        <w:numPr>
+          <w:ilvl w:val="0"/>
+          <w:numId w:val="2"/>
+        </w:numPr>
+        <w:spacing w:after="40"/>
+      </w:pPr>
+      <w:r>
+        <w:rPr>
+          <w:b w:val="false"/>
+          <w:bCs w:val="false"/>
+        </w:rPr>
+        <w:t xml:space="preserve">Znakový jazyk a znak do řeči: základy od lektora či neslyšícího hosta — pozdrav, představení se, běžné fráze; proč je znakový jazyk plnohodnotný jazyk, ne pantomima</w:t>
+      </w:r>
+    </w:p>
+    <w:p>
+      <w:pPr>
+        <w:pStyle w:val="ListParagraph"/>
+        <w:numPr>
+          <w:ilvl w:val="0"/>
+          <w:numId w:val="2"/>
+        </w:numPr>
+        <w:spacing w:after="40"/>
+      </w:pPr>
+      <w:r>
+        <w:rPr>
+          <w:b w:val="false"/>
+          <w:bCs w:val="false"/>
+        </w:rPr>
+        <w:t xml:space="preserve">Braille a další jazyky beze slov: hmatové písmo, morseovka, mezinárodní symboly — vyzkoušení a porovnání, čím se který hodí</w:t>
+      </w:r>
+    </w:p>
+    <w:p>
+      <w:pPr>
+        <w:pStyle w:val="ListParagraph"/>
+        <w:numPr>
+          <w:ilvl w:val="0"/>
+          <w:numId w:val="2"/>
+        </w:numPr>
+        <w:spacing w:after="40"/>
+      </w:pPr>
+      <w:r>
+        <w:rPr>
+          <w:b w:val="false"/>
+          <w:bCs w:val="false"/>
+        </w:rPr>
+        <w:t xml:space="preserve">Setkání naostro: návštěva organizace pracující s lidmi s postižením komunikace nebo host ve škole; rozhovor připravený tak, aby se domluvily obě strany</w:t>
+      </w:r>
+    </w:p>
+    <w:p>
+      <w:pPr>
+        <w:spacing w:after="40" w:before="120"/>
+      </w:pPr>
+      <w:r>
+        <w:rPr>
+          <w:b/>
+          <w:bCs/>
+          <w:color w:val="444444"/>
+          <w:sz w:val="20"/>
+          <w:szCs w:val="20"/>
+        </w:rPr>
+        <w:t xml:space="preserve">Tvrdé znalosti — příklady učiva</w:t>
+      </w:r>
+    </w:p>
+    <w:p>
+      <w:pPr>
+        <w:pStyle w:val="ListParagraph"/>
+        <w:numPr>
+          <w:ilvl w:val="0"/>
+          <w:numId w:val="2"/>
+        </w:numPr>
+        <w:spacing w:after="40"/>
+      </w:pPr>
+      <w:r>
+        <w:rPr>
+          <w:b w:val="false"/>
+          <w:bCs w:val="false"/>
+        </w:rPr>
+        <w:t xml:space="preserve">Výchova ke zdraví a bezpečí: vztahy mezi lidmi, respekt k odlišnosti, soužití s lidmi se znevýhodněním</w:t>
+      </w:r>
+    </w:p>
+    <w:p>
+      <w:pPr>
+        <w:pStyle w:val="ListParagraph"/>
+        <w:numPr>
+          <w:ilvl w:val="0"/>
+          <w:numId w:val="2"/>
+        </w:numPr>
+        <w:spacing w:after="40"/>
+      </w:pPr>
+      <w:r>
+        <w:rPr>
+          <w:b w:val="false"/>
+          <w:bCs w:val="false"/>
+        </w:rPr>
+        <w:t xml:space="preserve">Český jazyk a literatura: komunikační situace a záměr, aktivní naslouchání, neverbální komunikace</w:t>
+      </w:r>
+    </w:p>
+    <w:p>
+      <w:pPr>
+        <w:pStyle w:val="ListParagraph"/>
+        <w:numPr>
+          <w:ilvl w:val="0"/>
+          <w:numId w:val="2"/>
+        </w:numPr>
+        <w:spacing w:after="40"/>
+      </w:pPr>
+      <w:r>
+        <w:rPr>
+          <w:b w:val="false"/>
+          <w:bCs w:val="false"/>
+        </w:rPr>
+        <w:t xml:space="preserve">Informatika: kódování informace (Braillovo písmo, morseovka), asistivní technologie a komunikační aplikace</w:t>
+      </w:r>
+    </w:p>
+    <w:p>
+      <w:pPr>
+        <w:pStyle w:val="ListParagraph"/>
+        <w:numPr>
+          <w:ilvl w:val="0"/>
+          <w:numId w:val="2"/>
+        </w:numPr>
+        <w:spacing w:after="40"/>
+      </w:pPr>
+      <w:r>
+        <w:rPr>
+          <w:b w:val="false"/>
+          <w:bCs w:val="false"/>
+        </w:rPr>
+        <w:t xml:space="preserve">Osobnostní a sociální výchova: empatie, přijímání odlišnosti, komunikace v náročných situacích</w:t>
+      </w:r>
+    </w:p>
+    <w:p>
+      <w:pPr>
+        <w:pStyle w:val="ListParagraph"/>
+        <w:numPr>
+          <w:ilvl w:val="0"/>
+          <w:numId w:val="2"/>
+        </w:numPr>
+        <w:spacing w:after="40"/>
+      </w:pPr>
+      <w:r>
+        <w:rPr>
+          <w:b w:val="false"/>
+          <w:bCs w:val="false"/>
+        </w:rPr>
+        <w:t xml:space="preserve">Výtvarná a filmová výchova: piktogram a vizuální znak jako nositel významu</w:t>
+      </w:r>
+    </w:p>
+    <w:p>
+      <w:pPr>
+        <w:spacing w:after="40" w:before="120"/>
+      </w:pPr>
+      <w:r>
+        <w:rPr>
+          <w:b/>
+          <w:bCs/>
+          <w:color w:val="444444"/>
+          <w:sz w:val="20"/>
+          <w:szCs w:val="20"/>
+        </w:rPr>
+        <w:t xml:space="preserve">Z didaktiky ScioCíle</w:t>
+      </w:r>
+    </w:p>
+    <w:p>
+      <w:pPr>
+        <w:pStyle w:val="ListParagraph"/>
+        <w:numPr>
+          <w:ilvl w:val="0"/>
+          <w:numId w:val="2"/>
+        </w:numPr>
+        <w:spacing w:after="40"/>
+      </w:pPr>
+      <w:r>
+        <w:rPr>
+          <w:b w:val="false"/>
+          <w:bCs w:val="false"/>
+        </w:rPr>
+        <w:t xml:space="preserve">klíčový je vlastní zážitek bezmoci („nemůžu říct, co chci“) — až po něm má smysl učit systémy; setkání s člověkem, který alternativní komunikaci nebo znakový jazyk skutečně používá, je nenahraditelné a musí být připravené na obou stranách.</w:t>
+      </w:r>
+    </w:p>
+    <w:p>
+      <w:pPr>
+        <w:spacing w:after="40" w:before="120"/>
+      </w:pPr>
+      <w:r>
+        <w:rPr>
+          <w:b/>
+          <w:bCs/>
+          <w:color w:val="444444"/>
+          <w:sz w:val="20"/>
+          <w:szCs w:val="20"/>
+        </w:rPr>
+        <w:t xml:space="preserve">Diferenciace</w:t>
+      </w:r>
+    </w:p>
+    <w:p>
+      <w:pPr>
+        <w:pStyle w:val="ListParagraph"/>
+        <w:numPr>
+          <w:ilvl w:val="0"/>
+          <w:numId w:val="2"/>
+        </w:numPr>
+        <w:spacing w:after="40"/>
+      </w:pPr>
+      <w:r>
+        <w:rPr>
+          <w:b w:val="false"/>
+          <w:bCs w:val="false"/>
+        </w:rPr>
+        <w:t xml:space="preserve">1. trojročí: Hry na domluvení se beze slov (gesta, obrázky, pantomima), první znaky ze znakového jazyka, poznání, že někdo se dorozumívá jinak než mluvením — a že to jde.</w:t>
+      </w:r>
+    </w:p>
+    <w:p>
+      <w:pPr>
+        <w:pStyle w:val="ListParagraph"/>
+        <w:numPr>
+          <w:ilvl w:val="0"/>
+          <w:numId w:val="2"/>
+        </w:numPr>
+        <w:spacing w:after="40"/>
+      </w:pPr>
+      <w:r>
+        <w:rPr>
+          <w:b w:val="false"/>
+          <w:bCs w:val="false"/>
+        </w:rPr>
+        <w:t xml:space="preserve">2. trojročí: Piktogramy a obrázkové tabulky v praxi, základy znakového jazyka, vyzkoušení Braillova písma, respektující chování při setkání s někým, kdo se dorozumívá jinak.</w:t>
+      </w:r>
+    </w:p>
+    <w:p>
+      <w:pPr>
+        <w:pStyle w:val="ListParagraph"/>
+        <w:numPr>
+          <w:ilvl w:val="0"/>
+          <w:numId w:val="2"/>
+        </w:numPr>
+        <w:spacing w:after="40"/>
+      </w:pPr>
+      <w:r>
+        <w:rPr>
+          <w:b w:val="false"/>
+          <w:bCs w:val="false"/>
+        </w:rPr>
+        <w:t xml:space="preserve">3. trojročí: Systémy alternativní a augmentativní komunikace a komunikační aplikace, znakový jazyk jako plnohodnotný jazyk s vlastní gramatikou, aktivní naslouchání a přizpůsobení komunikačnímu partnerovi, inkluze v praxi.</w:t>
       </w:r>
     </w:p>
     <w:p>

</xml_diff>

<commit_message>
Zviditelnit civilizace v tématu 17
Starověk a středověk jsou u ostatních ScioŠkol nejčastější typ projektu
a katalog je vstřebal do tématu 17 (pole loni uvádí „Středověk; Starověké
civilizace"), ale karta o nich nemluvila. Přidána jedna aktivita, která
z civilizace dělá volitelný rámec projektu — stěžejní kompetencí zůstává
práce s prameny, kameny ani anotace se nemění.

Přegenerován web, Word i Excel.
</commit_message>
<xml_diff>
--- a/vystupy/Katalog_projektovych_temat.docx
+++ b/vystupy/Katalog_projektovych_temat.docx
@@ -11692,6 +11692,23 @@
           <w:bCs w:val="false"/>
         </w:rPr>
         <w:t xml:space="preserve">Výstava či podcast „Stopy minulosti“: děti prezentují svá zjištění s uvedením pramenů</w:t>
+      </w:r>
+    </w:p>
+    <w:p>
+      <w:pPr>
+        <w:pStyle w:val="ListParagraph"/>
+        <w:numPr>
+          <w:ilvl w:val="0"/>
+          <w:numId w:val="2"/>
+        </w:numPr>
+        <w:spacing w:after="40"/>
+      </w:pPr>
+      <w:r>
+        <w:rPr>
+          <w:b w:val="false"/>
+          <w:bCs w:val="false"/>
+        </w:rPr>
+        <w:t xml:space="preserve">Civilizace jako rámec: tým si zvolí dobu, do které se ponoří (Mezopotámie, Egypt, antika, středověk), a vede projekt skrze její prameny — písmo, mapy, předměty, stavby</w:t>
       </w:r>
     </w:p>
     <w:p>

</xml_diff>

<commit_message>
Téma 43: poznámka o volbách patří do anotace, ne mezi aktivity
„Mimořádné zařazení podle kalendáře" nebyla aktivita, ale informace
o tématu, a dělala z tématu 43 jediné se sedmi aktivitami v katalogu.
Přesunuto na konec anotace — informace zůstává průvodci na očích a rozsah
aktivit je zpět na 5–6 u všech 55 témat.

Přegenerován web, Word i Excel.
</commit_message>
<xml_diff>
--- a/vystupy/Katalog_projektovych_temat.docx
+++ b/vystupy/Katalog_projektovych_temat.docx
@@ -26138,7 +26138,7 @@
         <w:spacing w:after="120"/>
       </w:pPr>
       <w:r>
-        <w:t xml:space="preserve">Kdo rozhoduje o tom, co smím a co musím — a jak to můžu ovlivnit? Projekt rozebírá stát od obce po mezinárodní instituce: volby, parlament, vláda a soudy, obecní zastupitelstvo, EU, NATO i OSN. Děti si stát vyzkoušejí zevnitř — simulací voleb a parlamentu — a naostro navštíví úřady a zastupitele.</w:t>
+        <w:t xml:space="preserve">Kdo rozhoduje o tom, co smím a co musím — a jak to můžu ovlivnit? Projekt rozebírá stát od obce po mezinárodní instituce: volby, parlament, vláda a soudy, obecní zastupitelstvo, EU, NATO i OSN. Děti si stát vyzkoušejí zevnitř — simulací voleb a parlamentu — a naostro navštíví úřady a zastupitele. Konají-li se právě skutečné volby (prezidentské, parlamentní i komunální), vyplatí se téma zařadit i mimo plánovaný blok — děti ho pak zažijí v reálném čase.</w:t>
       </w:r>
     </w:p>
     <w:p>
@@ -26371,23 +26371,6 @@
           <w:bCs w:val="false"/>
         </w:rPr>
         <w:t xml:space="preserve">Vlajka, znak a hymna: co znamenají státní symboly a proč je máme; procházka obcí za pamětihodnostmi jako symboly domova</w:t>
-      </w:r>
-    </w:p>
-    <w:p>
-      <w:pPr>
-        <w:pStyle w:val="ListParagraph"/>
-        <w:numPr>
-          <w:ilvl w:val="0"/>
-          <w:numId w:val="2"/>
-        </w:numPr>
-        <w:spacing w:after="40"/>
-      </w:pPr>
-      <w:r>
-        <w:rPr>
-          <w:b w:val="false"/>
-          <w:bCs w:val="false"/>
-        </w:rPr>
-        <w:t xml:space="preserve">Mimořádné zařazení podle kalendáře: konají-li se skutečné volby (prezidentské, parlamentní, komunální), lze projekt zařadit i mimo plánovaný blok, aby ho děti zažily v reálném čase</w:t>
       </w:r>
     </w:p>
     <w:p>

</xml_diff>

<commit_message>
Odebrat téma 52 Bushcraft
Úzce zaměřené — spíš samostatný předmět než široké téma, které si průvodce
postaví po svém. Dovednosti pobytu venku zůstávají v tématu 7 Expedice
a 36 Nouzový režim.

Kameny 8.2.6.2 Zmírňuji či akceptuji rizika a 4.2.1.4 Chystám se na budoucí
zátěžové situace tím ztrácejí vedoucí téma, zůstávají ale vedlejší u tématu 36
(8.2.6.2 navíc u 47), takže žádný kámen nezůstal nepokrytý — jediný nepokrytý
je i nadále záměrný 5.2.3.3.

Katalog má 54 témat. Id 52 se neuvolňuje pro další použití; poznámky doplněny
o toto rozhodnutí i o pravidlo, že se id nepřečíslovávají.

Přegenerován web, Word i Excel.
</commit_message>
<xml_diff>
--- a/vystupy/Katalog_projektovych_temat.docx
+++ b/vystupy/Katalog_projektovych_temat.docx
@@ -46,7 +46,7 @@
           <w:sz w:val="24"/>
           <w:szCs w:val="24"/>
         </w:rPr>
-        <w:t xml:space="preserve">55 námětů pro 1.–3. trojročí — ScioCíle 4, 1, 5 a 8</w:t>
+        <w:t xml:space="preserve">54 námětů pro 1.–3. trojročí — ScioCíle 4, 1, 5 a 8</w:t>
       </w:r>
     </w:p>
     <w:p>
@@ -91,7 +91,7 @@
         <w:spacing w:after="120"/>
       </w:pPr>
       <w:r>
-        <w:t xml:space="preserve">Tento katalog nabízí 55 témat, z nichž si dvojice průvodců vybírají a rozpracovávají je do konkrétních Projektů (celodenní předmět, cca 220 minut včetně přestávek, obvykle 4 týdny). Témata jsou náměty, ne osnovy — volnost průvodců i dětí zůstává zachována; projekt může téma uchopit i jinak, pokud rozvíjí uvedené kameny.</w:t>
+        <w:t xml:space="preserve">Tento katalog nabízí 54 témat, z nichž si dvojice průvodců vybírají a rozpracovávají je do konkrétních Projektů (celodenní předmět, cca 220 minut včetně přestávek, obvykle 4 týdny). Témata jsou náměty, ne osnovy — volnost průvodců i dětí zůstává zachována; projekt může téma uchopit i jinak, pokud rozvíjí uvedené kameny.</w:t>
       </w:r>
     </w:p>
     <w:p>
@@ -2006,37 +2006,6 @@
       </w:r>
     </w:p>
     <w:p>
-      <w:pPr>
-        <w:spacing w:after="30"/>
-        <w:ind w:left="300"/>
-      </w:pPr>
-      <w:r>
-        <w:rPr>
-          <w:sz w:val="21"/>
-          <w:szCs w:val="21"/>
-        </w:rPr>
-        <w:t xml:space="preserve">52. Bushcraft: doma v přírodě</w:t>
-      </w:r>
-      <w:r>
-        <w:rPr>
-          <w:i/>
-          <w:iCs/>
-          <w:color w:val="888888"/>
-          <w:sz w:val="19"/>
-          <w:szCs w:val="19"/>
-        </w:rPr>
-        <w:t xml:space="preserve"/>
-      </w:r>
-      <w:r>
-        <w:rPr>
-          <w:color w:val="666666"/>
-          <w:sz w:val="19"/>
-          <w:szCs w:val="19"/>
-        </w:rPr>
-        <w:t xml:space="preserve">  —  8.2.6.2, 4.2.1.4</w:t>
-      </w:r>
-    </w:p>
-    <w:p>
       <w:r>
         <w:br w:type="page"/>
       </w:r>
@@ -27537,510 +27506,6 @@
           <w:bCs w:val="false"/>
         </w:rPr>
         <w:t xml:space="preserve">3. trojročí: Proud, napětí, odpor a výkon v praxi; výroba a přenos elektřiny, obnovitelné vs. jaderné zdroje, výpočty spotřeby a ceny (kWh).</w:t>
-      </w:r>
-    </w:p>
-    <w:p>
-      <w:pPr>
-        <w:pBdr>
-          <w:bottom w:val="single" w:color="CCCCCC" w:sz="4"/>
-        </w:pBdr>
-        <w:spacing w:after="240"/>
-      </w:pPr>
-    </w:p>
-    <w:p>
-      <w:pPr>
-        <w:pStyle w:val="Heading2"/>
-      </w:pPr>
-      <w:r>
-        <w:t xml:space="preserve">52. Bushcraft: doma v přírodě</w:t>
-      </w:r>
-    </w:p>
-    <w:p>
-      <w:pPr>
-        <w:shd w:fill="F4F4F4" w:val="clear"/>
-        <w:spacing w:after="120"/>
-      </w:pPr>
-      <w:r>
-        <w:rPr>
-          <w:b/>
-          <w:bCs/>
-          <w:color w:val="1E8449"/>
-          <w:sz w:val="20"/>
-          <w:szCs w:val="20"/>
-        </w:rPr>
-        <w:t xml:space="preserve">1.–3. trojročí</w:t>
-      </w:r>
-    </w:p>
-    <w:p>
-      <w:pPr>
-        <w:spacing w:after="120"/>
-      </w:pPr>
-      <w:r>
-        <w:t xml:space="preserve">Umět si venku poradit není jedna výprava, ale sada dovedností, které se dají trénovat celý rok za školou. Projekt učí být v přírodě soběstačný: rozdělat oheň i za mokra, uvázat správný uzel, postavit přístřešek, sbalit batoh, uvařit na ohni a obléknout se tak, aby zima ani déšť nebyly problém. Na rozdíl od Expedice tu nejde o cestu, ale o dovednosti samotné — a o vědomé zmírňování rizik, která s pobytem venku přicházejí.</w:t>
-      </w:r>
-    </w:p>
-    <w:p>
-      <w:pPr>
-        <w:spacing w:after="40" w:before="120"/>
-      </w:pPr>
-      <w:r>
-        <w:rPr>
-          <w:b/>
-          <w:bCs/>
-          <w:color w:val="444444"/>
-          <w:sz w:val="20"/>
-          <w:szCs w:val="20"/>
-        </w:rPr>
-        <w:t xml:space="preserve">Stěžejní kameny</w:t>
-      </w:r>
-    </w:p>
-    <w:p>
-      <w:pPr>
-        <w:pStyle w:val="ListParagraph"/>
-        <w:numPr>
-          <w:ilvl w:val="0"/>
-          <w:numId w:val="2"/>
-        </w:numPr>
-        <w:spacing w:after="40"/>
-      </w:pPr>
-      <w:r>
-        <w:rPr>
-          <w:b/>
-          <w:bCs/>
-        </w:rPr>
-        <w:t xml:space="preserve">8.2.6.2 Zmírňuji či akceptuji rizika</w:t>
-      </w:r>
-    </w:p>
-    <w:p>
-      <w:pPr>
-        <w:pStyle w:val="ListParagraph"/>
-        <w:numPr>
-          <w:ilvl w:val="0"/>
-          <w:numId w:val="2"/>
-        </w:numPr>
-        <w:spacing w:after="40"/>
-      </w:pPr>
-      <w:r>
-        <w:rPr>
-          <w:b/>
-          <w:bCs/>
-        </w:rPr>
-        <w:t xml:space="preserve">4.2.1.4 Chystám se na budoucí zátěžové situace</w:t>
-      </w:r>
-    </w:p>
-    <w:p>
-      <w:pPr>
-        <w:spacing w:after="40" w:before="120"/>
-      </w:pPr>
-      <w:r>
-        <w:rPr>
-          <w:b/>
-          <w:bCs/>
-          <w:color w:val="444444"/>
-          <w:sz w:val="20"/>
-          <w:szCs w:val="20"/>
-        </w:rPr>
-        <w:t xml:space="preserve">Vedlejší kameny</w:t>
-      </w:r>
-    </w:p>
-    <w:p>
-      <w:pPr>
-        <w:pStyle w:val="ListParagraph"/>
-        <w:numPr>
-          <w:ilvl w:val="0"/>
-          <w:numId w:val="2"/>
-        </w:numPr>
-        <w:spacing w:after="40"/>
-      </w:pPr>
-      <w:r>
-        <w:rPr>
-          <w:b w:val="false"/>
-          <w:bCs w:val="false"/>
-        </w:rPr>
-        <w:t xml:space="preserve">8.2.5.1 Zacházím se stroji a nástroji</w:t>
-      </w:r>
-    </w:p>
-    <w:p>
-      <w:pPr>
-        <w:pStyle w:val="ListParagraph"/>
-        <w:numPr>
-          <w:ilvl w:val="0"/>
-          <w:numId w:val="2"/>
-        </w:numPr>
-        <w:spacing w:after="40"/>
-      </w:pPr>
-      <w:r>
-        <w:rPr>
-          <w:b w:val="false"/>
-          <w:bCs w:val="false"/>
-        </w:rPr>
-        <w:t xml:space="preserve">8.2.3.1 Postarám se o stravování</w:t>
-      </w:r>
-    </w:p>
-    <w:p>
-      <w:pPr>
-        <w:pStyle w:val="ListParagraph"/>
-        <w:numPr>
-          <w:ilvl w:val="0"/>
-          <w:numId w:val="2"/>
-        </w:numPr>
-        <w:spacing w:after="40"/>
-      </w:pPr>
-      <w:r>
-        <w:rPr>
-          <w:b w:val="false"/>
-          <w:bCs w:val="false"/>
-        </w:rPr>
-        <w:t xml:space="preserve">4.1.1.6 Odpočívám</w:t>
-      </w:r>
-    </w:p>
-    <w:p>
-      <w:pPr>
-        <w:pStyle w:val="ListParagraph"/>
-        <w:numPr>
-          <w:ilvl w:val="0"/>
-          <w:numId w:val="2"/>
-        </w:numPr>
-        <w:spacing w:after="40"/>
-      </w:pPr>
-      <w:r>
-        <w:rPr>
-          <w:b w:val="false"/>
-          <w:bCs w:val="false"/>
-        </w:rPr>
-        <w:t xml:space="preserve">8.2.3.4 Dopravuji se</w:t>
-      </w:r>
-    </w:p>
-    <w:p>
-      <w:pPr>
-        <w:pStyle w:val="ListParagraph"/>
-        <w:numPr>
-          <w:ilvl w:val="0"/>
-          <w:numId w:val="2"/>
-        </w:numPr>
-        <w:spacing w:after="40"/>
-      </w:pPr>
-      <w:r>
-        <w:rPr>
-          <w:b w:val="false"/>
-          <w:bCs w:val="false"/>
-        </w:rPr>
-        <w:t xml:space="preserve">1.1.2.6 Učím se činností</w:t>
-      </w:r>
-    </w:p>
-    <w:p>
-      <w:pPr>
-        <w:spacing w:after="40" w:before="120"/>
-      </w:pPr>
-      <w:r>
-        <w:rPr>
-          <w:b/>
-          <w:bCs/>
-          <w:color w:val="444444"/>
-          <w:sz w:val="20"/>
-          <w:szCs w:val="20"/>
-        </w:rPr>
-        <w:t xml:space="preserve">Náměty aktivit</w:t>
-      </w:r>
-    </w:p>
-    <w:p>
-      <w:pPr>
-        <w:pStyle w:val="ListParagraph"/>
-        <w:numPr>
-          <w:ilvl w:val="0"/>
-          <w:numId w:val="2"/>
-        </w:numPr>
-        <w:spacing w:after="40"/>
-      </w:pPr>
-      <w:r>
-        <w:rPr>
-          <w:b w:val="false"/>
-          <w:bCs w:val="false"/>
-        </w:rPr>
-        <w:t xml:space="preserve">Oheň a vaření venku: rozdělání ohně různými způsoby a v různém počasí, bezpečnost ohniště, vaření v kotlíku a specifika venkovní kuchyně</w:t>
-      </w:r>
-    </w:p>
-    <w:p>
-      <w:pPr>
-        <w:pStyle w:val="ListParagraph"/>
-        <w:numPr>
-          <w:ilvl w:val="0"/>
-          <w:numId w:val="2"/>
-        </w:numPr>
-        <w:spacing w:after="40"/>
-      </w:pPr>
-      <w:r>
-        <w:rPr>
-          <w:b w:val="false"/>
-          <w:bCs w:val="false"/>
-        </w:rPr>
-        <w:t xml:space="preserve">Uzly a přístřešek: základní uzly a jejich použití, stavba přístřešku z plachty i přírodního materiálu, spaní venku nanečisto</w:t>
-      </w:r>
-    </w:p>
-    <w:p>
-      <w:pPr>
-        <w:pStyle w:val="ListParagraph"/>
-        <w:numPr>
-          <w:ilvl w:val="0"/>
-          <w:numId w:val="2"/>
-        </w:numPr>
-        <w:spacing w:after="40"/>
-      </w:pPr>
-      <w:r>
-        <w:rPr>
-          <w:b w:val="false"/>
-          <w:bCs w:val="false"/>
-        </w:rPr>
-        <w:t xml:space="preserve">Batoh a výstroj: co si vzít a co nechat doma, vrstvení oblečení pro zimu i léto, péče o nůž a nástroje</w:t>
-      </w:r>
-    </w:p>
-    <w:p>
-      <w:pPr>
-        <w:pStyle w:val="ListParagraph"/>
-        <w:numPr>
-          <w:ilvl w:val="0"/>
-          <w:numId w:val="2"/>
-        </w:numPr>
-        <w:spacing w:after="40"/>
-      </w:pPr>
-      <w:r>
-        <w:rPr>
-          <w:b w:val="false"/>
-          <w:bCs w:val="false"/>
-        </w:rPr>
-        <w:t xml:space="preserve">Terén a počasí: pohyb po sněhu a ledu, čtení počasí, orientace bez mobilu, co dělat, když se ochladí nebo začne pršet</w:t>
-      </w:r>
-    </w:p>
-    <w:p>
-      <w:pPr>
-        <w:pStyle w:val="ListParagraph"/>
-        <w:numPr>
-          <w:ilvl w:val="0"/>
-          <w:numId w:val="2"/>
-        </w:numPr>
-        <w:spacing w:after="40"/>
-      </w:pPr>
-      <w:r>
-        <w:rPr>
-          <w:b w:val="false"/>
-          <w:bCs w:val="false"/>
-        </w:rPr>
-        <w:t xml:space="preserve">Zkouška dovednosti: tábornický okruh stanovišť v různých ročních obdobích — každý ukáže, co už zvládne sám</w:t>
-      </w:r>
-    </w:p>
-    <w:p>
-      <w:pPr>
-        <w:spacing w:after="40" w:before="120"/>
-      </w:pPr>
-      <w:r>
-        <w:rPr>
-          <w:b/>
-          <w:bCs/>
-          <w:color w:val="444444"/>
-          <w:sz w:val="20"/>
-          <w:szCs w:val="20"/>
-        </w:rPr>
-        <w:t xml:space="preserve">Tvrdé znalosti — příklady učiva</w:t>
-      </w:r>
-    </w:p>
-    <w:p>
-      <w:pPr>
-        <w:pStyle w:val="ListParagraph"/>
-        <w:numPr>
-          <w:ilvl w:val="0"/>
-          <w:numId w:val="2"/>
-        </w:numPr>
-        <w:spacing w:after="40"/>
-      </w:pPr>
-      <w:r>
-        <w:rPr>
-          <w:b w:val="false"/>
-          <w:bCs w:val="false"/>
-        </w:rPr>
-        <w:t xml:space="preserve">principy přežití v přírodě, plán B</w:t>
-      </w:r>
-    </w:p>
-    <w:p>
-      <w:pPr>
-        <w:pStyle w:val="ListParagraph"/>
-        <w:numPr>
-          <w:ilvl w:val="0"/>
-          <w:numId w:val="2"/>
-        </w:numPr>
-        <w:spacing w:after="40"/>
-      </w:pPr>
-      <w:r>
-        <w:rPr>
-          <w:b w:val="false"/>
-          <w:bCs w:val="false"/>
-        </w:rPr>
-        <w:t xml:space="preserve">Tělesná výchova: turistika a pobyt v přírodě, bezpečnost při pohybových aktivitách</w:t>
-      </w:r>
-    </w:p>
-    <w:p>
-      <w:pPr>
-        <w:pStyle w:val="ListParagraph"/>
-        <w:numPr>
-          <w:ilvl w:val="0"/>
-          <w:numId w:val="2"/>
-        </w:numPr>
-        <w:spacing w:after="40"/>
-      </w:pPr>
-      <w:r>
-        <w:rPr>
-          <w:b w:val="false"/>
-          <w:bCs w:val="false"/>
-        </w:rPr>
-        <w:t xml:space="preserve">Polytechnická výchova a praktické činnosti: bezpečná práce s nářadím (nůž, pila), příprava pokrmů v improvizovaných podmínkách</w:t>
-      </w:r>
-    </w:p>
-    <w:p>
-      <w:pPr>
-        <w:pStyle w:val="ListParagraph"/>
-        <w:numPr>
-          <w:ilvl w:val="0"/>
-          <w:numId w:val="2"/>
-        </w:numPr>
-        <w:spacing w:after="40"/>
-      </w:pPr>
-      <w:r>
-        <w:rPr>
-          <w:b w:val="false"/>
-          <w:bCs w:val="false"/>
-        </w:rPr>
-        <w:t xml:space="preserve">Fyzika: teplo a hoření, vedení tepla (vrstvení oblečení)</w:t>
-      </w:r>
-    </w:p>
-    <w:p>
-      <w:pPr>
-        <w:pStyle w:val="ListParagraph"/>
-        <w:numPr>
-          <w:ilvl w:val="0"/>
-          <w:numId w:val="2"/>
-        </w:numPr>
-        <w:spacing w:after="40"/>
-      </w:pPr>
-      <w:r>
-        <w:rPr>
-          <w:b w:val="false"/>
-          <w:bCs w:val="false"/>
-        </w:rPr>
-        <w:t xml:space="preserve">Výchova ke zdraví a bezpečí: prevence úrazů, podchlazení a přehřátí, chování při ohrožení</w:t>
-      </w:r>
-    </w:p>
-    <w:p>
-      <w:pPr>
-        <w:pStyle w:val="ListParagraph"/>
-        <w:numPr>
-          <w:ilvl w:val="0"/>
-          <w:numId w:val="2"/>
-        </w:numPr>
-        <w:spacing w:after="40"/>
-      </w:pPr>
-      <w:r>
-        <w:rPr>
-          <w:b w:val="false"/>
-          <w:bCs w:val="false"/>
-        </w:rPr>
-        <w:t xml:space="preserve">Přírodopis: horniny, nerosty a tvary krajiny v terénu; orientace podle přírodních znaků</w:t>
-      </w:r>
-    </w:p>
-    <w:p>
-      <w:pPr>
-        <w:spacing w:after="40" w:before="120"/>
-      </w:pPr>
-      <w:r>
-        <w:rPr>
-          <w:b/>
-          <w:bCs/>
-          <w:color w:val="444444"/>
-          <w:sz w:val="20"/>
-          <w:szCs w:val="20"/>
-        </w:rPr>
-        <w:t xml:space="preserve">Z didaktiky ScioCíle</w:t>
-      </w:r>
-    </w:p>
-    <w:p>
-      <w:pPr>
-        <w:pStyle w:val="ListParagraph"/>
-        <w:numPr>
-          <w:ilvl w:val="0"/>
-          <w:numId w:val="2"/>
-        </w:numPr>
-        <w:spacing w:after="40"/>
-      </w:pPr>
-      <w:r>
-        <w:rPr>
-          <w:b w:val="false"/>
-          <w:bCs w:val="false"/>
-        </w:rPr>
-        <w:t xml:space="preserve">bushcraft se učí opakováním v různém počasí a ročním období, ne jednorázovým výletem — dovednost se pozná až tehdy, když ji dítě zvládne v nepohodě a samo.</w:t>
-      </w:r>
-    </w:p>
-    <w:p>
-      <w:pPr>
-        <w:spacing w:after="40" w:before="120"/>
-      </w:pPr>
-      <w:r>
-        <w:rPr>
-          <w:b/>
-          <w:bCs/>
-          <w:color w:val="444444"/>
-          <w:sz w:val="20"/>
-          <w:szCs w:val="20"/>
-        </w:rPr>
-        <w:t xml:space="preserve">Diferenciace</w:t>
-      </w:r>
-    </w:p>
-    <w:p>
-      <w:pPr>
-        <w:pStyle w:val="ListParagraph"/>
-        <w:numPr>
-          <w:ilvl w:val="0"/>
-          <w:numId w:val="2"/>
-        </w:numPr>
-        <w:spacing w:after="40"/>
-      </w:pPr>
-      <w:r>
-        <w:rPr>
-          <w:b w:val="false"/>
-          <w:bCs w:val="false"/>
-        </w:rPr>
-        <w:t xml:space="preserve">1. trojročí: Základní tábornické dovednosti s velkou oporou průvodce — oheň pod dohledem, jednoduchý uzel, domeček z klacků, oblékání podle počasí.</w:t>
-      </w:r>
-    </w:p>
-    <w:p>
-      <w:pPr>
-        <w:pStyle w:val="ListParagraph"/>
-        <w:numPr>
-          <w:ilvl w:val="0"/>
-          <w:numId w:val="2"/>
-        </w:numPr>
-        <w:spacing w:after="40"/>
-      </w:pPr>
-      <w:r>
-        <w:rPr>
-          <w:b w:val="false"/>
-          <w:bCs w:val="false"/>
-        </w:rPr>
-        <w:t xml:space="preserve">2. trojročí: Samostatnější zvládnutí základů — oheň, dva tři uzly, přístřešek ve skupině, sbalení vlastního batohu podle seznamu, jednoduché jídlo uvařené venku.</w:t>
-      </w:r>
-    </w:p>
-    <w:p>
-      <w:pPr>
-        <w:pStyle w:val="ListParagraph"/>
-        <w:numPr>
-          <w:ilvl w:val="0"/>
-          <w:numId w:val="2"/>
-        </w:numPr>
-        <w:spacing w:after="40"/>
-      </w:pPr>
-      <w:r>
-        <w:rPr>
-          <w:b w:val="false"/>
-          <w:bCs w:val="false"/>
-        </w:rPr>
-        <w:t xml:space="preserve">3. trojročí: Soběstačnost ve složitějších podmínkách — oheň za mokra, výstroj podle sezóny, přenocování venku, pohyb na sněhu a ledu, vědomé zmírňování rizik a rozhodování, kdy je riziko už příliš velké.</w:t>
       </w:r>
     </w:p>
     <w:p>

</xml_diff>

<commit_message>
Revert "Odebrat téma 52 Bushcraft"
This reverts commit ddf75612590b3db79b7ffe2a408acdc69ffd7b0f.
</commit_message>
<xml_diff>
--- a/vystupy/Katalog_projektovych_temat.docx
+++ b/vystupy/Katalog_projektovych_temat.docx
@@ -46,7 +46,7 @@
           <w:sz w:val="24"/>
           <w:szCs w:val="24"/>
         </w:rPr>
-        <w:t xml:space="preserve">54 námětů pro 1.–3. trojročí — ScioCíle 4, 1, 5 a 8</w:t>
+        <w:t xml:space="preserve">55 námětů pro 1.–3. trojročí — ScioCíle 4, 1, 5 a 8</w:t>
       </w:r>
     </w:p>
     <w:p>
@@ -91,7 +91,7 @@
         <w:spacing w:after="120"/>
       </w:pPr>
       <w:r>
-        <w:t xml:space="preserve">Tento katalog nabízí 54 témat, z nichž si dvojice průvodců vybírají a rozpracovávají je do konkrétních Projektů (celodenní předmět, cca 220 minut včetně přestávek, obvykle 4 týdny). Témata jsou náměty, ne osnovy — volnost průvodců i dětí zůstává zachována; projekt může téma uchopit i jinak, pokud rozvíjí uvedené kameny.</w:t>
+        <w:t xml:space="preserve">Tento katalog nabízí 55 témat, z nichž si dvojice průvodců vybírají a rozpracovávají je do konkrétních Projektů (celodenní předmět, cca 220 minut včetně přestávek, obvykle 4 týdny). Témata jsou náměty, ne osnovy — volnost průvodců i dětí zůstává zachována; projekt může téma uchopit i jinak, pokud rozvíjí uvedené kameny.</w:t>
       </w:r>
     </w:p>
     <w:p>
@@ -2006,6 +2006,37 @@
       </w:r>
     </w:p>
     <w:p>
+      <w:pPr>
+        <w:spacing w:after="30"/>
+        <w:ind w:left="300"/>
+      </w:pPr>
+      <w:r>
+        <w:rPr>
+          <w:sz w:val="21"/>
+          <w:szCs w:val="21"/>
+        </w:rPr>
+        <w:t xml:space="preserve">52. Bushcraft: doma v přírodě</w:t>
+      </w:r>
+      <w:r>
+        <w:rPr>
+          <w:i/>
+          <w:iCs/>
+          <w:color w:val="888888"/>
+          <w:sz w:val="19"/>
+          <w:szCs w:val="19"/>
+        </w:rPr>
+        <w:t xml:space="preserve"/>
+      </w:r>
+      <w:r>
+        <w:rPr>
+          <w:color w:val="666666"/>
+          <w:sz w:val="19"/>
+          <w:szCs w:val="19"/>
+        </w:rPr>
+        <w:t xml:space="preserve">  —  8.2.6.2, 4.2.1.4</w:t>
+      </w:r>
+    </w:p>
+    <w:p>
       <w:r>
         <w:br w:type="page"/>
       </w:r>
@@ -27506,6 +27537,510 @@
           <w:bCs w:val="false"/>
         </w:rPr>
         <w:t xml:space="preserve">3. trojročí: Proud, napětí, odpor a výkon v praxi; výroba a přenos elektřiny, obnovitelné vs. jaderné zdroje, výpočty spotřeby a ceny (kWh).</w:t>
+      </w:r>
+    </w:p>
+    <w:p>
+      <w:pPr>
+        <w:pBdr>
+          <w:bottom w:val="single" w:color="CCCCCC" w:sz="4"/>
+        </w:pBdr>
+        <w:spacing w:after="240"/>
+      </w:pPr>
+    </w:p>
+    <w:p>
+      <w:pPr>
+        <w:pStyle w:val="Heading2"/>
+      </w:pPr>
+      <w:r>
+        <w:t xml:space="preserve">52. Bushcraft: doma v přírodě</w:t>
+      </w:r>
+    </w:p>
+    <w:p>
+      <w:pPr>
+        <w:shd w:fill="F4F4F4" w:val="clear"/>
+        <w:spacing w:after="120"/>
+      </w:pPr>
+      <w:r>
+        <w:rPr>
+          <w:b/>
+          <w:bCs/>
+          <w:color w:val="1E8449"/>
+          <w:sz w:val="20"/>
+          <w:szCs w:val="20"/>
+        </w:rPr>
+        <w:t xml:space="preserve">1.–3. trojročí</w:t>
+      </w:r>
+    </w:p>
+    <w:p>
+      <w:pPr>
+        <w:spacing w:after="120"/>
+      </w:pPr>
+      <w:r>
+        <w:t xml:space="preserve">Umět si venku poradit není jedna výprava, ale sada dovedností, které se dají trénovat celý rok za školou. Projekt učí být v přírodě soběstačný: rozdělat oheň i za mokra, uvázat správný uzel, postavit přístřešek, sbalit batoh, uvařit na ohni a obléknout se tak, aby zima ani déšť nebyly problém. Na rozdíl od Expedice tu nejde o cestu, ale o dovednosti samotné — a o vědomé zmírňování rizik, která s pobytem venku přicházejí.</w:t>
+      </w:r>
+    </w:p>
+    <w:p>
+      <w:pPr>
+        <w:spacing w:after="40" w:before="120"/>
+      </w:pPr>
+      <w:r>
+        <w:rPr>
+          <w:b/>
+          <w:bCs/>
+          <w:color w:val="444444"/>
+          <w:sz w:val="20"/>
+          <w:szCs w:val="20"/>
+        </w:rPr>
+        <w:t xml:space="preserve">Stěžejní kameny</w:t>
+      </w:r>
+    </w:p>
+    <w:p>
+      <w:pPr>
+        <w:pStyle w:val="ListParagraph"/>
+        <w:numPr>
+          <w:ilvl w:val="0"/>
+          <w:numId w:val="2"/>
+        </w:numPr>
+        <w:spacing w:after="40"/>
+      </w:pPr>
+      <w:r>
+        <w:rPr>
+          <w:b/>
+          <w:bCs/>
+        </w:rPr>
+        <w:t xml:space="preserve">8.2.6.2 Zmírňuji či akceptuji rizika</w:t>
+      </w:r>
+    </w:p>
+    <w:p>
+      <w:pPr>
+        <w:pStyle w:val="ListParagraph"/>
+        <w:numPr>
+          <w:ilvl w:val="0"/>
+          <w:numId w:val="2"/>
+        </w:numPr>
+        <w:spacing w:after="40"/>
+      </w:pPr>
+      <w:r>
+        <w:rPr>
+          <w:b/>
+          <w:bCs/>
+        </w:rPr>
+        <w:t xml:space="preserve">4.2.1.4 Chystám se na budoucí zátěžové situace</w:t>
+      </w:r>
+    </w:p>
+    <w:p>
+      <w:pPr>
+        <w:spacing w:after="40" w:before="120"/>
+      </w:pPr>
+      <w:r>
+        <w:rPr>
+          <w:b/>
+          <w:bCs/>
+          <w:color w:val="444444"/>
+          <w:sz w:val="20"/>
+          <w:szCs w:val="20"/>
+        </w:rPr>
+        <w:t xml:space="preserve">Vedlejší kameny</w:t>
+      </w:r>
+    </w:p>
+    <w:p>
+      <w:pPr>
+        <w:pStyle w:val="ListParagraph"/>
+        <w:numPr>
+          <w:ilvl w:val="0"/>
+          <w:numId w:val="2"/>
+        </w:numPr>
+        <w:spacing w:after="40"/>
+      </w:pPr>
+      <w:r>
+        <w:rPr>
+          <w:b w:val="false"/>
+          <w:bCs w:val="false"/>
+        </w:rPr>
+        <w:t xml:space="preserve">8.2.5.1 Zacházím se stroji a nástroji</w:t>
+      </w:r>
+    </w:p>
+    <w:p>
+      <w:pPr>
+        <w:pStyle w:val="ListParagraph"/>
+        <w:numPr>
+          <w:ilvl w:val="0"/>
+          <w:numId w:val="2"/>
+        </w:numPr>
+        <w:spacing w:after="40"/>
+      </w:pPr>
+      <w:r>
+        <w:rPr>
+          <w:b w:val="false"/>
+          <w:bCs w:val="false"/>
+        </w:rPr>
+        <w:t xml:space="preserve">8.2.3.1 Postarám se o stravování</w:t>
+      </w:r>
+    </w:p>
+    <w:p>
+      <w:pPr>
+        <w:pStyle w:val="ListParagraph"/>
+        <w:numPr>
+          <w:ilvl w:val="0"/>
+          <w:numId w:val="2"/>
+        </w:numPr>
+        <w:spacing w:after="40"/>
+      </w:pPr>
+      <w:r>
+        <w:rPr>
+          <w:b w:val="false"/>
+          <w:bCs w:val="false"/>
+        </w:rPr>
+        <w:t xml:space="preserve">4.1.1.6 Odpočívám</w:t>
+      </w:r>
+    </w:p>
+    <w:p>
+      <w:pPr>
+        <w:pStyle w:val="ListParagraph"/>
+        <w:numPr>
+          <w:ilvl w:val="0"/>
+          <w:numId w:val="2"/>
+        </w:numPr>
+        <w:spacing w:after="40"/>
+      </w:pPr>
+      <w:r>
+        <w:rPr>
+          <w:b w:val="false"/>
+          <w:bCs w:val="false"/>
+        </w:rPr>
+        <w:t xml:space="preserve">8.2.3.4 Dopravuji se</w:t>
+      </w:r>
+    </w:p>
+    <w:p>
+      <w:pPr>
+        <w:pStyle w:val="ListParagraph"/>
+        <w:numPr>
+          <w:ilvl w:val="0"/>
+          <w:numId w:val="2"/>
+        </w:numPr>
+        <w:spacing w:after="40"/>
+      </w:pPr>
+      <w:r>
+        <w:rPr>
+          <w:b w:val="false"/>
+          <w:bCs w:val="false"/>
+        </w:rPr>
+        <w:t xml:space="preserve">1.1.2.6 Učím se činností</w:t>
+      </w:r>
+    </w:p>
+    <w:p>
+      <w:pPr>
+        <w:spacing w:after="40" w:before="120"/>
+      </w:pPr>
+      <w:r>
+        <w:rPr>
+          <w:b/>
+          <w:bCs/>
+          <w:color w:val="444444"/>
+          <w:sz w:val="20"/>
+          <w:szCs w:val="20"/>
+        </w:rPr>
+        <w:t xml:space="preserve">Náměty aktivit</w:t>
+      </w:r>
+    </w:p>
+    <w:p>
+      <w:pPr>
+        <w:pStyle w:val="ListParagraph"/>
+        <w:numPr>
+          <w:ilvl w:val="0"/>
+          <w:numId w:val="2"/>
+        </w:numPr>
+        <w:spacing w:after="40"/>
+      </w:pPr>
+      <w:r>
+        <w:rPr>
+          <w:b w:val="false"/>
+          <w:bCs w:val="false"/>
+        </w:rPr>
+        <w:t xml:space="preserve">Oheň a vaření venku: rozdělání ohně různými způsoby a v různém počasí, bezpečnost ohniště, vaření v kotlíku a specifika venkovní kuchyně</w:t>
+      </w:r>
+    </w:p>
+    <w:p>
+      <w:pPr>
+        <w:pStyle w:val="ListParagraph"/>
+        <w:numPr>
+          <w:ilvl w:val="0"/>
+          <w:numId w:val="2"/>
+        </w:numPr>
+        <w:spacing w:after="40"/>
+      </w:pPr>
+      <w:r>
+        <w:rPr>
+          <w:b w:val="false"/>
+          <w:bCs w:val="false"/>
+        </w:rPr>
+        <w:t xml:space="preserve">Uzly a přístřešek: základní uzly a jejich použití, stavba přístřešku z plachty i přírodního materiálu, spaní venku nanečisto</w:t>
+      </w:r>
+    </w:p>
+    <w:p>
+      <w:pPr>
+        <w:pStyle w:val="ListParagraph"/>
+        <w:numPr>
+          <w:ilvl w:val="0"/>
+          <w:numId w:val="2"/>
+        </w:numPr>
+        <w:spacing w:after="40"/>
+      </w:pPr>
+      <w:r>
+        <w:rPr>
+          <w:b w:val="false"/>
+          <w:bCs w:val="false"/>
+        </w:rPr>
+        <w:t xml:space="preserve">Batoh a výstroj: co si vzít a co nechat doma, vrstvení oblečení pro zimu i léto, péče o nůž a nástroje</w:t>
+      </w:r>
+    </w:p>
+    <w:p>
+      <w:pPr>
+        <w:pStyle w:val="ListParagraph"/>
+        <w:numPr>
+          <w:ilvl w:val="0"/>
+          <w:numId w:val="2"/>
+        </w:numPr>
+        <w:spacing w:after="40"/>
+      </w:pPr>
+      <w:r>
+        <w:rPr>
+          <w:b w:val="false"/>
+          <w:bCs w:val="false"/>
+        </w:rPr>
+        <w:t xml:space="preserve">Terén a počasí: pohyb po sněhu a ledu, čtení počasí, orientace bez mobilu, co dělat, když se ochladí nebo začne pršet</w:t>
+      </w:r>
+    </w:p>
+    <w:p>
+      <w:pPr>
+        <w:pStyle w:val="ListParagraph"/>
+        <w:numPr>
+          <w:ilvl w:val="0"/>
+          <w:numId w:val="2"/>
+        </w:numPr>
+        <w:spacing w:after="40"/>
+      </w:pPr>
+      <w:r>
+        <w:rPr>
+          <w:b w:val="false"/>
+          <w:bCs w:val="false"/>
+        </w:rPr>
+        <w:t xml:space="preserve">Zkouška dovednosti: tábornický okruh stanovišť v různých ročních obdobích — každý ukáže, co už zvládne sám</w:t>
+      </w:r>
+    </w:p>
+    <w:p>
+      <w:pPr>
+        <w:spacing w:after="40" w:before="120"/>
+      </w:pPr>
+      <w:r>
+        <w:rPr>
+          <w:b/>
+          <w:bCs/>
+          <w:color w:val="444444"/>
+          <w:sz w:val="20"/>
+          <w:szCs w:val="20"/>
+        </w:rPr>
+        <w:t xml:space="preserve">Tvrdé znalosti — příklady učiva</w:t>
+      </w:r>
+    </w:p>
+    <w:p>
+      <w:pPr>
+        <w:pStyle w:val="ListParagraph"/>
+        <w:numPr>
+          <w:ilvl w:val="0"/>
+          <w:numId w:val="2"/>
+        </w:numPr>
+        <w:spacing w:after="40"/>
+      </w:pPr>
+      <w:r>
+        <w:rPr>
+          <w:b w:val="false"/>
+          <w:bCs w:val="false"/>
+        </w:rPr>
+        <w:t xml:space="preserve">principy přežití v přírodě, plán B</w:t>
+      </w:r>
+    </w:p>
+    <w:p>
+      <w:pPr>
+        <w:pStyle w:val="ListParagraph"/>
+        <w:numPr>
+          <w:ilvl w:val="0"/>
+          <w:numId w:val="2"/>
+        </w:numPr>
+        <w:spacing w:after="40"/>
+      </w:pPr>
+      <w:r>
+        <w:rPr>
+          <w:b w:val="false"/>
+          <w:bCs w:val="false"/>
+        </w:rPr>
+        <w:t xml:space="preserve">Tělesná výchova: turistika a pobyt v přírodě, bezpečnost při pohybových aktivitách</w:t>
+      </w:r>
+    </w:p>
+    <w:p>
+      <w:pPr>
+        <w:pStyle w:val="ListParagraph"/>
+        <w:numPr>
+          <w:ilvl w:val="0"/>
+          <w:numId w:val="2"/>
+        </w:numPr>
+        <w:spacing w:after="40"/>
+      </w:pPr>
+      <w:r>
+        <w:rPr>
+          <w:b w:val="false"/>
+          <w:bCs w:val="false"/>
+        </w:rPr>
+        <w:t xml:space="preserve">Polytechnická výchova a praktické činnosti: bezpečná práce s nářadím (nůž, pila), příprava pokrmů v improvizovaných podmínkách</w:t>
+      </w:r>
+    </w:p>
+    <w:p>
+      <w:pPr>
+        <w:pStyle w:val="ListParagraph"/>
+        <w:numPr>
+          <w:ilvl w:val="0"/>
+          <w:numId w:val="2"/>
+        </w:numPr>
+        <w:spacing w:after="40"/>
+      </w:pPr>
+      <w:r>
+        <w:rPr>
+          <w:b w:val="false"/>
+          <w:bCs w:val="false"/>
+        </w:rPr>
+        <w:t xml:space="preserve">Fyzika: teplo a hoření, vedení tepla (vrstvení oblečení)</w:t>
+      </w:r>
+    </w:p>
+    <w:p>
+      <w:pPr>
+        <w:pStyle w:val="ListParagraph"/>
+        <w:numPr>
+          <w:ilvl w:val="0"/>
+          <w:numId w:val="2"/>
+        </w:numPr>
+        <w:spacing w:after="40"/>
+      </w:pPr>
+      <w:r>
+        <w:rPr>
+          <w:b w:val="false"/>
+          <w:bCs w:val="false"/>
+        </w:rPr>
+        <w:t xml:space="preserve">Výchova ke zdraví a bezpečí: prevence úrazů, podchlazení a přehřátí, chování při ohrožení</w:t>
+      </w:r>
+    </w:p>
+    <w:p>
+      <w:pPr>
+        <w:pStyle w:val="ListParagraph"/>
+        <w:numPr>
+          <w:ilvl w:val="0"/>
+          <w:numId w:val="2"/>
+        </w:numPr>
+        <w:spacing w:after="40"/>
+      </w:pPr>
+      <w:r>
+        <w:rPr>
+          <w:b w:val="false"/>
+          <w:bCs w:val="false"/>
+        </w:rPr>
+        <w:t xml:space="preserve">Přírodopis: horniny, nerosty a tvary krajiny v terénu; orientace podle přírodních znaků</w:t>
+      </w:r>
+    </w:p>
+    <w:p>
+      <w:pPr>
+        <w:spacing w:after="40" w:before="120"/>
+      </w:pPr>
+      <w:r>
+        <w:rPr>
+          <w:b/>
+          <w:bCs/>
+          <w:color w:val="444444"/>
+          <w:sz w:val="20"/>
+          <w:szCs w:val="20"/>
+        </w:rPr>
+        <w:t xml:space="preserve">Z didaktiky ScioCíle</w:t>
+      </w:r>
+    </w:p>
+    <w:p>
+      <w:pPr>
+        <w:pStyle w:val="ListParagraph"/>
+        <w:numPr>
+          <w:ilvl w:val="0"/>
+          <w:numId w:val="2"/>
+        </w:numPr>
+        <w:spacing w:after="40"/>
+      </w:pPr>
+      <w:r>
+        <w:rPr>
+          <w:b w:val="false"/>
+          <w:bCs w:val="false"/>
+        </w:rPr>
+        <w:t xml:space="preserve">bushcraft se učí opakováním v různém počasí a ročním období, ne jednorázovým výletem — dovednost se pozná až tehdy, když ji dítě zvládne v nepohodě a samo.</w:t>
+      </w:r>
+    </w:p>
+    <w:p>
+      <w:pPr>
+        <w:spacing w:after="40" w:before="120"/>
+      </w:pPr>
+      <w:r>
+        <w:rPr>
+          <w:b/>
+          <w:bCs/>
+          <w:color w:val="444444"/>
+          <w:sz w:val="20"/>
+          <w:szCs w:val="20"/>
+        </w:rPr>
+        <w:t xml:space="preserve">Diferenciace</w:t>
+      </w:r>
+    </w:p>
+    <w:p>
+      <w:pPr>
+        <w:pStyle w:val="ListParagraph"/>
+        <w:numPr>
+          <w:ilvl w:val="0"/>
+          <w:numId w:val="2"/>
+        </w:numPr>
+        <w:spacing w:after="40"/>
+      </w:pPr>
+      <w:r>
+        <w:rPr>
+          <w:b w:val="false"/>
+          <w:bCs w:val="false"/>
+        </w:rPr>
+        <w:t xml:space="preserve">1. trojročí: Základní tábornické dovednosti s velkou oporou průvodce — oheň pod dohledem, jednoduchý uzel, domeček z klacků, oblékání podle počasí.</w:t>
+      </w:r>
+    </w:p>
+    <w:p>
+      <w:pPr>
+        <w:pStyle w:val="ListParagraph"/>
+        <w:numPr>
+          <w:ilvl w:val="0"/>
+          <w:numId w:val="2"/>
+        </w:numPr>
+        <w:spacing w:after="40"/>
+      </w:pPr>
+      <w:r>
+        <w:rPr>
+          <w:b w:val="false"/>
+          <w:bCs w:val="false"/>
+        </w:rPr>
+        <w:t xml:space="preserve">2. trojročí: Samostatnější zvládnutí základů — oheň, dva tři uzly, přístřešek ve skupině, sbalení vlastního batohu podle seznamu, jednoduché jídlo uvařené venku.</w:t>
+      </w:r>
+    </w:p>
+    <w:p>
+      <w:pPr>
+        <w:pStyle w:val="ListParagraph"/>
+        <w:numPr>
+          <w:ilvl w:val="0"/>
+          <w:numId w:val="2"/>
+        </w:numPr>
+        <w:spacing w:after="40"/>
+      </w:pPr>
+      <w:r>
+        <w:rPr>
+          <w:b w:val="false"/>
+          <w:bCs w:val="false"/>
+        </w:rPr>
+        <w:t xml:space="preserve">3. trojročí: Soběstačnost ve složitějších podmínkách — oheň za mokra, výstroj podle sezóny, přenocování venku, pohyb na sněhu a ledu, vědomé zmírňování rizik a rozhodování, kdy je riziko už příliš velké.</w:t>
       </w:r>
     </w:p>
     <w:p>

</xml_diff>